<commit_message>
Match Design Modeling ribbon to owner operation groups
</commit_message>
<xml_diff>
--- a/ai-instructions/ui/FreeCAD Plus UI & UX.docx
+++ b/ai-instructions/ui/FreeCAD Plus UI & UX.docx
@@ -22804,6 +22804,19 @@
           <w:rtl w:val="0"/>
         </w:rPr>
         <w:t xml:space="preserve">Tab</w:t>
+      </w:r>
+    </w:p>
+    <w:p>
+      <w:pPr>
+        <w:numPr>
+          <w:ilvl w:val="1"/>
+          <w:numId w:val="1"/>
+        </w:numPr>
+        <w:ind w:left="1440" w:hanging="360"/>
+        <w:rPr/>
+      </w:pPr>
+      <w:r>
+        <w:t>Keep Modeling limited to the listed Sketch, Modeling, Dress-Up and Transformation groups, followed by one Primitives dropdown. Use one icon per combined additive/subtractive operation, including Extrude, Revolve, Loft, Helix and Primitive; do not add separate subtractive ribbon buttons while combined workflows are being implemented. Keep Linear Pattern and Circular Pattern as separate buttons. The Primitives dropdown lists Box, Cylinder, Sphere, Cone, Ellipsoid, Torus, Prism, Wedge and Tab in that order. Preserve native operation fields and geometry behavior when changing this presentation.</w:t>
       </w:r>
     </w:p>
     <w:p>

</xml_diff>

<commit_message>
Match Design Sketch ribbon to complete owner outline
</commit_message>
<xml_diff>
--- a/ai-instructions/ui/FreeCAD Plus UI & UX.docx
+++ b/ai-instructions/ui/FreeCAD Plus UI & UX.docx
@@ -24912,6 +24912,19 @@
           <w:rtl w:val="0"/>
         </w:rPr>
         <w:t xml:space="preserve">Switch Virtual Space</w:t>
+      </w:r>
+    </w:p>
+    <w:p>
+      <w:pPr>
+        <w:keepNext w:val="1"/>
+        <w:numPr>
+          <w:ilvl w:val="1"/>
+          <w:numId w:val="1"/>
+        </w:numPr>
+        <w:ind w:left="1440" w:hanging="360"/>
+      </w:pPr>
+      <w:r>
+        <w:t>Use exactly the listed Sketcher, Edit Mode, Geometries, Constraints, Tools, B-Spline and Helpers groups in this order. Retain the specified individual line, dimension, coincident, point-on-object, horizontal and vertical buttons alongside their dropdowns; do not collapse them away. Each dropdown uses the listed choices and order, with local ribbon captions and native command execution, enabled states and checked states. Keep Text identified as Experimental and Group Constraint identified as Development preview. Do not change Classic toolbar preferences, solver behavior, command shortcuts or sketch task fields to implement this layout.</w:t>
       </w:r>
     </w:p>
     <w:p>

</xml_diff>

<commit_message>
Match Design Assembly ribbon to owner outline
</commit_message>
<xml_diff>
--- a/ai-instructions/ui/FreeCAD Plus UI & UX.docx
+++ b/ai-instructions/ui/FreeCAD Plus UI & UX.docx
@@ -24941,6 +24941,14 @@
           <w:rtl w:val="0"/>
         </w:rPr>
         <w:t xml:space="preserve">Assembly Tab</w:t>
+      </w:r>
+    </w:p>
+    <w:p>
+      <w:pPr>
+        <w:pStyle w:val="Normal"/>
+      </w:pPr>
+      <w:r>
+        <w:t>The Assembly tab uses exactly the Assembly and Assembly Joints groups outlined below. Keep every listed joint as an individual button; only Insert Component, Link Arrays and Gears Joint use dropdowns. Preserve the listed order, local captions and native command availability, execution and checked states. Create Assembly and Insert Component use full icons; secondary buttons use small icons in the compact three-row grid. The Belt Join caption selects the native Belt Joint operation.</w:t>
       </w:r>
     </w:p>
     <w:p>

</xml_diff>

<commit_message>
Match Design View ribbon to owner outline
</commit_message>
<xml_diff>
--- a/ai-instructions/ui/FreeCAD Plus UI & UX.docx
+++ b/ai-instructions/ui/FreeCAD Plus UI & UX.docx
@@ -26057,6 +26057,11 @@
           <w:rtl w:val="0"/>
         </w:rPr>
         <w:t xml:space="preserve">View Tab</w:t>
+      </w:r>
+    </w:p>
+    <w:p>
+      <w:r>
+        <w:t>Design View uses exactly the View and Individual Views groups below. Standard Views and Draw Style are dropdowns; the seven individual orientations remain separate buttons. Native actions, shortcuts and display states are retained. Source validation is separate from incorporation into the next batched owner build.</w:t>
       </w:r>
     </w:p>
     <w:p>

</xml_diff>

<commit_message>
Cover Plus sketch drawing entry flow and record unresolved report
</commit_message>
<xml_diff>
--- a/ai-instructions/ui/FreeCAD Plus UI & UX.docx
+++ b/ai-instructions/ui/FreeCAD Plus UI & UX.docx
@@ -31042,6 +31042,11 @@
         <w:rPr>
           <w:rtl w:val="0"/>
         </w:rPr>
+      </w:r>
+    </w:p>
+    <w:p>
+      <w:r>
+        <w:t>Sketch drawing validation, October 2: Plus New File, New Sketch and curve creation pass native Qt input checks for line, circle, arc and rectangle, including save/reopen. The reported pointer-input failure remains unconfirmed and is not marked fixed; desktop capture prevented physical pointer acceptance.</w:t>
       </w:r>
     </w:p>
     <w:sectPr>

</xml_diff>

<commit_message>
Validate and deliver batched October 2 owner build
</commit_message>
<xml_diff>
--- a/ai-instructions/ui/FreeCAD Plus UI & UX.docx
+++ b/ai-instructions/ui/FreeCAD Plus UI & UX.docx
@@ -26061,7 +26061,7 @@
     </w:p>
     <w:p>
       <w:r>
-        <w:t>Design View uses exactly the View and Individual Views groups below. Standard Views and Draw Style are dropdowns; the seven individual orientations remain separate buttons. Native actions, shortcuts and display states are retained. Source validation is separate from incorporation into the next batched owner build.</w:t>
+        <w:t>Design View uses exactly the View and Individual Views groups below. Standard Views and Draw Style are dropdowns; the seven individual orientations remain separate buttons. Native actions, shortcuts and display states are retained. Packaged validation is recorded in the October 2 batched build note below.</w:t>
       </w:r>
     </w:p>
     <w:p>
@@ -31047,6 +31047,11 @@
     <w:p>
       <w:r>
         <w:t>Sketch drawing validation, October 2: Plus New File, New Sketch and curve creation pass native Qt input checks for line, circle, arc and rectangle, including save/reopen. The reported pointer-input failure remains unconfirmed and is not marked fixed; desktop capture prevented physical pointer acceptance.</w:t>
+      </w:r>
+    </w:p>
+    <w:p>
+      <w:r>
+        <w:t>October 2 batched build: all completed source changes are incorporated, including the exact Design Home, Modeling, Sketch, Assembly and View ribbons, master-first component trees, unused assemblies and screenshot defaults. Packaged acceptance has 57 passing checks, including curve creation and save/reopen plus three launcher cold restarts, without source overlays. Compatible Python updates reuse the verified native engine. The reported physical sketch drawing failure remains unresolved. Related changes are grouped into validated commits and pushed to origin at completed milestones. Each delivered build must pass the desktop shortcut target and working-directory verification gate.</w:t>
       </w:r>
     </w:p>
     <w:sectPr>

</xml_diff>

<commit_message>
Share datum plane creation between Tasks and New Sketch
</commit_message>
<xml_diff>
--- a/ai-instructions/ui/FreeCAD Plus UI & UX.docx
+++ b/ai-instructions/ui/FreeCAD Plus UI & UX.docx
@@ -31052,6 +31052,11 @@
     <w:p>
       <w:r>
         <w:t>October 2 batched build: all completed source changes are incorporated, including the exact Design Home, Modeling, Sketch, Assembly and View ribbons, master-first component trees, unused assemblies and screenshot defaults. Packaged acceptance has 57 passing checks, including curve creation and save/reopen plus three launcher cold restarts, without source overlays. Compatible Python updates reuse the verified native engine. The reported physical sketch drawing failure remains unresolved. Related changes are grouped into validated commits and pushed to origin at completed milestones. Each delivered build must pass the desktop shortcut target and working-directory verification gate.</w:t>
+      </w:r>
+    </w:p>
+    <w:p>
+      <w:r>
+        <w:t>Datum-plane creation: the new-file Tasks action and New Sketch share Define Plane, Define Origin and Define Orientation. Retain origin-plane, planar-face and user-plane attachments, zero-origin defaults and Rotation X/Y/Z. Define Origin adds signed X/Y coordinates alongside the normal offset. Axis directions accepts an X-axis or Y-axis vector and a Z-axis vector in the base attachment frame; Z defines the normal and the other vector is projected onto the plane. Reject zero or parallel directions. Create Datum Plane keeps New Sketch open and immediately selects the new plane as an available attachment. Cancel then keeps the explicitly created plane; Undo removes it. Without explicit plane creation, sketch OK creates both objects together and Cancel creates neither. Native ownership, attachment properties and save/reopen identities are retained. Isolated runtime validation is separate from the next batched owner-build delivery.</w:t>
       </w:r>
     </w:p>
     <w:sectPr>

</xml_diff>

<commit_message>
Combine Revolution and Groove in the Plus component Revolve task
</commit_message>
<xml_diff>
--- a/ai-instructions/ui/FreeCAD Plus UI & UX.docx
+++ b/ai-instructions/ui/FreeCAD Plus UI & UX.docx
@@ -31057,6 +31057,21 @@
     <w:p>
       <w:r>
         <w:t>Datum-plane creation: the new-file Tasks action and New Sketch share Define Plane, Define Origin and Define Orientation. Retain origin-plane, planar-face and user-plane attachments, zero-origin defaults and Rotation X/Y/Z. Define Origin adds signed X/Y coordinates alongside the normal offset. Axis directions accepts an X-axis or Y-axis vector and a Z-axis vector in the base attachment frame; Z defines the normal and the other vector is projected onto the plane. Reject zero or parallel directions. Create Datum Plane keeps New Sketch open and immediately selects the new plane as an available attachment. Cancel then keeps the explicitly created plane; Undo removes it. Without explicit plane creation, sketch OK creates both objects together and Cancel creates neither. Native ownership, attachment properties and save/reopen identities are retained. Isolated runtime validation is separate from the next batched owner-build delivery.</w:t>
+      </w:r>
+    </w:p>
+    <w:p>
+      <w:r>
+        <w:t>Unified Revolve: Plus combines additive Revolution and subtractive Groove in one Tasks workflow for both creation and history editing. Main parameters, Dimensions, Advanced and Preview are collapsible sections. Main parameters, Dimensions and Preview start expanded; Advanced starts collapsed. Main parameters provides New Body, Add or Subtract, a target body shown only for Add or Subtract, a whole-sketch or selected-curves list, One angle / Two angles / Symmetric mode and native applicable extent types.</w:t>
+      </w:r>
+    </w:p>
+    <w:p>
+      <w:r>
+        <w:t>Dimensions retains sketch vertical or horizontal axes and picked local axis references, angle values with synchronized direction arrows, and signed angular offsets from -360 through +360 degrees with an offset-flip arrow. Symmetric disables direction reversal. Entering a nonzero offset selects Offset automatically. Reference starts, first/last or surface termination, axis projection and refinement remain available where applicable. The rotational axis replaces the extrusion-only sketch-normal direction and angle replaces linear length.</w:t>
+      </w:r>
+    </w:p>
+    <w:p>
+      <w:r>
+        <w:t>Preview offers Recompute on change, enabled by default, and None, Overlay or Final Result; Overlay is the default and uses blue for New Body, green for Add and red for Subtract. Cancel restores visibility and removes preview geometry. Native Revolution and Groove features retain geometry semantics. Type-changing edits preserve the component operation identity and published result references through undo/redo and save/reopen. Expression-driven definitions remain protected from task overwrites and can be edited through their native properties. Runtime acceptance and owner-build delivery are recorded separately in the roadmap and WORK_STATE.</w:t>
       </w:r>
     </w:p>
     <w:sectPr>

</xml_diff>

<commit_message>
Combine component Loft creation and editing with native add/subtract engines
</commit_message>
<xml_diff>
--- a/ai-instructions/ui/FreeCAD Plus UI & UX.docx
+++ b/ai-instructions/ui/FreeCAD Plus UI & UX.docx
@@ -31072,6 +31072,21 @@
     <w:p>
       <w:r>
         <w:t>Preview offers Recompute on change, enabled by default, and None, Overlay or Final Result; Overlay is the default and uses blue for New Body, green for Add and red for Subtract. Cancel restores visibility and removes preview geometry. Native Revolution and Groove features retain geometry semantics. Type-changing edits preserve the component operation identity and published result references through undo/redo and save/reopen. Expression-driven definitions remain protected from task overwrites and can be edited through their native properties. Runtime acceptance and owner-build delivery are recorded separately in the roadmap and WORK_STATE.</w:t>
+      </w:r>
+    </w:p>
+    <w:p>
+      <w:r>
+        <w:t>Unified Loft: Plus combines Additive Loft and Subtractive Loft in one component Tasks workflow for creation and History editing. Main parameters, Dimensions and Preview start expanded; Advanced starts collapsed. Main parameters has New Body, Add or Subtract, a target shown only for Add or Subtract, ordered sections, and Smooth or Ruled interpolation. Sections accept whole profiles, selected closed sketch regions with optional holes, or native end vertices. Retain ordered preselection and empty startup. Provide append, replace, remove, clear and section inspection.</w:t>
+      </w:r>
+    </w:p>
+    <w:p>
+      <w:r>
+        <w:t>Loft Dimensions provides Move up, Move down and Reverse order. Section placements define the span; extrusion lengths, angular extents and offsets do not apply. Advanced retains Closed, Refine and Fuzzy tolerance: zero uses the native default; negative values request automatic tolerance. Preview has Recompute on change enabled and None, Overlay or Final Result. Default Overlay is blue for New Body, green for Add and red for Subtract. Cancel removes previews and restores visibility. Retain native geometry, associative sections and component result identities through edits, Boolean mode changes, undo/redo and save/reopen. Reject invalid or ineffective Booleans and protect expression-driven definitions from task overwrites.</w:t>
+      </w:r>
+    </w:p>
+    <w:p>
+      <w:r>
+        <w:t>Loft validation, October 3: eight Loft and four Revolve/ribbon checks pass on an isolated fork candidate without source overlays. Task rendering was inspected. Native command routing, batched owner delivery and physical acceptance remain pending; roadmap and WORK_STATE hold evidence. The earlier sketch-drawing report remains unresolved.</w:t>
       </w:r>
     </w:p>
     <w:sectPr>

</xml_diff>

<commit_message>
Unify component Pipe creation and editing in Plus
</commit_message>
<xml_diff>
--- a/ai-instructions/ui/FreeCAD Plus UI & UX.docx
+++ b/ai-instructions/ui/FreeCAD Plus UI & UX.docx
@@ -31087,6 +31087,21 @@
     <w:p>
       <w:r>
         <w:t>Loft validation, October 3: eight Loft and four Revolve/ribbon checks pass on an isolated fork candidate without source overlays. Task rendering was inspected. Native command routing, batched owner delivery and physical acceptance remain pending; roadmap and WORK_STATE hold evidence. The earlier sketch-drawing report remains unresolved.</w:t>
+      </w:r>
+    </w:p>
+    <w:p>
+      <w:r>
+        <w:t>Unified Pipe: Plus combines Additive Pipe and Subtractive Pipe in one component Tasks workflow for creation and History editing, with one Pipe button after Loft in Modeling. Main parameters, Dimensions and Preview start expanded; Advanced starts collapsed. Main parameters provides New Body, Add or Subtract, a target only for Add or Subtract, ordered whole-profile or selected closed sketch-curve sections, append/replace/remove/clear, Constant or Multisection mode, and Transformed/Right corner/Round corner transition type. Constant retains additional sections for later Multisection use. Allow empty startup and ordered profile/path/section preselection.</w:t>
+      </w:r>
+    </w:p>
+    <w:p>
+      <w:r>
+        <w:t>Pipe Dimensions collects the sweep path as a whole curve object or selected edges from one local object, with pick/remove/clear controls and section reordering. Path geometry and section placements define length and direction; extrusion lengths and offsets do not apply. Advanced retains Standard/Fixed/Frenet/Auxiliary/Binormal orientation, a separate auxiliary-path collector, curvilinear equivalence, binormal XYZ, native Subtraction/Common, Refine and Fuzzy tolerance. Preserve inactive options and stored tangent flags; native tangent expansion and Linear/S-shape/Interpolation scaling laws are not implemented. The inherited Pipe engine requires closed sections and cannot accept point-ended sections; report this clearly. Preserve native orientation and corner semantics.</w:t>
+      </w:r>
+    </w:p>
+    <w:p>
+      <w:r>
+        <w:t>Pipe Preview retains Recompute on change enabled, None/Overlay/Final Result, and default Overlay colors blue/green/red for New Body/Add/Subtract. Cancel restores visibility. Preserve native associative profile/path links, component operation and result identities, downstream references, undo/redo and save/reopen through edits and Boolean type changes. Reject invalid, stale or cyclic inputs and ineffective Booleans atomically; protect expressions. October 3 validation: seven Pipe cases, eight Loft regressions and two ribbon checks pass in an isolated candidate without overlays; task captures were reviewed. Native command routing and grouped owner-build/shortcut delivery remain pending, as do physical pointer/high-DPI checks. Roadmap and WORK_STATE hold evidence.</w:t>
       </w:r>
     </w:p>
     <w:sectPr>

</xml_diff>

<commit_message>
Unify component Helix creation and editing in Plus
</commit_message>
<xml_diff>
--- a/ai-instructions/ui/FreeCAD Plus UI & UX.docx
+++ b/ai-instructions/ui/FreeCAD Plus UI & UX.docx
@@ -31102,6 +31102,21 @@
     <w:p>
       <w:r>
         <w:t>Pipe Preview retains Recompute on change enabled, None/Overlay/Final Result, and default Overlay colors blue/green/red for New Body/Add/Subtract. Cancel restores visibility. Preserve native associative profile/path links, component operation and result identities, downstream references, undo/redo and save/reopen through edits and Boolean type changes. Reject invalid, stale or cyclic inputs and ineffective Booleans atomically; protect expressions. October 3 validation: seven Pipe cases, eight Loft regressions and two ribbon checks pass in an isolated candidate without overlays; task captures were reviewed. Native command routing and grouped owner-build/shortcut delivery remain pending, as do physical pointer/high-DPI checks. Roadmap and WORK_STATE hold evidence.</w:t>
+      </w:r>
+    </w:p>
+    <w:p>
+      <w:r>
+        <w:t>Unified Helix: Plus combines Additive Helix and Subtractive Helix in one Tasks workflow for creation and History editing, with one Helix ribbon button and no additive/subtractive dropdown. Main parameters, Dimensions and Preview start expanded; Advanced starts collapsed. Main parameters provides New Body, Add or Subtract, an explicit target only for Add or Subtract, whole-profile or selected closed sketch-curve collection, and the four native modes Pitch-Height-Angle, Pitch-Turns-Angle, Height-Turns-Angle and Height-Turns-Growth. Helix has no independent sidedness or extent Type. Retain empty startup, preselection and curve add/remove/clear controls.</w:t>
+      </w:r>
+    </w:p>
+    <w:p>
+      <w:r>
+        <w:t>Helix Dimensions retains sketch vertical (default), horizontal, normal and construction axes, direct component X/Y/Z choices, and picked or typed datum/origin/straight-edge/circular-edge axes. Show the selected mode's pitch, height, turns, cone angle or radial growth fields; derive dependent values when changing modes. Preserve the separate axial reverse arrow and Left handed choice. Suggest pitch and height from the profile uses the native bounds heuristic, also applied to initial preselection. Without a profile, defaults are pitch 10 mm, height 30 mm, 3 turns and zero angle/growth. Height-Turns-Growth supports native flat spirals. Advanced retains Subtraction/Common, Refine, fusion tolerance factor (default 0.1) and Fuzzy tolerance; the fusion factor is not a length. Do not invent extrusion-only length offsets or termination choices.</w:t>
+      </w:r>
+    </w:p>
+    <w:p>
+      <w:r>
+        <w:t>Helix Preview retains Recompute on change enabled and None/Overlay/Final Result, default Overlay with blue/green/red for New Body/Add/Subtract. Cancel restores visibility. Preserve native geometry, associative references, component operation and published result identities, downstream consumers, undo/redo and save/reopen. Invalid geometry, stale/cyclic inputs and ineffective Booleans cannot be accepted; failed edits roll back and expressions remain protected. October 3: eight Helix cases and ten shared Loft/Pipe/Revolve/ribbon regressions pass in an isolated candidate without overlays; normal and expanded task captures were inspected. Native command routing, grouped owner-build/shortcut delivery and physical pointer/high-DPI checks remain pending. Native Refine fallback warnings are retained in the evidence; valid geometry does not certify successful splitter removal. See roadmap and WORK_STATE.</w:t>
       </w:r>
     </w:p>
     <w:sectPr>

</xml_diff>

<commit_message>
Unify component primitive creation and editing with native add/subtract features
</commit_message>
<xml_diff>
--- a/ai-instructions/ui/FreeCAD Plus UI & UX.docx
+++ b/ai-instructions/ui/FreeCAD Plus UI & UX.docx
@@ -31117,6 +31117,21 @@
     <w:p>
       <w:r>
         <w:t>Helix Preview retains Recompute on change enabled and None/Overlay/Final Result, default Overlay with blue/green/red for New Body/Add/Subtract. Cancel restores visibility. Preserve native geometry, associative references, component operation and published result identities, downstream consumers, undo/redo and save/reopen. Invalid geometry, stale/cyclic inputs and ineffective Booleans cannot be accepted; failed edits roll back and expressions remain protected. October 3: eight Helix cases and ten shared Loft/Pipe/Revolve/ribbon regressions pass in an isolated candidate without overlays; normal and expanded task captures were inspected. Native command routing, grouped owner-build/shortcut delivery and physical pointer/high-DPI checks remain pending. Native Refine fallback warnings are retained in the evidence; valid geometry does not certify successful splitter removal. See roadmap and WORK_STATE.</w:t>
+      </w:r>
+    </w:p>
+    <w:p>
+      <w:r>
+        <w:t>Unified Primitive: Plus combines Additive and Subtractive Box, Cylinder, Sphere, Cone, Ellipsoid, Torus, Prism and Wedge into one creation and History editing task. Modeling retains one Primitive action and the Primitives dropdown presets a shape in the same task. Classic documents retain native Body tasks. Tab remains disabled because no native Tab feature exists. Main parameters, Dimensions and Preview start expanded; Advanced starts collapsed. Main parameters contains New Body, Add or Subtract, an explicit target only for Add or Subtract, and the shape selector. No sketch profile is required.</w:t>
+      </w:r>
+    </w:p>
+    <w:p>
+      <w:r>
+        <w:t>Primitive Dimensions preserves every native shape property and default, including cylinder/prism X and Y skew, prism sides, angular limits and all ten wedge bounds. Shape switches retain the drafts dimensions during the task. Advanced retains the native attachment modes, ordered references with Add selected, Remove and Clear, reversal, path parameter and offset. Unattached primitives expose component-local XYZ and yaw/pitch/roll; attached primitives expose their offset. Defaults are Box, unattached, zero placement, Refine enabled and fuzzy tolerance zero. Subtract retains Subtraction or Common. Native attachment and dimension properties remain associative and editable.</w:t>
+      </w:r>
+    </w:p>
+    <w:p>
+      <w:r>
+        <w:t>Primitive Preview uses Recompute on change enabled and None, Overlay or Final Result, default Overlay, with blue/green/red for New Body/Add/Subtract. Cancel restores display state. Shape or mode changes preserve operation and published-result identity, downstream consumers and History order. Native geometry, attachments, undo/redo and save/reopen remain intact; invalid solids, ineffective Booleans, stale/cyclic inputs and expressions are guarded. October 3 grouped PartDesignGui build passes, with all 26 Loft/Pipe/Helix acceptance cases including routing, seven Primitive acceptance cases and eight inherited primitive regressions. Native ellipsoid Boolean results match directly configured Classic features; independent Part Boolean integration can differ. The dynamic Wedge layout was corrected after visual review. Owner delivery and final task captures are recorded in WORK_STATE; physical pointer/high-DPI checks and the earlier sketch drawing report remain pending. Native Refine and startup warnings remain in the evidence.</w:t>
       </w:r>
     </w:p>
     <w:sectPr>

</xml_diff>

<commit_message>
Record fresh all-target owner build and verified desktop shortcut
</commit_message>
<xml_diff>
--- a/ai-instructions/ui/FreeCAD Plus UI & UX.docx
+++ b/ai-instructions/ui/FreeCAD Plus UI & UX.docx
@@ -31132,6 +31132,11 @@
     <w:p>
       <w:r>
         <w:t>Primitive Preview uses Recompute on change enabled and None, Overlay or Final Result, default Overlay, with blue/green/red for New Body/Add/Subtract. Cancel restores display state. Shape or mode changes preserve operation and published-result identity, downstream consumers and History order. Native geometry, attachments, undo/redo and save/reopen remain intact; invalid solids, ineffective Booleans, stale/cyclic inputs and expressions are guarded. October 3 grouped PartDesignGui build passes, with all 26 Loft/Pipe/Helix acceptance cases including routing, seven Primitive acceptance cases and eight inherited primitive regressions. Native ellipsoid Boolean results match directly configured Classic features; independent Part Boolean integration can differ. The dynamic Wedge layout was corrected after visual review. Owner delivery and final task captures are recorded in WORK_STATE; physical pointer/high-DPI checks and the earlier sketch drawing report remain pending. Native Refine and startup warnings remain in the evidence.</w:t>
+      </w:r>
+    </w:p>
+    <w:p>
+      <w:r>
+        <w:t>October 3 fresh owner build: all enabled Release targets were built and staged in a new portable folder. Existing workflows and defaults are retained. All 22 staged modeling/startup checks passed without source overlays. The desktop shortcut target and working directory were updated and verified. WORK_STATE records build identity, paths and evidence. Physical pointer/high-DPI and earlier sketch drawing acceptance remain pending.</w:t>
       </w:r>
     </w:p>
     <w:sectPr>

</xml_diff>

<commit_message>
Fix ribbon colors and sketch region selection lifecycle
</commit_message>
<xml_diff>
--- a/ai-instructions/ui/FreeCAD Plus UI & UX.docx
+++ b/ai-instructions/ui/FreeCAD Plus UI & UX.docx
@@ -31137,6 +31137,18 @@
     <w:p>
       <w:r>
         <w:t>October 3 fresh owner build: all enabled Release targets were built and staged in a new portable folder. Existing workflows and defaults are retained. All 22 staged modeling/startup checks passed without source overlays. The desktop shortcut target and working directory were updated and verified. WORK_STATE records build identity, paths and evidence. Physical pointer/high-DPI and earlier sketch drawing acceptance remain pending.</w:t>
+      </w:r>
+    </w:p>
+    <w:p>
+      <w:pPr/>
+      <w:r>
+        <w:t>October 3 ribbon and sketch feedback: the ribbon background must match surrounding panels in the active theme. Leaving sketch edit displays unfilled curves. During component Extrude region collection, closed sketch areas use translucent light blue, distinct from solid shading. An interior click can choose a sketch without first selecting it in the Profile field and collects all boundary curves, including holes, in Selected curves. Turning region picking off or closing the task removes its temporary fill. Retain individual edge selection, green/red volume previews and the shared profile collectors in Revolve, Loft, Pipe and Helix.</w:t>
+      </w:r>
+    </w:p>
+    <w:p>
+      <w:pPr/>
+      <w:r>
+        <w:t>Deleting an Extrude must preserve its source sketch, remove unused internal profile helpers and make the sketch available again when no other operation consumes it. Both edge and region selection must support creating another Extrude. Delete, Undo and Redo retain geometry and visibility consistently; shared inputs remain protected. Build, automated regression, visual inspection and owner acceptance are recorded separately in WORK_STATE.</w:t>
       </w:r>
     </w:p>
     <w:sectPr>

</xml_diff>

<commit_message>
Keep component Tasks compact with vertical scrolling
</commit_message>
<xml_diff>
--- a/ai-instructions/ui/FreeCAD Plus UI & UX.docx
+++ b/ai-instructions/ui/FreeCAD Plus UI & UX.docx
@@ -31149,6 +31149,18 @@
       <w:pPr/>
       <w:r>
         <w:t>Deleting an Extrude must preserve its source sketch, remove unused internal profile helpers and make the sketch available again when no other operation consumes it. Both edge and region selection must support creating another Extrude. Delete, Undo and Redo retain geometry and visibility consistently; shared inputs remain protected. Build, automated regression, visual inspection and owner acceptance are recorded separately in WORK_STATE.</w:t>
+      </w:r>
+    </w:p>
+    <w:p>
+      <w:pPr/>
+      <w:r>
+        <w:t>Compact Tasks panels: component Extrude, Revolve, Loft, Pipe, Helix, Primitive and Sketch/Datum Plane forms must remain usable in a narrow panel. Use vertical scrolling when the controls exceed the available height; do not require horizontal scrolling. Labels wrap above fields when space is limited. Long object names and attachment descriptions must not force the panel wider; dropdowns and curve lists retain full text in tooltips. Arrange vector components vertically, group collection buttons in short rows, and retain usable reference entry fields with Pick/Clear below them. Preserve all field values, native units, section defaults and create/edit/preview behavior.</w:t>
+      </w:r>
+    </w:p>
+    <w:p>
+      <w:pPr/>
+      <w:r>
+        <w:t>Narrow-panel acceptance covers a 360 logical-pixel Tasks dock with all applicable sections expanded, two-sided Extrude and custom direction, Primitive Wedge dimensions and attachment, and Sketch axis directions. Every displayed field must remain horizontally within the viewport and reachable by vertical scrolling. Retain the native task scroller and OK/Cancel controls. Build identity, automated checks, inspected captures, desktop shortcut delivery and physical owner acceptance are recorded separately in WORK_STATE.</w:t>
       </w:r>
     </w:p>
     <w:sectPr>

</xml_diff>

<commit_message>
Document required FreeCAD Plus build folder naming
</commit_message>
<xml_diff>
--- a/ai-instructions/ui/FreeCAD Plus UI & UX.docx
+++ b/ai-instructions/ui/FreeCAD Plus UI & UX.docx
@@ -31161,6 +31161,12 @@
       <w:pPr/>
       <w:r>
         <w:t>Narrow-panel acceptance covers a 360 logical-pixel Tasks dock with all applicable sections expanded, two-sided Extrude and custom direction, Primitive Wedge dimensions and attachment, and Sketch axis directions. Every displayed field must remain horizontally within the viewport and reachable by vertical scrolling. Retain the native task scroller and OK/Cancel controls. Build identity, automated checks, inspected captures, desktop shortcut delivery and physical owner acceptance are recorded separately in WORK_STATE.</w:t>
+      </w:r>
+    </w:p>
+    <w:p>
+      <w:pPr/>
+      <w:r>
+        <w:t>Build folder naming: all new builds use freecad_plus_[yyyy-mm-dd]_[test_case], for example freecad_plus_2026-10-03_extrude_frame. Use the build date and a descriptive test-case name separated by underscores. Apply this convention to new compilation folders and owner build output folders under a parent directory outside Google Drive. Preserve build identity, validation evidence and the existing desktop shortcut delivery checks. This records the naming rule without renaming existing builds or changing application behavior.</w:t>
       </w:r>
     </w:p>
     <w:sectPr>

</xml_diff>

<commit_message>
Default new Sketcher sketches to a hidden grid
</commit_message>
<xml_diff>
--- a/ai-instructions/ui/FreeCAD Plus UI & UX.docx
+++ b/ai-instructions/ui/FreeCAD Plus UI & UX.docx
@@ -31167,6 +31167,12 @@
       <w:pPr/>
       <w:r>
         <w:t>Build folder naming: all new builds use freecad_plus_[yyyy-mm-dd]_[test_case], for example freecad_plus_2026-10-03_extrude_frame. Use the build date and a descriptive test-case name separated by underscores. Apply this convention to new compilation folders and owner build output folders under a parent directory outside Google Drive. Preserve build identity, validation evidence and the existing desktop shortcut delivery checks. This records the naming rule without renaming existing builds or changing application behavior.</w:t>
+      </w:r>
+    </w:p>
+    <w:p>
+      <w:pPr/>
+      <w:r>
+        <w:t>Sketcher grid default: new sketches start with the grid hidden when no explicit grid preference is saved. Seed the native Mod/Sketcher/General ShowGrid preference to false. Keep the Sketcher grid toggle and preferences available so the user can enable it. Preserve explicit saved preferences and each existing sketch's stored grid visibility; do not reset the grid each time sketch edit opens. This preference-only change retains geometry, units and grid spacing. Runtime checks, the owner build and shortcut delivery are recorded in WORK_STATE.</w:t>
       </w:r>
     </w:p>
     <w:sectPr>

</xml_diff>

<commit_message>
Keep collected curves highlighted and dim unrelated sketches
</commit_message>
<xml_diff>
--- a/ai-instructions/ui/FreeCAD Plus UI & UX.docx
+++ b/ai-instructions/ui/FreeCAD Plus UI & UX.docx
@@ -31173,6 +31173,14 @@
       <w:pPr/>
       <w:r>
         <w:t>Sketcher grid default: new sketches start with the grid hidden when no explicit grid preference is saved. Seed the native Mod/Sketcher/General ShowGrid preference to false. Keep the Sketcher grid toggle and preferences available so the user can enable it. Preserve explicit saved preferences and each existing sketch's stored grid visibility; do not reset the grid each time sketch edit opens. This preference-only change retains geometry, units and grid spacing. Runtime checks, the owner build and shortcut delivery are recorded in WORK_STATE.</w:t>
+      </w:r>
+    </w:p>
+    <w:p>
+      <w:pPr>
+        <w:keepLines/>
+      </w:pPr>
+      <w:r>
+        <w:t>Curve-selection feedback: throughout component Extrude, Revolve, Helix, Loft and Pipe tasks, collected curves stay highlighted in the selection color, including while editing an existing operation, changing fields or showing a solid preview. After the first curve is collected, other sketches show light-medium gray curves and no area shading. Keep light-blue region shading only on the active sketch when region picking is enabled. Loft retains highlights for all collected sections; Pipe includes its profile, sweep path and active auxiliary path. Changing collectors updates the emphasis. Clearing every collected input restores normal sketch colors and candidate region shading. OK and Cancel remove all temporary emphasis and restore prior display state. Do not persist temporary colors or create document geometry for highlighting. Preserve native edge and interior-region picking, validation and geometry semantics; WORK_STATE records verification and delivery.</w:t>
       </w:r>
     </w:p>
     <w:sectPr>

</xml_diff>

<commit_message>
Show component History when opening operation tasks
</commit_message>
<xml_diff>
--- a/ai-instructions/ui/FreeCAD Plus UI & UX.docx
+++ b/ai-instructions/ui/FreeCAD Plus UI & UX.docx
@@ -31181,6 +31181,14 @@
       </w:pPr>
       <w:r>
         <w:t>Curve-selection feedback: throughout component Extrude, Revolve, Helix, Loft and Pipe tasks, collected curves stay highlighted in the selection color, including while editing an existing operation, changing fields or showing a solid preview. After the first curve is collected, other sketches show light-medium gray curves and no area shading. Keep light-blue region shading only on the active sketch when region picking is enabled. Loft retains highlights for all collected sections; Pipe includes its profile, sweep path and active auxiliary path. Changing collectors updates the emphasis. Clearing every collected input restores normal sketch colors and candidate region shading. OK and Cancel remove all temporary emphasis and restore prior display state. Do not persist temporary colors or create document geometry for highlighting. Preserve native edge and interior-region picking, validation and geometry semantics; WORK_STATE records verification and delivery.</w:t>
+      </w:r>
+    </w:p>
+    <w:p>
+      <w:pPr>
+        <w:keepLines/>
+      </w:pPr>
+      <w:r>
+        <w:t>Component operation entry: starting Extrude or another component operation automatically displays the active component's History tab as its creation task opens. This applies to the shared Sketch, Extrude, Revolve, Loft, Pipe, Helix and Primitive workflows, including entry from Models or Part Tree. If the Components panel is hidden, reveal it. Preserve profile preselection, the active component and occurrence context, and return to the original component view on OK or Cancel. History editing continues to use the same task. Verification and owner delivery are recorded separately in WORK_STATE.</w:t>
       </w:r>
     </w:p>
     <w:sectPr>

</xml_diff>

<commit_message>
Synchronize curve list picks and support toggle and Delete
</commit_message>
<xml_diff>
--- a/ai-instructions/ui/FreeCAD Plus UI & UX.docx
+++ b/ai-instructions/ui/FreeCAD Plus UI & UX.docx
@@ -31189,6 +31189,14 @@
       </w:pPr>
       <w:r>
         <w:t>Component operation entry: starting Extrude or another component operation automatically displays the active component's History tab as its creation task opens. This applies to the shared Sketch, Extrude, Revolve, Loft, Pipe, Helix and Primitive workflows, including entry from Models or Part Tree. If the Components panel is hidden, reveal it. Preserve profile preselection, the active component and occurrence context, and return to the original component view on OK or Cancel. History editing continues to use the same task. Verification and owner delivery are recorded separately in WORK_STATE.</w:t>
+      </w:r>
+    </w:p>
+    <w:p>
+      <w:pPr>
+        <w:keepLines/>
+      </w:pPr>
+      <w:r>
+        <w:t>Curve-list interaction: in every shared component modeling curve collector, highlight and scroll to the most recently picked curve in the task list. Picking a collected curve again removes it and leaves no row highlighted. Give the curve list keyboard focus after a viewport pick so Delete removes its highlighted entries immediately; Delete with no highlighted entries does nothing and never deletes the source sketch. Apply the same behavior to Extrude, Revolve, Helix, Loft and Pipe profile curves and Pipe sweep/auxiliary path edges. Remove the redundant Add selected curves, Add selected and Use selected capture buttons; retain automatic collection, preselection, Remove, Clear, Use all/Use whole and the explicit Pipe path-role picker. Region picking continues to collect the complete boundary and highlights its last collected entry. Keep persistent viewport emphasis for the remaining collected curves, preview validation and OK/Cancel restoration. WORK_STATE records runtime verification and owner delivery.</w:t>
       </w:r>
     </w:p>
     <w:sectPr>

</xml_diff>

<commit_message>
Record combined owner rebuild and verified temp cleanup
</commit_message>
<xml_diff>
--- a/ai-instructions/ui/FreeCAD Plus UI & UX.docx
+++ b/ai-instructions/ui/FreeCAD Plus UI & UX.docx
@@ -31197,6 +31197,14 @@
       </w:pPr>
       <w:r>
         <w:t>Curve-list interaction: in every shared component modeling curve collector, highlight and scroll to the most recently picked curve in the task list. Picking a collected curve again removes it and leaves no row highlighted. Give the curve list keyboard focus after a viewport pick so Delete removes its highlighted entries immediately; Delete with no highlighted entries does nothing and never deletes the source sketch. Apply the same behavior to Extrude, Revolve, Helix, Loft and Pipe profile curves and Pipe sweep/auxiliary path edges. Remove the redundant Add selected curves, Add selected and Use selected capture buttons; retain automatic collection, preselection, Remove, Clear, Use all/Use whole and the explicit Pipe path-role picker. Region picking continues to collect the complete boundary and highlights its last collected entry. Keep persistent viewport emphasis for the remaining collected curves, preview validation and OK/Cancel restoration. WORK_STATE records runtime verification and owner delivery.</w:t>
+      </w:r>
+    </w:p>
+    <w:p>
+      <w:pPr>
+        <w:keepLines/>
+      </w:pPr>
+      <w:r>
+        <w:t>Combined owner build and cleanup, October 3: incorporate the current component modeling changes in one new portable owner build, including task-entry History, curve-list highlight/toggle/Delete behavior, persistent curve emphasis and sketch dimming, compact vertically scrolling tasks, sketch-region picking, grid-off default and ribbon panel styling. Rebuild all enabled targets using the existing configured compiler tree and label this an incremental rebuild with new staging. Preserve the configured workbench scope and native geometry. Validate the staged Plus launcher, its native/source identities and the desktop shortcut before handoff. Remove obsolete FreeCAD outputs from D:\Temp\Office-PC after preserving historical reports, scripts and CAD fixtures in verified archives. Retain the active compiler tree, reusable dependencies and any folder used by a running application. WORK_STATE records the build, runtime checks, cleanup results and publication separately; physical owner acceptance remains separate.</w:t>
       </w:r>
     </w:p>
     <w:sectPr>

</xml_diff>

<commit_message>
Separate full modeling tool overlays from result previews
</commit_message>
<xml_diff>
--- a/ai-instructions/ui/FreeCAD Plus UI & UX.docx
+++ b/ai-instructions/ui/FreeCAD Plus UI & UX.docx
@@ -27411,7 +27411,7 @@
         <w:rPr>
           <w:rtl w:val="0"/>
         </w:rPr>
-        <w:t xml:space="preserve">Retain Recompute on Change and the preview choices None, Overlay and Final Result. Overlay is the default.</w:t>
+        <w:t xml:space="preserve">Retain Recompute on Change and the preview choices None, Overlay and Result. Overlay is the default.</w:t>
       </w:r>
       <w:r>
         <w:rPr>
@@ -27432,7 +27432,7 @@
         <w:rPr>
           <w:rtl w:val="0"/>
         </w:rPr>
-        <w:t xml:space="preserve">Overlay colors: blue for New Body, green for Add and red for Subtract. Preserve the FreeCAD 1.1 style of showing the volume to be added or removed.</w:t>
+        <w:t xml:space="preserve">Overlay colors: blue for New Body, green for Add and red for Subtract. Show the full tool even without a target or Boolean intersection.</w:t>
       </w:r>
       <w:r>
         <w:rPr>
@@ -29322,7 +29322,7 @@
         <w:rPr>
           <w:rtl w:val="0"/>
         </w:rPr>
-        <w:t xml:space="preserve">Retain Recompute on Change and None, Overlay and Final Result; default to Overlay.</w:t>
+        <w:t xml:space="preserve">Retain Recompute on Change and None, Overlay and Result; default to Overlay.</w:t>
       </w:r>
       <w:r>
         <w:rPr>
@@ -31071,7 +31071,7 @@
     </w:p>
     <w:p>
       <w:r>
-        <w:t>Preview offers Recompute on change, enabled by default, and None, Overlay or Final Result; Overlay is the default and uses blue for New Body, green for Add and red for Subtract. Cancel restores visibility and removes preview geometry. Native Revolution and Groove features retain geometry semantics. Type-changing edits preserve the component operation identity and published result references through undo/redo and save/reopen. Expression-driven definitions remain protected from task overwrites and can be edited through their native properties. Runtime acceptance and owner-build delivery are recorded separately in the roadmap and WORK_STATE.</w:t>
+        <w:t>Preview offers Recompute on change, enabled by default, and None, Overlay or Result; Overlay is the default and uses blue for New Body, green for Add and red for Subtract. Cancel restores visibility and removes preview geometry. Native Revolution and Groove features retain geometry semantics. Type-changing edits preserve the component operation identity and published result references through undo/redo and save/reopen. Expression-driven definitions remain protected from task overwrites and can be edited through their native properties. Runtime acceptance and owner-build delivery are recorded separately in the roadmap and WORK_STATE.</w:t>
       </w:r>
     </w:p>
     <w:p>
@@ -31081,7 +31081,7 @@
     </w:p>
     <w:p>
       <w:r>
-        <w:t>Loft Dimensions provides Move up, Move down and Reverse order. Section placements define the span; extrusion lengths, angular extents and offsets do not apply. Advanced retains Closed, Refine and Fuzzy tolerance: zero uses the native default; negative values request automatic tolerance. Preview has Recompute on change enabled and None, Overlay or Final Result. Default Overlay is blue for New Body, green for Add and red for Subtract. Cancel removes previews and restores visibility. Retain native geometry, associative sections and component result identities through edits, Boolean mode changes, undo/redo and save/reopen. Reject invalid or ineffective Booleans and protect expression-driven definitions from task overwrites.</w:t>
+        <w:t>Loft Dimensions provides Move up, Move down and Reverse order. Section placements define the span; extrusion lengths, angular extents and offsets do not apply. Advanced retains Closed, Refine and Fuzzy tolerance: zero uses the native default; negative values request automatic tolerance. Preview has Recompute on change enabled and None, Overlay or Result. Default Overlay is blue for New Body, green for Add and red for Subtract. Cancel removes previews and restores visibility. Retain native geometry, associative sections and component result identities through edits, Boolean mode changes, undo/redo and save/reopen. Reject invalid or ineffective Booleans and protect expression-driven definitions from task overwrites.</w:t>
       </w:r>
     </w:p>
     <w:p>
@@ -31101,7 +31101,7 @@
     </w:p>
     <w:p>
       <w:r>
-        <w:t>Pipe Preview retains Recompute on change enabled, None/Overlay/Final Result, and default Overlay colors blue/green/red for New Body/Add/Subtract. Cancel restores visibility. Preserve native associative profile/path links, component operation and result identities, downstream references, undo/redo and save/reopen through edits and Boolean type changes. Reject invalid, stale or cyclic inputs and ineffective Booleans atomically; protect expressions. October 3 validation: seven Pipe cases, eight Loft regressions and two ribbon checks pass in an isolated candidate without overlays; task captures were reviewed. Native command routing and grouped owner-build/shortcut delivery remain pending, as do physical pointer/high-DPI checks. Roadmap and WORK_STATE hold evidence.</w:t>
+        <w:t>Pipe Preview retains Recompute on change enabled, None/Overlay/Result, and default Overlay colors blue/green/red for New Body/Add/Subtract. Cancel restores visibility. Preserve native associative profile/path links, component operation and result identities, downstream references, undo/redo and save/reopen through edits and Boolean type changes. Reject invalid, stale or cyclic inputs and ineffective Booleans atomically; protect expressions. October 3 validation: seven Pipe cases, eight Loft regressions and two ribbon checks pass in an isolated candidate without overlays; task captures were reviewed. Native command routing and grouped owner-build/shortcut delivery remain pending, as do physical pointer/high-DPI checks. Roadmap and WORK_STATE hold evidence.</w:t>
       </w:r>
     </w:p>
     <w:p>
@@ -31116,7 +31116,7 @@
     </w:p>
     <w:p>
       <w:r>
-        <w:t>Helix Preview retains Recompute on change enabled and None/Overlay/Final Result, default Overlay with blue/green/red for New Body/Add/Subtract. Cancel restores visibility. Preserve native geometry, associative references, component operation and published result identities, downstream consumers, undo/redo and save/reopen. Invalid geometry, stale/cyclic inputs and ineffective Booleans cannot be accepted; failed edits roll back and expressions remain protected. October 3: eight Helix cases and ten shared Loft/Pipe/Revolve/ribbon regressions pass in an isolated candidate without overlays; normal and expanded task captures were inspected. Native command routing, grouped owner-build/shortcut delivery and physical pointer/high-DPI checks remain pending. Native Refine fallback warnings are retained in the evidence; valid geometry does not certify successful splitter removal. See roadmap and WORK_STATE.</w:t>
+        <w:t>Helix Preview retains Recompute on change enabled and None/Overlay/Result, default Overlay with blue/green/red for New Body/Add/Subtract. Cancel restores visibility. Preserve native geometry, associative references, component operation and published result identities, downstream consumers, undo/redo and save/reopen. Invalid geometry, stale/cyclic inputs and ineffective Booleans cannot be accepted; failed edits roll back and expressions remain protected. October 3: eight Helix cases and ten shared Loft/Pipe/Revolve/ribbon regressions pass in an isolated candidate without overlays; normal and expanded task captures were inspected. Native command routing, grouped owner-build/shortcut delivery and physical pointer/high-DPI checks remain pending. Native Refine fallback warnings are retained in the evidence; valid geometry does not certify successful splitter removal. See roadmap and WORK_STATE.</w:t>
       </w:r>
     </w:p>
     <w:p>
@@ -31131,7 +31131,7 @@
     </w:p>
     <w:p>
       <w:r>
-        <w:t>Primitive Preview uses Recompute on change enabled and None, Overlay or Final Result, default Overlay, with blue/green/red for New Body/Add/Subtract. Cancel restores display state. Shape or mode changes preserve operation and published-result identity, downstream consumers and History order. Native geometry, attachments, undo/redo and save/reopen remain intact; invalid solids, ineffective Booleans, stale/cyclic inputs and expressions are guarded. October 3 grouped PartDesignGui build passes, with all 26 Loft/Pipe/Helix acceptance cases including routing, seven Primitive acceptance cases and eight inherited primitive regressions. Native ellipsoid Boolean results match directly configured Classic features; independent Part Boolean integration can differ. The dynamic Wedge layout was corrected after visual review. Owner delivery and final task captures are recorded in WORK_STATE; physical pointer/high-DPI checks and the earlier sketch drawing report remain pending. Native Refine and startup warnings remain in the evidence.</w:t>
+        <w:t>Primitive Preview uses Recompute on change enabled and None, Overlay or Result, default Overlay, with blue/green/red for New Body/Add/Subtract. Cancel restores display state. Shape or mode changes preserve operation and published-result identity, downstream consumers and History order. Native geometry, attachments, undo/redo and save/reopen remain intact; invalid solids, ineffective Booleans, stale/cyclic inputs and expressions are guarded. October 3 grouped PartDesignGui build passes, with all 26 Loft/Pipe/Helix acceptance cases including routing, seven Primitive acceptance cases and eight inherited primitive regressions. Native ellipsoid Boolean results match directly configured Classic features; independent Part Boolean integration can differ. The dynamic Wedge layout was corrected after visual review. Owner delivery and final task captures are recorded in WORK_STATE; physical pointer/high-DPI checks and the earlier sketch drawing report remain pending. Native Refine and startup warnings remain in the evidence.</w:t>
       </w:r>
     </w:p>
     <w:p>
@@ -31205,6 +31205,14 @@
       </w:pPr>
       <w:r>
         <w:t>Combined owner build and cleanup, October 3: incorporate the current component modeling changes in one new portable owner build, including task-entry History, curve-list highlight/toggle/Delete behavior, persistent curve emphasis and sketch dimming, compact vertically scrolling tasks, sketch-region picking, grid-off default and ribbon panel styling. Rebuild all enabled targets using the existing configured compiler tree and label this an incremental rebuild with new staging. Preserve the configured workbench scope and native geometry. Validate the staged Plus launcher, its native/source identities and the desktop shortcut before handoff. Remove obsolete FreeCAD outputs from D:\Temp\Office-PC after preserving historical reports, scripts and CAD fixtures in verified archives. Retain the active compiler tree, reusable dependencies and any folder used by a running application. WORK_STATE records the build, runtime checks, cleanup results and publication separately; physical owner acceptance remains separate.</w:t>
+      </w:r>
+    </w:p>
+    <w:p>
+      <w:pPr>
+        <w:keepLines/>
+      </w:pPr>
+      <w:r>
+        <w:t>Modeling preview types: Extrude, Revolve, Loft, Pipe, Helix and Primitive use a dropdown with None, Overlay (default) and Result. Automatic updates remain enabled by default. Once the required closed profile and other geometric inputs are complete, Overlay shows the full native tool in blue for New Body, green for Add or red for Subtract. Add/Subtract overlays do not require a target or Boolean intersection and are not clipped to the target: a 5-inch subtract extrusion remains 5 inches long through a 1-inch body. Reference-defined extents still require their geometric references. Result shows the evaluated final geometry in normal body appearance without operation colors; it requires valid targets and a valid result. None removes the preview. Switching types, failed previews and Cancel restore prior visibility and transparency; collected curves retain their task highlights. OK continues to validate the actual operation and preserve native geometry, undo and persistence. WORK_STATE records native runtime acceptance, Python-only owner staging and shortcut delivery separately.</w:t>
       </w:r>
     </w:p>
     <w:sectPr>

</xml_diff>

<commit_message>
Open component feature editors reliably on double-click
</commit_message>
<xml_diff>
--- a/ai-instructions/ui/FreeCAD Plus UI & UX.docx
+++ b/ai-instructions/ui/FreeCAD Plus UI & UX.docx
@@ -31213,6 +31213,14 @@
       </w:pPr>
       <w:r>
         <w:t>Modeling preview types: Extrude, Revolve, Loft, Pipe, Helix and Primitive use a dropdown with None, Overlay (default) and Result. Automatic updates remain enabled by default. Once the required closed profile and other geometric inputs are complete, Overlay shows the full native tool in blue for New Body, green for Add or red for Subtract. Add/Subtract overlays do not require a target or Boolean intersection and are not clipped to the target: a 5-inch subtract extrusion remains 5 inches long through a 1-inch body. Reference-defined extents still require their geometric references. Result shows the evaluated final geometry in normal body appearance without operation colors; it requires valid targets and a valid result. None removes the preview. Switching types, failed previews and Cancel restore prior visibility and transparency; collected curves retain their task highlights. OK continues to validate the actual operation and preserve native geometry, undo and persistence. WORK_STATE records native runtime acceptance, Python-only owner staging and shortcut delivery separately.</w:t>
+      </w:r>
+    </w:p>
+    <w:p>
+      <w:pPr>
+        <w:keepLines/>
+      </w:pPr>
+      <w:r>
+        <w:t>Components panel double-click editing: in History, double-click an operation or feature name, icon or status area to open its existing edit task; double-click a sketch to enter Sketcher edit mode directly. Editing must still work if a document notification rebuilds the History rows between the clicks. Resolve the selected document object before opening the editor, preserving the component and occurrence context. Keep single-click selection, visibility eyes, suppression checkboxes, Models and Part Tree component editing, and context-menu Edit unchanged. Origins remain protected and another active task must be finished before opening a different editor. Closing or cancelling the editor returns to the original component context. WORK_STATE records native mouse-input regressions, owner-build delivery and documentation review separately.</w:t>
       </w:r>
     </w:p>
     <w:sectPr>

</xml_diff>

<commit_message>
Reorder component history within dependency bounds
</commit_message>
<xml_diff>
--- a/ai-instructions/ui/FreeCAD Plus UI & UX.docx
+++ b/ai-instructions/ui/FreeCAD Plus UI & UX.docx
@@ -31221,6 +31221,14 @@
       </w:pPr>
       <w:r>
         <w:t>Components panel double-click editing: in History, double-click an operation or feature name, icon or status area to open its existing edit task; double-click a sketch to enter Sketcher edit mode directly. Editing must still work if a document notification rebuilds the History rows between the clicks. Resolve the selected document object before opening the editor, preserving the component and occurrence context. Keep single-click selection, visibility eyes, suppression checkboxes, Models and Part Tree component editing, and context-menu Edit unchanged. Origins remain protected and another active task must be finished before opening a different editor. Closing or cancelling the editor returns to the original component context. WORK_STATE records native mouse-input regressions, owner-build delivery and documentation review separately.</w:t>
+      </w:r>
+    </w:p>
+    <w:p>
+      <w:pPr>
+        <w:keepLines/>
+      </w:pPr>
+      <w:r>
+        <w:t>Model History ordering: drag feature/object names, icons or status areas to reorder within the active component. Drop above or below a row; empty space means the end. Clamp an invalid drop to the closest valid position after all predecessor objects and before all dependents, following transitive geometry and expression dependencies, including hidden profile binders and published results. The native part Origin remains the first displayed item and cannot be dragged; its origin planes remain protected. Dropping near the origin places a movable item at its earliest legal position below it. Multiple selected items retain their existing relative order, as do unselected items; an intervening dependency remains between selected items when needed. Show the actual allowed insertion line and scroll long histories at viewport edges. Store the change as one undoable History-order edit, preserving geometry, links, object/result identities, ownership and save/reopen behavior. Background results travel with their visible producer. Refuse cross-component, stale and active-edit moves. Keep existing selection, double-click editing, visibility and suppression behavior. WORK_STATE records verification and owner delivery separately.</w:t>
       </w:r>
     </w:p>
     <w:sectPr>

</xml_diff>

<commit_message>
Temporarily suppress later history items during feature editing
</commit_message>
<xml_diff>
--- a/ai-instructions/ui/FreeCAD Plus UI & UX.docx
+++ b/ai-instructions/ui/FreeCAD Plus UI & UX.docx
@@ -31229,6 +31229,14 @@
       </w:pPr>
       <w:r>
         <w:t>Model History ordering: drag feature/object names, icons or status areas to reorder within the active component. Drop above or below a row; empty space means the end. Clamp an invalid drop to the closest valid position after all predecessor objects and before all dependents, following transitive geometry and expression dependencies, including hidden profile binders and published results. The native part Origin remains the first displayed item and cannot be dragged; its origin planes remain protected. Dropping near the origin places a movable item at its earliest legal position below it. Multiple selected items retain their existing relative order, as do unselected items; an intervening dependency remains between selected items when needed. Show the actual allowed insertion line and scroll long histories at viewport edges. Store the change as one undoable History-order edit, preserving geometry, links, object/result identities, ownership and save/reopen behavior. Background results travel with their visible producer. Refuse cross-component, stale and active-edit moves. Keep existing selection, double-click editing, visibility and suppression behavior. WORK_STATE records verification and owner delivery separately.</w:t>
+      </w:r>
+    </w:p>
+    <w:p>
+      <w:pPr>
+        <w:keepLines/>
+      </w:pPr>
+      <w:r>
+        <w:t>Editing Model History: temporarily suppress every subsequent feature or object in the active component, following the current reordered History sequence. Editing item 5 of 10 suppresses items 6 through 10, including independent later items and their background results. Keep the edited item, earlier items and native Origin available. Apply this shared behavior to sketches, native feature editors and combined modeling tasks. Later items show an unchecked Suppressed during edit state, are hidden and are unavailable as evaluated component inputs or results until editing ends. Keep existing authored suppression unchanged. Accept or Cancel restores prior suppression and display choices; a failed validation keeps the edit and temporary suppression active, while failed editor startup restores them. Refresh downstream results after completion. Temporary state must not create an Undo entry, alter object identities or persist when saving during an edit. Preserve component and occurrence context on return. WORK_STATE records native runtime checks, Word review and owner delivery separately.</w:t>
       </w:r>
     </w:p>
     <w:sectPr>

</xml_diff>

<commit_message>
Support independent sketch frames and preserve placement when support fails
</commit_message>
<xml_diff>
--- a/ai-instructions/ui/FreeCAD Plus UI & UX.docx
+++ b/ai-instructions/ui/FreeCAD Plus UI & UX.docx
@@ -26510,7 +26510,7 @@
         <w:rPr>
           <w:rtl w:val="0"/>
         </w:rPr>
-        <w:t xml:space="preserve">Open a sketch creation task without requiring a visible Body object.</w:t>
+        <w:t xml:space="preserve">Open a sketch creation task without requiring a Body or attachment to another object.</w:t>
       </w:r>
     </w:p>
     <w:p>
@@ -26542,7 +26542,7 @@
         <w:rPr>
           <w:rtl w:val="0"/>
         </w:rPr>
-        <w:t xml:space="preserve">Allow attachment to an origin plane, an object face, an existing user-created plane, or a new plane created within this workflow.</w:t>
+        <w:t xml:space="preserve">Choose an origin plane, an existing user-created plane, one planar body face, two coplanar edges of one body, or Independent plane. Independent plane defines the sketch origin X, Y and Z and its orientation with rotation angles or explicit in-plane and normal directions, in component coordinates. Creating a separate datum plane remains available.</w:t>
       </w:r>
     </w:p>
     <w:p>
@@ -26558,7 +26558,7 @@
         <w:rPr>
           <w:rtl w:val="0"/>
         </w:rPr>
-        <w:t xml:space="preserve">Retain the attachment selector and Offset field. Show the available support clearly before accepting the sketch.</w:t>
+        <w:t xml:space="preserve">Retain the plane selector and Offset field. Follow support is enabled by default; turn it off to copy the selected frame once without an attachment. Independent plane has no support. Reject collinear or non-coplanar edge pairs that do not define one flat plane.</w:t>
       </w:r>
     </w:p>
     <w:p>
@@ -26590,7 +26590,7 @@
         <w:rPr>
           <w:rtl w:val="0"/>
         </w:rPr>
-        <w:t xml:space="preserve">Retain New Sketch, Attach Sketch and Edit Sketch actions.</w:t>
+        <w:t xml:space="preserve">Retain New Sketch, Attach Sketch and Edit Sketch actions. For a body face, two-edge or user-plane attachment, save the last valid support plane location and orientation and the sketch origin and axes. Follow valid support movement. If the support is deleted, missing or unavailable because of an upstream error, keep the sketch at exactly its last valid frame and allow editing and downstream modeling. Resume following when the same support is repaired or restored by Undo; never attach to an unrelated replacement with the same name. Preserve the frame and support references through save/reopen.</w:t>
       </w:r>
     </w:p>
     <w:p>
@@ -28442,7 +28442,7 @@
         <w:rPr>
           <w:rtl w:val="0"/>
         </w:rPr>
-        <w:t xml:space="preserve">Datum-plane creation: the new-file Tasks action and New Sketch share Define Surface, Z Direction, Sketch Origin and X Direction, in that order. Projected references is the default frame definition. Choose a flat surface first, retaining origin-plane, planar-face and user-plane attachments plus signed surface offset and rotation controls. Z follows the surface normal; Reverse Z changes its sign without moving the surface or origin. The default sketch origin is the component origin orthogonally projected onto the defined plane; an optional picked vertex or datum point replaces that source and is projected in the same way. Default X uses the component axis most parallel to the plane, measured by greatest projected length, with X then Y then Z breaking ties. Alternatively project a selected line/edge direction or the vector from the first selected point to the second. Curved edges use their midpoint tangent. Reverse X changes X independently of Z; derive Y to retain a right-handed frame. Reject zero projected directions and coincident projected points inline without creating objects. Picked references remain associative through native dependencies, recompute, Undo/Redo and save/reopen. Keep the public native PartDesign plane and native sketch attachment; implementation frame helpers stay hidden and are removed with an unshared plane. Existing planes and scripting calls retain their original attachment semantics. Rotation angles and Axis directions remain explicit legacy frame modes. Create Datum Plane keeps New Sketch open and immediately selects the new plane; Cancel then keeps that explicitly created plane. Otherwise sketch OK creates the plane and sketch in one transaction and Cancel creates neither. Keep a narrow task panel with vertical scrolling only. WORK_STATE records native checks, reviewed Word pages, owner payload and shortcut delivery separately.</w:t>
+        <w:t xml:space="preserve">Datum-plane creation: the new-file Tasks action and New Sketch share Define Surface, Z Direction, Sketch Origin and X Direction, in that order. Projected references is the default frame definition. Choose a flat surface first, retaining origin-plane, planar-face and user-plane attachments plus signed surface offset and rotation controls. Z follows the surface normal; Reverse Z changes its sign without moving the surface or origin. The default sketch origin is the component origin orthogonally projected onto the defined plane; an optional picked vertex or datum point replaces that source and is projected in the same way. Default X uses the component axis most parallel to the plane, measured by greatest projected length, with X then Y then Z breaking ties. Alternatively project a selected line/edge direction or the vector from the first selected point to the second. Curved edges use their midpoint tangent. Reverse X changes X independently of Z; derive Y to retain a right-handed frame. Reject zero projected directions and coincident projected points inline without creating objects. Picked references remain associative through native dependencies, recompute, Undo/Redo and save/reopen. Keep the public native PartDesign plane and the sketch saved-frame behavior above; implementation frame helpers stay hidden and are removed with an unshared plane. Existing planes and scripting calls retain their original attachment semantics. Rotation angles and Axis directions remain explicit legacy frame modes. Create Datum Plane keeps New Sketch open and immediately selects the new plane; Cancel then keeps that explicitly created plane. Otherwise sketch OK creates the plane and sketch in one transaction and Cancel creates neither. Keep a narrow task panel with vertical scrolling only. WORK_STATE records native checks, reviewed Word pages, owner payload and shortcut delivery separately.</w:t>
       </w:r>
     </w:p>
     <w:p>

</xml_diff>

<commit_message>
Fix curve-region pick arbitration and share modeling task controls
</commit_message>
<xml_diff>
--- a/ai-instructions/ui/FreeCAD Plus UI & UX.docx
+++ b/ai-instructions/ui/FreeCAD Plus UI & UX.docx
@@ -46150,7 +46150,7 @@
         <w:rPr>
           <w:rtl w:val="0"/>
         </w:rPr>
-        <w:t xml:space="preserve">Curve-list interaction: in every shared component modeling curve collector, highlight and scroll to the most recently picked curve in the task list. Picking a collected curve again removes it and leaves no row highlighted. Give the curve list keyboard focus after a viewport pick so Delete removes its highlighted entries immediately; Delete with no highlighted entries does nothing and never deletes the source sketch. Apply the same behavior to Extrude, Revolve, Helix, Loft and Pipe profile curves and Pipe sweep/auxiliary path edges. Remove the redundant Add selected curves, Add selected and Use selected capture buttons; retain automatic collection, preselection, Remove, Clear, Use all/Use whole and the explicit Pipe path-role picker. Region picking continues to collect the complete boundary and highlights its last collected entry. Keep persistent viewport emphasis for the remaining collected curves, preview validation and OK/Cancel restoration. WORK_STATE records runtime verification and owner delivery.</w:t>
+        <w:t>Curve-list interaction: in every shared component modeling curve collector, highlight and scroll to the most recently picked curve in the task list. Picking a collected curve again removes it and leaves no row highlighted. Give the curve list keyboard focus after a viewport pick so Delete removes its highlighted entries immediately; Delete with no highlighted entries does nothing and never deletes the source sketch. Apply the same behavior to Extrude, Revolve, Helix, Loft and Pipe profile curves and Pipe sweep/auxiliary path edges. Remove the redundant Add selected curves, Add selected and Use selected capture buttons; retain automatic collection, preselection, Remove, Clear, Use all/Use whole and the explicit Pipe path-role picker. Region picking continues to collect the complete boundary and highlights its last collected entry. Keep persistent viewport emphasis for the remaining collected curves, preview validation and OK/Cancel restoration. WORK_STATE records runtime verification and owner delivery. A click within the native edge-picking tolerance must select only that edge, even in a tilted view where the edge hit is slightly behind the sketch-plane intersection. The same click must never also collect a closed region. Interior clicks away from edges continue to collect complete region boundaries. Use one reusable source/list/action component for profile curves, Loft/Pipe section curves and Pipe sweep/auxiliary path edges, with shared selection and display handling.</w:t>
       </w:r>
     </w:p>
     <w:p>
@@ -46174,7 +46174,7 @@
         <w:rPr>
           <w:rtl w:val="0"/>
         </w:rPr>
-        <w:t xml:space="preserve">Modeling preview types: Extrude, Revolve, Loft, Pipe, Helix and Primitive use a dropdown with None, Overlay (default) and Result. Automatic updates remain enabled by default. Once the required closed profile and other geometric inputs are complete, Overlay shows the full native tool in blue for New Body, green for Add or red for Subtract. Add/Subtract overlays do not require a target or Boolean intersection and are not clipped to the target: a 5-inch subtract extrusion remains 5 inches long through a 1-inch body. Reference-defined extents still require their geometric references. Result shows the evaluated final geometry in normal body appearance without operation colors; it requires valid targets and a valid result. None removes the preview. Switching types, failed previews and Cancel restore prior visibility and transparency; collected curves retain their task highlights. OK continues to validate the actual operation and preserve native geometry, undo and persistence. WORK_STATE records native runtime acceptance, Python-only owner staging and shortcut delivery separately.</w:t>
+        <w:t>Modeling preview types: Extrude, Revolve, Loft, Pipe, Helix and Primitive use a dropdown with None, Overlay (default) and Result. Automatic updates remain enabled by default. Once the required closed profile and other geometric inputs are complete, Overlay shows the full native tool in blue for New Body, green for Add or red for Subtract. Add/Subtract overlays do not require a target or Boolean intersection and are not clipped to the target: a 5-inch subtract extrusion remains 5 inches long through a 1-inch body. Reference-defined extents still require their geometric references. Result shows the evaluated final geometry in normal body appearance without operation colors; it requires valid targets and a valid result. None removes the preview. Switching types, failed previews and Cancel restore prior visibility and transparency; collected curves retain their task highlights. OK continues to validate the actual operation and preserve native geometry, undo and persistence. WORK_STATE records native runtime acceptance, Python-only owner staging and shortcut delivery separately. Share the preview controls and debounce timer across all six tasks. Reuse common operation/target choices, compact layouts, reference rows, quantity fields, refinement/fuzzy-tolerance options and status controls wherever applicable; keep operation-specific geometry, native properties and validation in their existing backends.</w:t>
       </w:r>
     </w:p>
     <w:p>

</xml_diff>

<commit_message>
Rework datum plane creation and editing with shared geometry collectors
</commit_message>
<xml_diff>
--- a/ai-instructions/ui/FreeCAD Plus UI & UX.docx
+++ b/ai-instructions/ui/FreeCAD Plus UI & UX.docx
@@ -43120,7 +43120,7 @@
         <w:rPr>
           <w:rtl w:val="0"/>
         </w:rPr>
-        <w:t xml:space="preserve">Section 1: Define Surface. Choose an origin plane, planar face or existing user plane; retain surface offset and rotation controls.</w:t>
+        <w:t xml:space="preserve">Section 1: Plane orientation and location. Select geometry is the default; Enter values is the alternative. The shared selection list accepts an origin/user plane, flat face, two coplanar non-collinear body edges or lines (including an origin axis with a line), three non-collinear points, or a line and an off-line point. Planar curves may participate; reject contradictory or non-coplanar geometry. An adjacent [...] menu offers XY, YZ and XZ planes. Show Under-defined, Defined or Invalid with an explanation. Enter values exposes X/Y/Z offsets and x'/y'/z' normal components, normalized on acceptance. Provide Reverse normal direction and a signed Offset distance with its own Reverse button.</w:t>
       </w:r>
     </w:p>
     <w:p>
@@ -43139,7 +43139,7 @@
         <w:rPr>
           <w:rtl w:val="0"/>
         </w:rPr>
-        <w:t xml:space="preserve">Section 2: Z Direction. Default to the surface normal and provide a Reverse Z button.</w:t>
+        <w:t xml:space="preserve">Section 2: Orientation. Use the same shared selection list for the projected X direction. Accept one body edge, line or origin axis, or two points including curve endpoints. The adjacent [...] menu offers X, Y and Z axes. Show Under-defined, Defined or Invalid. An empty list defaults to the component axis closest to the plane; break ties X, then Y, then Z. Project the chosen direction onto the plane; reject a zero projection. Provide Reverse direction for +X versus -X; derive Y to keep a right-handed frame.</w:t>
       </w:r>
     </w:p>
     <w:p>
@@ -43158,7 +43158,7 @@
         <w:rPr>
           <w:rtl w:val="0"/>
         </w:rPr>
-        <w:t xml:space="preserve">Section 3: Sketch Origin. Default to the component origin projected onto the plane; allow selection of any local vertex or datum point and project it onto the plane.</w:t>
+        <w:t xml:space="preserve">Section 3: Origin selection. A single-item selection textbox defaults to the part origin projected onto the plane. Clicking the field activates picking of an origin, point or curve endpoint. Project the selected point onto the plane. Delete clears the reference and restores the default.</w:t>
       </w:r>
     </w:p>
     <w:p>
@@ -43177,7 +43177,7 @@
         <w:rPr>
           <w:rtl w:val="0"/>
         </w:rPr>
-        <w:t xml:space="preserve">Section 4: X Direction. Default to the component axis closest to the plane, projected onto it. Allow a selected line/edge or two selected points to define the projected direction, and provide a Reverse X button.</w:t>
+        <w:t xml:space="preserve">Section 4: Preview. Preview enables a translucent purple plane overlay; Recompute on update controls automatic updates. Both checkboxes default on. The overlay creates no document object and cannot intercept selections. When automatic updates are off, toggling Preview off/on refreshes it; OK always validates and recomputes the saved plane.</w:t>
       </w:r>
     </w:p>
     <w:p>
@@ -45872,7 +45872,7 @@
         <w:rPr>
           <w:rtl w:val="0"/>
         </w:rPr>
-        <w:t xml:space="preserve">Datum-plane creation: the new-file Tasks action and New Sketch share Define Surface, Z Direction, Sketch Origin and X Direction, in that order. Projected references is the default frame definition. Choose a flat surface first, retaining origin-plane, planar-face and user-plane attachments plus signed surface offset and rotation controls. Z follows the surface normal; Reverse Z changes its sign without moving the surface or origin. The default sketch origin is the component origin orthogonally projected onto the defined plane; an optional picked vertex or datum point replaces that source and is projected in the same way. Default X uses the component axis most parallel to the plane, measured by greatest projected length, with X then Y then Z breaking ties. Alternatively project a selected line/edge direction or the vector from the first selected point to the second. Curved edges use their midpoint tangent. Reverse X changes X independently of Z; derive Y to retain a right-handed frame. Reject zero projected directions and coincident projected points inline without creating objects. Picked references remain associative through native dependencies, recompute, Undo/Redo and save/reopen. Keep the public native PartDesign plane and the sketch saved-frame behavior above; implementation frame helpers stay hidden and are removed with an unshared plane. Existing planes and scripting calls retain their original attachment semantics. Rotation angles and Axis directions remain explicit legacy frame modes. Create Datum Plane keeps New Sketch open and immediately selects the new plane; Cancel then keeps that explicitly created plane. Otherwise sketch OK creates the plane and sketch in one transaction and Cancel creates neither. Keep a narrow task panel with vertical scrolling only. WORK_STATE records native checks, reviewed Word pages, owner payload and shortcut delivery separately.</w:t>
+        <w:t xml:space="preserve">Datum-plane create/edit uses the four sections specified above from the standalone Plus Plane action, native Datum Plane command in a component document, and component History editing. Both geometry lists reuse the modeling curve collector with broader reference filters, latest-item highlighting, repeat-click deselection, Remove/Clear and Delete. Plane inputs accept faces, planes, axes, edges, curves and points; orientation accepts edges, axes and points. Retain associative native dependencies, Undo/Redo, save/reopen, public PartDesign plane identity and hidden-helper cleanup. Opening older planes preserves their frame; legacy arbitrary rotations are retained as explicit values with stored origin and X direction. Existing sketch attachment and embedded Create Datum Plane behavior remain available. All task backgrounds and dropdown text follow the active theme; remove forced dark colors, and refresh ribbon colors when the theme palette changes. Keep origin axes and planes small normally; show axes, planes and the origin point at twice normal size during plane and sketch placement editors, then restore prior size and visibility. Use a narrow task panel with vertical scrolling only. WORK_STATE records native build, runtime checks, document review and owner shortcut delivery separately; physical owner acceptance remains separate.</w:t>
       </w:r>
     </w:p>
     <w:p>

</xml_diff>

<commit_message>
Prepare parent-owned Move workflows and native interactive preview
Retain recovered Translate/Rotate and add point mapping, minimal-angle axis alignment, complete frame alignment and view-owned native handles/pivot editing. Add native regression cases and consolidate recovered ribbon/package wiring and owner requirements. Parsing, GUI CMake inventory and staged whitespace checks pass; native compilation, actual GUI test execution and DOCX visual review remain pending. This source-preparation milestone is not owner-ready delivery.
</commit_message>
<xml_diff>
--- a/ai-instructions/ui/FreeCAD Plus UI & UX.docx
+++ b/ai-instructions/ui/FreeCAD Plus UI & UX.docx
@@ -46211,6 +46211,245 @@
           <w:rtl w:val="0"/>
         </w:rPr>
         <w:t xml:space="preserve">Editing Model History: temporarily suppress every subsequent feature or object in the active component, following the current reordered History sequence. Editing item 5 of 10 suppresses items 6 through 10, including independent later items and their background results. Keep the edited item, earlier items and native Origin available. Apply this shared behavior to sketches, native feature editors and combined modeling tasks. Later items show an unchecked Suppressed during edit state, are hidden and are unavailable as evaluated component inputs or results until editing ends. Keep existing authored suppression unchanged. Accept or Cancel restores prior suppression and display choices; a failed validation keeps the edit and temporary suppression active, while failed editor startup restores them. Refresh downstream results after completion. Temporary state must not create an Undo entry, alter object identities or persist when saving during an edit. Preserve component and occurrence context on return. WORK_STATE records native runtime checks, Word review and owner delivery separately.</w:t>
+      </w:r>
+    </w:p>
+    <w:p>
+      <w:pPr>
+        <w:keepLines w:val="1"/>
+        <w:rPr/>
+      </w:pPr>
+      <w:r>
+        <w:t>Design selection toolbar: show alongside Save and Edit above the ribbon, only in Plus UI Design mode. The first dropdown offers Single Curve (default), Connected Curves and Tangent Curves for drawing curves and body edges. The second dropdown contains independent checkboxes for Planes, Bodies, Surfaces, Faces, Edges, Curves, Points and Vertices. Keep command-specific input rules in effect; the filter must not replace or widen a task collector gate.</w:t>
+      </w:r>
+    </w:p>
+    <w:p>
+      <w:pPr>
+        <w:keepLines w:val="1"/>
+        <w:rPr/>
+      </w:pPr>
+      <w:r>
+        <w:t>Selection categories: Surfaces are sheets not associated with bodies; Faces and Edges belong to bodies. Curves are drawing items, including sketch curves and standalone three-dimensional curves such as isoclines. Points include sketch points, reference points and origins; Vertices are body corners. A sketch remains drawing geometry even when owned by or used to construct a body. Preserve full occurrence paths. A sheet boundary remains in the Surface category; solid result objects are selectable Bodies even when their native type is not PartDesign Body.</w:t>
+      </w:r>
+    </w:p>
+    <w:p>
+      <w:pPr>
+        <w:keepLines w:val="1"/>
+        <w:rPr/>
+      </w:pPr>
+      <w:r>
+        <w:t>Curve intent: Connected Curves follows endpoint connections within the picked sketch or shape, including every branch and closed multi-edge loop, without crossing separate objects. Tangent Curves follows endpoint-connected tangents and stops at branches or tangent discontinuities. Use 0.0000001 mm endpoint tolerance and 0.00001 radian tangent-angle tolerance, independent of zoom. A closed periodic curve remains one item; its parameter seam does not connect it to other curves. Sketch construction geometry retains its native geometry indices. Feature collectors retain ownership of their reference-picking behavior.</w:t>
+      </w:r>
+    </w:p>
+    <w:p>
+      <w:pPr>
+        <w:keepLines w:val="1"/>
+        <w:rPr/>
+      </w:pPr>
+      <w:r>
+        <w:t>Directional Selection defaults on and remembers the saved preference. Left-to-right selects only fully enclosed geometry; right-to-left additionally selects crossing geometry. When off, both directions require full enclosure. Use a solid enclosure border and a dashed crossing border, consistent in sketch edit and the three-dimensional view. Both directions obey enabled entity filters and command input rules. Native projected bounds and tessellated geometry determine enclosure and crossing; hidden objects remain excluded.</w:t>
+      </w:r>
+    </w:p>
+    <w:p>
+      <w:pPr>
+        <w:keepLines w:val="1"/>
+        <w:rPr/>
+      </w:pPr>
+      <w:r>
+        <w:t>Persistent Selection defaults on and remembers the saved preference. Identity-preserving operations retain surviving selected entities so Equal can be followed by Construction Geometry without reselecting the same lines. Failed operations keep inputs available for correction; deleted entities leave selection. Turning persistence off restores operation-completion clearing. Escape and clicking empty space deselect all items even with persistence on. Do not restore stale subelement indices after topology changes or override deliberate command-collector resets. The constraint palette and Move Components task use the same preference.</w:t>
+      </w:r>
+    </w:p>
+    <w:p>
+      <w:pPr>
+        <w:keepLines w:val="1"/>
+        <w:rPr/>
+      </w:pPr>
+      <w:r>
+        <w:t>Selection toolbar validation: Python policy and toolbar checks run against the existing Plus runtime with explicit source overlays. Native selection-gate, Sketcher command, directional-box and pointer-path acceptance require the grouped native rebuild in the final authorized workload prompt. This source preparation is not a new owner build or a claim of physical acceptance. WORK_STATE records exact checks, documentation review and pending delivery gates.</w:t>
+      </w:r>
+    </w:p>
+    <w:p>
+      <w:pPr>
+        <w:keepLines w:val="1"/>
+        <w:rPr/>
+      </w:pPr>
+      <w:r>
+        <w:t>Design Layers: Each document has permanent Base and exactly one active layer, initially Base. Base cannot be renamed or deleted. Origin and origin features always belong to Base. New independent model objects take the active layer; missing or foreign assignments in an existing document migrate to Base. Layer IDs, labels, visibility, active choice and assignments are native saved properties, with undo/redo. Layer metadata has NoRecompute semantics and introduces no document dependency links.</w:t>
+      </w:r>
+    </w:p>
+    <w:p>
+      <w:pPr>
+        <w:keepLines w:val="1"/>
+        <w:rPr/>
+      </w:pPr>
+      <w:r>
+        <w:t>Design Layers: A sketch is indivisible and remains independent of every body that consumes it, including a sketch nested in a native Body. A Body and its building operations share a layer. Native Body membership and explicit Plus Producer/ConsumedResults relationships define the body unit; arbitrary dependency recursion is forbidden. Selecting several operations of one body resolves to one assignment owner. Sketch selection moves only that sketch. New operations inherit their existing body's layer. Same-document occurrences resolve the shared definition's model objects; external definitions are edited in their owning document, not implicitly reparented.</w:t>
+      </w:r>
+    </w:p>
+    <w:p>
+      <w:pPr>
+        <w:keepLines w:val="1"/>
+        <w:rPr/>
+      </w:pPr>
+      <w:r>
+        <w:t>Design Layers: The Design-only Layers toolbar sits beside Selection/Save/Edit. It contains Layers (open task panel), Move to Layer and Change Active Layer. The latter two are compact fixed-label whole-button menus, not split buttons or current-value combo boxes. Move to Layer is disabled without eligible preselection and changes all deduplicated targets in one transaction. Active-layer menu items show the current check mark.</w:t>
+      </w:r>
+    </w:p>
+    <w:p>
+      <w:pPr>
+        <w:keepLines w:val="1"/>
+        <w:rPr/>
+      </w:pPr>
+      <w:r>
+        <w:t>Design Layers: The task panel creates, renames, deletes, assigns and activates layers. Double-click a layer to activate it; active text is bold with a check. An eye control toggles each row's visibility. Layer hiding gates scene geometry without changing individual Visibility properties or taking snapshots. Hidden intermediate results remain hidden, individual changes while hidden are respected, and independently layered sketches remain traversable in the Body's native Group display. Native container Visibility and native Through/Tip display choices continue to govern their own scene traversal. Delete moves assignments to Base, never deletes geometry, and activates Base when the deleted layer was active. Changes are individually undoable from the task panel.</w:t>
+      </w:r>
+    </w:p>
+    <w:p>
+      <w:pPr>
+        <w:keepLines w:val="1"/>
+        <w:rPr/>
+      </w:pPr>
+      <w:r>
+        <w:t>Contextual Constraint Palette: Only a click while editing a sketch in Plus Design mode opens the palette. Use the entire native selection, including additional selection clicks; box or programmatic selection alone never opens it. Place above the click where possible, otherwise below or clamp within the viewport. Use logical pixels for DPI scaling. Keep a 24-pixel-wide travel corridor to the actual palette rectangle, with a 12-pixel anchor allowance and a 4-pixel palette margin. Remain visible indefinitely inside; outside starts a one-second grace timer and reentry cancels it. New clicks restart the travel context. Action updates retain position unless viewport clamping requires movement. Dismissal by pointer travel leaves selection intact.</w:t>
+      </w:r>
+    </w:p>
+    <w:p>
+      <w:pPr>
+        <w:keepLines w:val="1"/>
+        <w:rPr/>
+      </w:pPr>
+      <w:r>
+        <w:t>Contextual Constraint Palette: The palette contains only applicable native constraints/dimensions, Construction Geometry and separate Make Driving/Make Reference actions. Structurally inapplicable actions are absent. Existing constraints and known conflicts/redundancies are disabled with tooltips that remain available on disabled buttons. A cloned native Sketch solver diagnoses additions without changing committed geometry, constraints or the live solver. Nonconvergence alone is unknown feasibility and does not disable an action. No hover action adds constraints. Revalidate the live sketch and full selection before execution; native dimension dialogs retain their normal units and command safeguards.</w:t>
+      </w:r>
+    </w:p>
+    <w:p>
+      <w:pPr>
+        <w:keepLines w:val="1"/>
+        <w:rPr/>
+      </w:pPr>
+      <w:r>
+        <w:t>Contextual Constraint Palette: Mixed construction selections become all normal, then all construction. Uniform selections toggle together. Dimension states are separate from construction flags. Dimension conversion validates all inputs, applies one native batch and solves once, as one undoable change. Preserve constraint order, names, identities, values and expressions. Making an expression-driven dimension reference is disabled because native conversion would remove its expression; the user must explicitly remove that expression first. Native external-only driving restrictions remain in force.</w:t>
+      </w:r>
+    </w:p>
+    <w:p>
+      <w:pPr>
+        <w:keepLines w:val="1"/>
+        <w:rPr/>
+      </w:pPr>
+      <w:r>
+        <w:t>Contextual Constraint Palette: Make Driving is allowed even when the solver reports a conflict or invalid sketch. Commit that converted state, retain the native diagnostic, and allow one Undo of the whole batch. An API/input failure aborts the batch; it is not a committed invalid solve. Other invalid constraint additions abort normally. Persistent Selection on retains native surviving selections and updates the palette in place. Off clears selection and closes the palette after success. Escape and empty-space clicks clear selection and close it in either state. Clean up on sketch exit, document close, deletion and task/mode changes. No repair feature is introduced here.</w:t>
+      </w:r>
+    </w:p>
+    <w:p>
+      <w:pPr>
+        <w:keepLines w:val="1"/>
+        <w:rPr/>
+      </w:pPr>
+      <w:r>
+        <w:t>Layers and contextual palette validation: source-overlay regression checks use real native document transactions, Sketcher constraints, Coin geometry gates and Qt controls. The new native cloned-solver diagnostic, atomic driving batch and Selection gate changes require the final grouped rebuild in workload prompt 10. No new owner payload or physical acceptance is claimed here. The packaged DOCX renderer currently lacks LibreOffice; affected-page rendering remains a delivery gate recorded in WORK_STATE.</w:t>
+      </w:r>
+    </w:p>
+    <w:p>
+      <w:pPr>
+        <w:keepLines w:val="1"/>
+        <w:rPr/>
+      </w:pPr>
+      <w:r>
+        <w:t>Move Components: Move Components opens one Tasks panel from Design Assembly or the Part Tree instance context menu. It moves whole linked component instances and their descendants. Models, permanent master/root contexts and geometry subelements are not movable instances. Copy remains a separate Part Tree operation. The first field is Workflow, ordered Translate, Rotate, Point to Point, Align Axes, Align Coordinate Systems, Interactive. Prompt 4 implements Translate; the other entries explain that their subsequent queued implementation is pending.</w:t>
+      </w:r>
+    </w:p>
+    <w:p>
+      <w:pPr>
+        <w:keepLines w:val="1"/>
+        <w:rPr/>
+      </w:pPr>
+      <w:r>
+        <w:t>Move Components: The next control is the Components list, using the existing add-selection, Remove/Delete and Clear collector conventions. The first valid batch establishes the immediate parent definition and its exact displayed occurrence path as the active editing context. Only direct siblings under that same displayed parent are accepted; mixed batches are rejected in full with inline explanation. Descendants are implicit and receive no second placement change. Clearing the list retains the parent context. Ordinary component clicks outside the task do not activate parents. External parent definitions must be opened in their owning file.</w:t>
+      </w:r>
+    </w:p>
+    <w:p>
+      <w:pPr>
+        <w:keepLines w:val="1"/>
+        <w:rPr/>
+      </w:pPr>
+      <w:r>
+        <w:t>Move Components: A parent definition owns its children's relative LinkPlacement values. Moving children changes them in every occurrence of that parent, including its standalone component tab. Preserve the selected parent occurrence path for reference conversion; do not create a display-path placement override, reparent links, copy definitions or change source shapes/history. The task displays this shared-parent consequence. Driven, read-only, grounded and relationship-owned instances are refused, including native assembly joint references that traverse a root plus a deep subpath.</w:t>
+      </w:r>
+    </w:p>
+    <w:p>
+      <w:pPr>
+        <w:keepLines w:val="1"/>
+        <w:rPr/>
+      </w:pPr>
+      <w:r>
+        <w:t>Move Components: Translate uses one normalized direction, one nonnegative unit-aware Distance and a Reverse toggle, initially direction unset, zero length and Reverse off. Directions are Parent X, Parent Y, Parent Z or a picked straight edge, line/reference axis from visible geometry. Picked occurrence/world vectors transform by the inverse parent rotation only; parent translation does not affect a direction. Reject curved, undefined, zero or ambiguous bare shared references. Snapshot the direction without adding associative dependencies. All selected siblings receive the same parent-frame rigid transform. Reverse changes sign while retaining Distance.</w:t>
+      </w:r>
+    </w:p>
+    <w:p>
+      <w:pPr>
+        <w:keepLines w:val="1"/>
+        <w:rPr/>
+      </w:pPr>
+      <w:r>
+        <w:t>Move Components: Teal, non-pickable geometry previews intended placements without writing document properties or creating document objects/undo records. Show the effects in every displayed occurrence of the shared parent, using each occurrence's native frame. Apply commits all siblings in one transaction and keeps the panel open. It resets Direction, Distance and Reverse; Persistent Selection on retains the list/highlights, off clears both. No-op Apply creates no undo record. OK applies a valid nonzero pending move and closes; after Apply it simply closes. Cancel discards only the pending preview, retaining earlier Apply transactions for Undo. Switching workflows discards uncommitted parameters/preview while retaining siblings and parent context.</w:t>
+      </w:r>
+    </w:p>
+    <w:p>
+      <w:pPr>
+        <w:keepLines w:val="1"/>
+        <w:rPr/>
+      </w:pPr>
+      <w:r>
+        <w:t>Move Components: Errors remain inline in the task. A changed parent or selected placement invalidates the pending preview and requires Reset movement inputs; stale placements are never silently applied. Selection changes and removals reset movement inputs. Close the task and release observers/preview on document or component-view exit; deleted instances leave the list, and deletion of the parent context closes the task. The remaining five workflows and native/packaged acceptance are required before owner delivery; WORK_STATE records source-overlay evidence and DOCX rendering status.</w:t>
+      </w:r>
+    </w:p>
+    <w:p>
+      <w:pPr>
+        <w:keepLines w:val="1"/>
+        <w:rPr/>
+      </w:pPr>
+      <w:r>
+        <w:t>Move Components: Rotate uses Parent X/Y/Z through the parent origin, a picked straight line with its location and direction, or two distinct points. An optional picked pivot relocates a parallel axis. Vertex, native sketch/reference point, origin and analytic circle center picks retain their displayed occurrence transforms. Angle is a finite magnitude from 0 to 360 degrees; positive follows the right-hand rule and Reverse negates it. Rotate applies one common rigid delta to sibling positions and orientations. The transient preview labels the parent-frame pivot, positive axis and signed angle. Apply clears axis, pivot and angle and turns Reverse off. The recovered October 4 Rotate implementation and eight updated tests are retained; the replacement host has no built Plus runtime yet, so rerun, packaged acceptance and DOCX visual review remain pending in the grouped delivery gate.
+</w:t>
+      </w:r>
+    </w:p>
+    <w:p>
+      <w:pPr>
+        <w:keepLines w:val="1"/>
+        <w:rPr/>
+      </w:pPr>
+      <w:r>
+        <w:t>Move Components: Point to Point snapshots a Source and Destination vertex, sketch/reference point, origin or analytic circle center from any visible displayed occurrence. The Source need not belong to the moved group. Convert both to the active parent frame and translate every sibling by Destination minus Source, preserving orientations, group spacing and descendants. Show labeled points and distance with transient markers/vector; no joints, constraints or lasting references are created. Coincident points create no undo entry. Missing, invalid or deleted references prevent Apply. Apply clears both point inputs; selection follows Persistent. Reset/method switch/Cancel remove pending preview. Source preparation includes native regression cases; their execution and packaged acceptance remain pending the grouped build.
+</w:t>
+      </w:r>
+    </w:p>
+    <w:p>
+      <w:pPr>
+        <w:keepLines w:val="1"/>
+        <w:rPr/>
+      </w:pPr>
+      <w:r>
+        <w:t>Move Components: Align Axes snapshots Source and Target straight/reference axes, analytic circular axes or cylindrical-face axes through exact displayed occurrences. Default Make Coincident uses minimal-angle rotation and maps the Source anchor to its closest point on the Target axis; Make Parallel rotates about and retains the Source anchor. Reverse Target Direction explicitly negates Target. Opposite directions use Source cross the least-aligned parent X/Y/Z basis, with X winning ties, for a stable 180-degree rotation. Show resolved Source/Target direction arrows and transformed Source; all siblings receive one rigid parent-frame delta. Apply clears picks and restores Coincident/Reverse-off defaults. No joints, associations or arbitrary axial slide. Five native regression cases are prepared; execution remains pending the grouped build. Rotate, Point to Point and Align Axes now supersede the earlier Translate-only source-preparation status, without claiming native or owner acceptance.
+</w:t>
+      </w:r>
+    </w:p>
+    <w:p>
+      <w:pPr>
+        <w:keepLines w:val="1"/>
+        <w:rPr/>
+      </w:pPr>
+      <w:r>
+        <w:t>Move Components: Align Coordinate Systems maps a complete Source rigid frame to a complete Target frame, including origin and roll, with one Target times inverse Source delta shared by siblings. Pick existing native component origins/datums, explicitly choose Parent, or expand Origin/Z/X definitions. Normalize Z, project X perpendicular to Z and derive right-handed Y. Reject zero/parallel directions and scaled, sheared, reflected or nonfinite frames. Show Source/Target triads and origins, without exposing matrices. Picks snapshot displayed occurrences against unchanged geometry; Apply clears definitions and references, and Cancel removes only pending preview. Four native regression cases are prepared; execution, GUI and document visual review remain pending the grouped build.
+</w:t>
+      </w:r>
+    </w:p>
+    <w:p>
+      <w:pPr>
+        <w:keepLines w:val="1"/>
+        <w:rPr/>
+      </w:pPr>
+      <w:r>
+        <w:t>Move Components: Interactive uses the existing native translation arrows, plane handles and rotation rings, aligned initially to the active parent. Default pivot is the selected group parent-frame bounds center, with mean selected origins as the nongraphic fallback. Separate Move Components from Edit Pivot; relocating/orienting the command-local pivot never changes geometry or adds Undo. Point, origin, circle-center and edge-midpoint picking, explicit axis/frame orientation and Reset Pivot are available. Gestures compose against unchanged placements and mouse release retains preview. Apply atomically commits siblings, clears movement/pivot inputs and restores the default pivot for retained selection, or removes handles when Persistent is off. Escape during drag restores that gesture baseline and releases capture before broader selection handling. Numeric active-handle gestures and explicit distance/angle snapping are available; snapping defaults off. Task/method/mode/document exit removes capture, callbacks and handles. Four native regression cases including rendered handle mouse/Escape events are prepared but not yet executed; native build, packaged GUI and DOCX visual acceptance remain required.
+</w:t>
       </w:r>
     </w:p>
     <w:sectPr>

</xml_diff>

<commit_message>
Reconcile Move reset guidance and recovered document renderer status
Keep task guidance specific to each method and remove obsolete Translate-only/renderer-missing statements from the owner requirements. Record exact source publication and the isolated renderer/configuration evidence. Native and packaged acceptance remain pending.
</commit_message>
<xml_diff>
--- a/ai-instructions/ui/FreeCAD Plus UI & UX.docx
+++ b/ai-instructions/ui/FreeCAD Plus UI & UX.docx
@@ -46345,7 +46345,7 @@
         <w:rPr/>
       </w:pPr>
       <w:r>
-        <w:t>Layers and contextual palette validation: source-overlay regression checks use real native document transactions, Sketcher constraints, Coin geometry gates and Qt controls. The new native cloned-solver diagnostic, atomic driving batch and Selection gate changes require the final grouped rebuild in workload prompt 10. No new owner payload or physical acceptance is claimed here. The packaged DOCX renderer currently lacks LibreOffice; affected-page rendering remains a delivery gate recorded in WORK_STATE.</w:t>
+        <w:t>Layers and contextual palette validation: source-overlay regression checks use real native document transactions, Sketcher constraints, Coin geometry gates and Qt controls. The new native cloned-solver diagnostic, atomic driving batch and Selection gate changes require the final grouped rebuild in workload prompt 10. No new owner payload or physical acceptance is claimed here. The October 6 recovery provides an isolated bundled LibreOffice renderer. Affected-page visual review and native/packaged delivery evidence are recorded in WORK_STATE.</w:t>
       </w:r>
     </w:p>
     <w:p>
@@ -46354,7 +46354,7 @@
         <w:rPr/>
       </w:pPr>
       <w:r>
-        <w:t>Move Components: Move Components opens one Tasks panel from Design Assembly or the Part Tree instance context menu. It moves whole linked component instances and their descendants. Models, permanent master/root contexts and geometry subelements are not movable instances. Copy remains a separate Part Tree operation. The first field is Workflow, ordered Translate, Rotate, Point to Point, Align Axes, Align Coordinate Systems, Interactive. Prompt 4 implements Translate; the other entries explain that their subsequent queued implementation is pending.</w:t>
+        <w:t>Move Components: Move Components opens one Tasks panel from Design Assembly or the Part Tree instance context menu. It moves whole linked component instances and their descendants. Models, permanent master/root contexts and geometry subelements are not movable instances. Copy remains a separate Part Tree operation. The first field is Workflow, ordered Translate, Rotate, Point to Point, Align Axes, Align Coordinate Systems, Interactive. All six workflows are prepared in source; grouped native and packaged acceptance remain required before owner delivery.</w:t>
       </w:r>
     </w:p>
     <w:p>
@@ -46399,7 +46399,7 @@
         <w:rPr/>
       </w:pPr>
       <w:r>
-        <w:t>Move Components: Errors remain inline in the task. A changed parent or selected placement invalidates the pending preview and requires Reset movement inputs; stale placements are never silently applied. Selection changes and removals reset movement inputs. Close the task and release observers/preview on document or component-view exit; deleted instances leave the list, and deletion of the parent context closes the task. The remaining five workflows and native/packaged acceptance are required before owner delivery; WORK_STATE records source-overlay evidence and DOCX rendering status.</w:t>
+        <w:t>Move Components: Errors remain inline in the task. A changed parent or selected placement invalidates the pending preview and requires Reset movement inputs; stale placements are never silently applied. Selection changes and removals reset movement inputs. Close the task and release observers/preview on document or component-view exit; deleted instances leave the list, and deletion of the parent context closes the task. All six workflows require native/packaged acceptance before owner delivery; WORK_STATE records source-overlay evidence and DOCX rendering status.</w:t>
       </w:r>
     </w:p>
     <w:p>
@@ -46408,7 +46408,7 @@
         <w:rPr/>
       </w:pPr>
       <w:r>
-        <w:t>Move Components: Rotate uses Parent X/Y/Z through the parent origin, a picked straight line with its location and direction, or two distinct points. An optional picked pivot relocates a parallel axis. Vertex, native sketch/reference point, origin and analytic circle center picks retain their displayed occurrence transforms. Angle is a finite magnitude from 0 to 360 degrees; positive follows the right-hand rule and Reverse negates it. Rotate applies one common rigid delta to sibling positions and orientations. The transient preview labels the parent-frame pivot, positive axis and signed angle. Apply clears axis, pivot and angle and turns Reverse off. The recovered October 4 Rotate implementation and eight updated tests are retained; the replacement host has no built Plus runtime yet, so rerun, packaged acceptance and DOCX visual review remain pending in the grouped delivery gate.
+        <w:t>Move Components: Rotate uses Parent X/Y/Z through the parent origin, a picked straight line with its location and direction, or two distinct points. An optional picked pivot relocates a parallel axis. Vertex, native sketch/reference point, origin and analytic circle center picks retain their displayed occurrence transforms. Angle is a finite magnitude from 0 to 360 degrees; positive follows the right-hand rule and Reverse negates it. Rotate applies one common rigid delta to sibling positions and orientations. The transient preview labels the parent-frame pivot, positive axis and signed angle. Apply clears axis, pivot and angle and turns Reverse off. The recovered October 4 Rotate implementation and eight updated tests are retained; the replacement host has no built Plus runtime yet, so rerun and packaged acceptance remain pending in the grouped delivery gate.
 </w:t>
       </w:r>
     </w:p>
@@ -46438,7 +46438,7 @@
         <w:rPr/>
       </w:pPr>
       <w:r>
-        <w:t>Move Components: Align Coordinate Systems maps a complete Source rigid frame to a complete Target frame, including origin and roll, with one Target times inverse Source delta shared by siblings. Pick existing native component origins/datums, explicitly choose Parent, or expand Origin/Z/X definitions. Normalize Z, project X perpendicular to Z and derive right-handed Y. Reject zero/parallel directions and scaled, sheared, reflected or nonfinite frames. Show Source/Target triads and origins, without exposing matrices. Picks snapshot displayed occurrences against unchanged geometry; Apply clears definitions and references, and Cancel removes only pending preview. Four native regression cases are prepared; execution, GUI and document visual review remain pending the grouped build.
+        <w:t>Move Components: Align Coordinate Systems maps a complete Source rigid frame to a complete Target frame, including origin and roll, with one Target times inverse Source delta shared by siblings. Pick existing native component origins/datums, explicitly choose Parent, or expand Origin/Z/X definitions. Normalize Z, project X perpendicular to Z and derive right-handed Y. Reject zero/parallel directions and scaled, sheared, reflected or nonfinite frames. Show Source/Target triads and origins, without exposing matrices. Picks snapshot displayed occurrences against unchanged geometry; Apply clears definitions and references, and Cancel removes only pending preview. Four native regression cases are prepared; execution and GUI acceptance remain pending the grouped build.
 </w:t>
       </w:r>
     </w:p>
@@ -46448,7 +46448,7 @@
         <w:rPr/>
       </w:pPr>
       <w:r>
-        <w:t>Move Components: Interactive uses the existing native translation arrows, plane handles and rotation rings, aligned initially to the active parent. Default pivot is the selected group parent-frame bounds center, with mean selected origins as the nongraphic fallback. Separate Move Components from Edit Pivot; relocating/orienting the command-local pivot never changes geometry or adds Undo. Point, origin, circle-center and edge-midpoint picking, explicit axis/frame orientation and Reset Pivot are available. Gestures compose against unchanged placements and mouse release retains preview. Apply atomically commits siblings, clears movement/pivot inputs and restores the default pivot for retained selection, or removes handles when Persistent is off. Escape during drag restores that gesture baseline and releases capture before broader selection handling. Numeric active-handle gestures and explicit distance/angle snapping are available; snapping defaults off. Task/method/mode/document exit removes capture, callbacks and handles. Four native regression cases including rendered handle mouse/Escape events are prepared but not yet executed; native build, packaged GUI and DOCX visual acceptance remain required.
+        <w:t>Move Components: Interactive uses the existing native translation arrows, plane handles and rotation rings, aligned initially to the active parent. Default pivot is the selected group parent-frame bounds center, with mean selected origins as the nongraphic fallback. Separate Move Components from Edit Pivot; relocating/orienting the command-local pivot never changes geometry or adds Undo. Point, origin, circle-center and edge-midpoint picking, explicit axis/frame orientation and Reset Pivot are available. Gestures compose against unchanged placements and mouse release retains preview. Apply atomically commits siblings, clears movement/pivot inputs and restores the default pivot for retained selection, or removes handles when Persistent is off. Escape during drag restores that gesture baseline and releases capture before broader selection handling. Numeric active-handle gestures and explicit distance/angle snapping are available; snapping defaults off. Task/method/mode/document exit removes capture, callbacks and handles. Four native regression cases including rendered handle mouse/Escape events are prepared but not yet executed; native build and packaged GUI acceptance remain required.
 </w:t>
       </w:r>
     </w:p>

</xml_diff>

<commit_message>
Fix native selection paths and Move task lifecycle acceptance
</commit_message>
<xml_diff>
--- a/ai-instructions/ui/FreeCAD Plus UI & UX.docx
+++ b/ai-instructions/ui/FreeCAD Plus UI & UX.docx
@@ -46449,6 +46449,16 @@
       </w:pPr>
       <w:r>
         <w:t>Move Components: Interactive uses the existing native translation arrows, plane handles and rotation rings, aligned initially to the active parent. Default pivot is the selected group parent-frame bounds center, with mean selected origins as the nongraphic fallback. Separate Move Components from Edit Pivot; relocating/orienting the command-local pivot never changes geometry or adds Undo. Point, origin, circle-center and edge-midpoint picking, explicit axis/frame orientation and Reset Pivot are available. Gestures compose against unchanged placements and mouse release retains preview. Apply atomically commits siblings, clears movement/pivot inputs and restores the default pivot for retained selection, or removes handles when Persistent is off. Escape during drag restores that gesture baseline and releases capture before broader selection handling. Numeric active-handle gestures and explicit distance/angle snapping are available; snapping defaults off. Task/method/mode/document exit removes capture, callbacks and handles. Four native regression cases including rendered handle mouse/Escape events are prepared but not yet executed; native build and packaged GUI acceptance remain required.
+</w:t>
+      </w:r>
+    </w:p>
+    <w:p>
+      <w:pPr>
+        <w:keepLines w:val="1"/>
+        <w:rPr/>
+      </w:pPr>
+      <w:r>
+        <w:t>Move Components: October 6 native acceptance repairs retain exact parent-owned sibling placements and the approved six workflows. Native mapped sketch tokens resolve to their owning occurrence before Connected/Tangent expansion. Bare component frames resolve through the displayed native Origin and scaled links fail rigid-frame validation. Interactive numeric controls validate only the active arrow/plane/ring inputs; pivot pick/reset changes cancel superseded guards. Native dialog auto-close on owning-document deletion cleans observers, preview and handles without late document lookup. Focused installed native evidence passes Selection 18/18, Interactive 5/5, palette 14/14 and integration 5/5 with real viewport and handle events, no overlays or skips. The grouped native build succeeded; full rerun, graphics capture diagnosis, packaged/high-DPI checks and actual desktop shortcut launch remain delivery gates in WORK_STATE. Physical owner acceptance remains separate.
 </w:t>
       </w:r>
     </w:p>

</xml_diff>

<commit_message>
Render Qt framebuffer captures synchronously for native GUI acceptance
</commit_message>
<xml_diff>
--- a/ai-instructions/ui/FreeCAD Plus UI & UX.docx
+++ b/ai-instructions/ui/FreeCAD Plus UI & UX.docx
@@ -46459,6 +46459,16 @@
       </w:pPr>
       <w:r>
         <w:t>Move Components: October 6 native acceptance repairs retain exact parent-owned sibling placements and the approved six workflows. Native mapped sketch tokens resolve to their owning occurrence before Connected/Tangent expansion. Bare component frames resolve through the displayed native Origin and scaled links fail rigid-frame validation. Interactive numeric controls validate only the active arrow/plane/ring inputs; pivot pick/reset changes cancel superseded guards. Native dialog auto-close on owning-document deletion cleans observers, preview and handles without late document lookup. Focused installed native evidence passes Selection 18/18, Interactive 5/5, palette 14/14 and integration 5/5 with real viewport and handle events, no overlays or skips. The grouped native build succeeded; full rerun, graphics capture diagnosis, packaged/high-DPI checks and actual desktop shortcut launch remain delivery gates in WORK_STATE. Physical owner acceptance remains separate.
+</w:t>
+      </w:r>
+    </w:p>
+    <w:p>
+      <w:pPr>
+        <w:keepLines w:val="1"/>
+        <w:rPr/>
+      </w:pPr>
+      <w:r>
+        <w:t>Move Components: native visual acceptance requires a fully rendered live Qt framebuffer, including handles and overlays. The inherited deferred-redraw limiter left capture framebuffers unpainted; native paintGL now renders these synchronously while ordinary viewport requests keep their frame-rate limit. Automatic-redraw state is restored on exit. The seven native integration checks pass, including live opaque-face pixels, actual Design Assembly tab/button events, the Part Tree Move action, six compact tasks, outside-parent picks, external-parent enforcement and document lifecycle cleanup. The repaired screenshot is visually verified. Full grouped native and packaged/high-DPI reruns and saved desktop shortcut launch remain pending; WORK_STATE records exact logs and runtime identities. No placement, geometry, ownership, selection default or physical acceptance contract changes.
 </w:t>
       </w:r>
     </w:p>

</xml_diff>

<commit_message>
fix: reconcile recovery integration and guard deferred Escape selection clearing
</commit_message>
<xml_diff>
--- a/ai-instructions/ui/FreeCAD Plus UI & UX.docx
+++ b/ai-instructions/ui/FreeCAD Plus UI & UX.docx
@@ -46470,6 +46470,15 @@
       <w:r>
         <w:t>Move Components: native visual acceptance requires a fully rendered live Qt framebuffer, including handles and overlays. The inherited deferred-redraw limiter left capture framebuffers unpainted; native paintGL now renders these synchronously while ordinary viewport requests keep their frame-rate limit. Automatic-redraw state is restored on exit. The seven native integration checks pass, including live opaque-face pixels, actual Design Assembly tab/button events, the Part Tree Move action, six compact tasks, outside-parent picks, external-parent enforcement and document lifecycle cleanup. The repaired screenshot is visually verified. Full grouped native and packaged/high-DPI reruns and saved desktop shortcut launch remain pending; WORK_STATE records exact logs and runtime identities. No placement, geometry, ownership, selection default or physical acceptance contract changes.
 </w:t>
+      </w:r>
+    </w:p>
+    <w:p>
+      <w:pPr>
+        <w:keepLines w:val="1"/>
+        <w:rPr/>
+      </w:pPr>
+      <w:r>
+        <w:t>Recovery item 6 integration reconciliation retains Selection, Layers, Contextual Constraint Palette and all six Move workflows. Deferred Escape clearing checks the originating event generation, active Design lifecycle and document again inside the final queued callback; native cancellation remains unconsumed and a later click must survive. Sketcher diagnostics clone geometry/constraints, while committed-invalid driving batches retain their converted state for Undo. Layer metadata and visibility gates preserve independent input sketches, identities and geometry. The existing native build and earlier packaged 88-check evidence remain historical to their source/test snapshots. Current quick checks pass eight Python syntax checks and four controlled deferred-callback orderings; these do not establish Qt/native runtime acceptance. Recovery item 7 must run the updated 89-check full suite and 55-check high-DPI subset, real handle/collector events, Undo/Redo/save/reopen, final DOCX review and verified desktop shortcut launch. No new build or owner delivery is claimed by item 6; the deferred feature families remain deferred.</w:t>
       </w:r>
     </w:p>
     <w:sectPr>

</xml_diff>

<commit_message>
test: validate unambiguous native picks and fractional-DPI handle event fixtures
</commit_message>
<xml_diff>
--- a/ai-instructions/ui/FreeCAD Plus UI & UX.docx
+++ b/ai-instructions/ui/FreeCAD Plus UI & UX.docx
@@ -46479,6 +46479,15 @@
       </w:pPr>
       <w:r>
         <w:t>Recovery item 6 integration reconciliation retains Selection, Layers, Contextual Constraint Palette and all six Move workflows. Deferred Escape clearing checks the originating event generation, active Design lifecycle and document again inside the final queued callback; native cancellation remains unconsumed and a later click must survive. Sketcher diagnostics clone geometry/constraints, while committed-invalid driving batches retain their converted state for Undo. Layer metadata and visibility gates preserve independent input sketches, identities and geometry. The existing native build and earlier packaged 88-check evidence remain historical to their source/test snapshots. Current quick checks pass eight Python syntax checks and four controlled deferred-callback orderings; these do not establish Qt/native runtime acceptance. Recovery item 7 must run the updated 89-check full suite and 55-check high-DPI subset, real handle/collector events, Undo/Redo/save/reopen, final DOCX review and verified desktop shortcut launch. No new build or owner delivery is claimed by item 6; the deferred feature families remain deferred.</w:t>
+      </w:r>
+    </w:p>
+    <w:p>
+      <w:pPr>
+        <w:keepLines w:val="1"/>
+        <w:rPr/>
+      </w:pPr>
+      <w:r>
+        <w:t>Recovery item 7 native fixture reconciliation: the Selection click fixture uses geometry away from the overlapping sketch H-axis, refreshes actual hover and separates independent single-click cases. Native handle fixtures use the actual renderer viewport and a zero-tolerance interior patch of each handle, preserve the real cursor/motion stream and separate single drags. They do not substitute placement or pivot writes for interaction. Selection passes 19 checks; Interactive passes five, including axis/plane/ring and Edit Pivot events, Escape, retained release preview, camera navigation, Apply/OK reset, Undo/Redo and FCStd/cadprt sibling/descendant round trips. Unsuccessful finish/cancellation hypotheses and diagnostic application instrumentation were removed; the retained application behavior is unchanged by these fixture repairs. Full combined 89-check, 55-check high-DPI and saved desktop shortcut delivery gates remain pending this final item.</w:t>
       </w:r>
     </w:p>
     <w:sectPr>

</xml_diff>

<commit_message>
Finish grouped native acceptance and owner test-build delivery
</commit_message>
<xml_diff>
--- a/ai-instructions/ui/FreeCAD Plus UI & UX.docx
+++ b/ai-instructions/ui/FreeCAD Plus UI & UX.docx
@@ -46264,7 +46264,7 @@
         <w:rPr/>
       </w:pPr>
       <w:r>
-        <w:t>Selection toolbar validation: Python policy and toolbar checks run against the existing Plus runtime with explicit source overlays. Native selection-gate, Sketcher command, directional-box and pointer-path acceptance require the grouped native rebuild in the final authorized workload prompt. This source preparation is not a new owner build or a claim of physical acceptance. WORK_STATE records exact checks, documentation review and pending delivery gates.</w:t>
+        <w:t>Selection toolbar validation: final October 6 packaged acceptance passes all 19 selection checks on this fork, without application source overlays. Actual native viewport picks, connected/tangent modes, directional boxes, taxonomy, command persistence, Escape and empty-space events are tested at system DPR 1.5 and DPR 3.0. Escape also clears the late native parent reselection after edit teardown; the originating document, active Design lifecycle and event generation guard every deferred checkpoint. A later viewport, tree, palette or control click supersedes that clear. Physical owner feedback remains separate; WORK_STATE records exact evidence.</w:t>
       </w:r>
     </w:p>
     <w:p>
@@ -46345,7 +46345,7 @@
         <w:rPr/>
       </w:pPr>
       <w:r>
-        <w:t>Layers and contextual palette validation: source-overlay regression checks use real native document transactions, Sketcher constraints, Coin geometry gates and Qt controls. The new native cloned-solver diagnostic, atomic driving batch and Selection gate changes require the final grouped rebuild in workload prompt 10. No new owner payload or physical acceptance is claimed here. The October 6 recovery provides an isolated bundled LibreOffice renderer. Affected-page visual review and native/packaged delivery evidence are recorded in WORK_STATE.</w:t>
+        <w:t>Layers and contextual palette validation: final October 6 packaged acceptance passes ten Layers and fourteen contextual palette checks on the grouped native fork at system DPR 1.5 and DPR 3.0, without application source overlays. Tests cover metadata/history and independent input sketches, real pointer/corridor timing, compact placement, disabled tooltips, Equal/Construction persistence, native cloned-solver diagnostics, atomic driving/reference batches and committed-invalid driving Undo. The owner DOCX is synchronized, rendered and reviewed. Exact runtime identities, grouped build and desktop launch delivery evidence are recorded in WORK_STATE. Physical owner feedback remains separate.</w:t>
       </w:r>
     </w:p>
     <w:p>
@@ -46354,7 +46354,7 @@
         <w:rPr/>
       </w:pPr>
       <w:r>
-        <w:t>Move Components: Move Components opens one Tasks panel from Design Assembly or the Part Tree instance context menu. It moves whole linked component instances and their descendants. Models, permanent master/root contexts and geometry subelements are not movable instances. Copy remains a separate Part Tree operation. The first field is Workflow, ordered Translate, Rotate, Point to Point, Align Axes, Align Coordinate Systems, Interactive. All six workflows are prepared in source; grouped native and packaged acceptance remain required before owner delivery.</w:t>
+        <w:t>Move Components: Move Components opens one Tasks panel from Design Assembly or the Part Tree instance context menu. It moves whole linked component instances and their descendants. Models, permanent master/root contexts and geometry subelements are not movable instances. Copy remains a separate Part Tree operation. The first field is Workflow, ordered Translate, Rotate, Point to Point, Align Axes, Align Coordinate Systems, Interactive. All six workflows pass final October 6 grouped native and packaged acceptance. Exact test-build and desktop shortcut launch delivery evidence is recorded in WORK_STATE; physical owner feedback remains separate.</w:t>
       </w:r>
     </w:p>
     <w:p>
@@ -46408,7 +46408,16 @@
         <w:rPr/>
       </w:pPr>
       <w:r>
-        <w:t>Move Components: Rotate uses Parent X/Y/Z through the parent origin, a picked straight line with its location and direction, or two distinct points. An optional picked pivot relocates a parallel axis. Vertex, native sketch/reference point, origin and analytic circle center picks retain their displayed occurrence transforms. Angle is a finite magnitude from 0 to 360 degrees; positive follows the right-hand rule and Reverse negates it. Rotate applies one common rigid delta to sibling positions and orientations. The transient preview labels the parent-frame pivot, positive axis and signed angle. Apply clears axis, pivot and angle and turns Reverse off. The recovered Rotate implementation and eight updated tests are retained. October 6 native and packaged Plus runs pass all eight Rotate and twelve Translate checks, including Undo/Redo and FCStd/cadprt reopen; installed Rotate task captures are visually reviewed. Recovery item 1 is complete. The owner now requires separate follow-up prompts for items 2–7; final grouped build delivery and desktop shortcut verification remain pending.
+        <w:t>Move Components: Rotate uses Parent X/Y/Z through the parent origin, a picked straight line with its location and direction, or two distinct points. An optional picked pivot relocates a parallel axis. Vertex, native sketch/reference point, origin and analytic circle center picks retain their displayed occurrence transforms. Angle is a finite magnitude from 0 to 360 degrees; positive follows the right-hand rule and Reverse negates it. Rotate applies one common rigid delta to sibling positions and orientations. The transient preview labels the parent-frame pivot, positive axis and signed angle. Apply clears axis, pivot and angle and turns Reverse off. The recovered Rotate implementation and eight updated tests are retained. October 6 native and packaged Plus runs pass all eight Rotate and twelve Translate checks, including Undo/Redo and FCStd/cadprt reopen; installed Rotate task captures are visually reviewed. Recovery item 1 is complete. Recovery items were executed through separate owner prompts; final grouped native/packaged acceptance and saved desktop shortcut launch pass in item 7. Physical owner feedback remains separate.</w:t>
+      </w:r>
+    </w:p>
+    <w:p>
+      <w:pPr>
+        <w:keepLines w:val="1"/>
+        <w:rPr/>
+      </w:pPr>
+      <w:r>
+        <w:t>Move Components: Point to Point snapshots a Source and Destination vertex, sketch/reference point, origin or analytic circle center from any visible displayed occurrence. The Source need not belong to the moved group. Convert both to the active parent frame and translate every sibling by Destination minus Source, preserving orientations, group spacing and descendants. Show labeled points and distance with transient markers/vector; no joints, constraints or lasting references are created. Coincident points create no undo entry. Missing, invalid or deleted references prevent Apply. Apply clears both point inputs; selection follows Persistent. Reset/method switch/Cancel remove pending preview. All four cases pass final native packaged acceptance, including no-op, reference conversion, Undo/Redo and save/reopen. Final grouped build and saved desktop shortcut launch pass; physical owner feedback remains separate.
 </w:t>
       </w:r>
     </w:p>
@@ -46418,7 +46427,43 @@
         <w:rPr/>
       </w:pPr>
       <w:r>
-        <w:t>Move Components: Point to Point snapshots a Source and Destination vertex, sketch/reference point, origin or analytic circle center from any visible displayed occurrence. The Source need not belong to the moved group. Convert both to the active parent frame and translate every sibling by Destination minus Source, preserving orientations, group spacing and descendants. Show labeled points and distance with transient markers/vector; no joints, constraints or lasting references are created. Coincident points create no undo entry. Missing, invalid or deleted references prevent Apply. Apply clears both point inputs; selection follows Persistent. Reset/method switch/Cancel remove pending preview. Source preparation includes native regression cases; their execution and packaged acceptance remain pending the grouped build.
+        <w:t>Move Components: Align Axes snapshots Source and Target straight/reference axes, analytic circular axes or cylindrical-face axes through exact displayed occurrences. Default Make Coincident uses minimal-angle rotation and maps the Source anchor to its closest point on the Target axis; Make Parallel rotates about and retains the Source anchor. Reverse Target Direction explicitly negates Target. Opposite directions use Source cross the least-aligned parent X/Y/Z basis, with X winning ties, for a stable 180-degree rotation. Show resolved Source/Target direction arrows and transformed Source; all siblings receive one rigid parent-frame delta. Apply clears picks and restores Coincident/Reverse-off defaults. No joints, associations or arbitrary axial slide. The earlier packaged Plus run passes five native regression cases. The separate item 3 review strengthens those cases with parallel/coincident no-op, deterministic antiparallel roll, repeated baseline previews and FCStd/cadprt placement round trips. These strengthened assertions pass all five native packaged cases in final recovery item 7, including shared occurrence updates, parent-owned sibling/descendant persistence and Undo/Redo. Grouped build, DOCX visual review and saved desktop shortcut launch pass; physical owner feedback remains separate.</w:t>
+      </w:r>
+    </w:p>
+    <w:p>
+      <w:pPr>
+        <w:keepLines w:val="1"/>
+        <w:rPr/>
+      </w:pPr>
+      <w:r>
+        <w:t>Move Components: Align Coordinate Systems maps a complete Source rigid frame to a complete Target frame, including origin and roll, with one Target times inverse Source delta shared by siblings. Pick existing native component origins/datums, explicitly choose Parent, or expand Origin/Z/X definitions. Normalize Z, project X perpendicular to Z and derive right-handed Y. Reject zero/parallel directions and scaled, sheared, reflected or nonfinite frames. Show Source/Target triads and origins, without exposing matrices. Picks snapshot displayed occurrences against unchanged geometry; Apply clears definitions and references, and Cancel removes only pending preview. The earlier packaged Plus run passes five native regression cases, including full roll alignment, displayed occurrence frames, scale/reflection rejection and native Undo/Redo/save/reopen. Separate recovery item 4 strengthens those cases with repeated baseline previews, both displayed parent orientations, OK-after-Apply non-repetition, sibling/descendant round trips and preview/Cancel preservation. These strengthened assertions pass all five native packaged cases in final recovery item 7, including shared occurrence updates, parent-owned sibling/descendant persistence and Undo/Redo. Grouped build, DOCX visual review and saved desktop shortcut launch pass; physical owner feedback remains separate.</w:t>
+      </w:r>
+    </w:p>
+    <w:p>
+      <w:pPr>
+        <w:keepLines w:val="1"/>
+        <w:rPr/>
+      </w:pPr>
+      <w:r>
+        <w:t>Move Components: Interactive uses the existing native translation arrows, plane handles and rotation rings, aligned initially to the active parent. Default pivot is the selected group parent-frame bounds center, with mean selected origins as the nongraphic fallback. Separate Move Components from Edit Pivot; relocating/orienting the command-local pivot never changes geometry or adds Undo. Point, origin, circle-center and edge-midpoint picking, explicit axis/frame orientation and Reset Pivot are available. Gestures compose against unchanged placements and mouse release retains preview. Apply atomically commits siblings, clears movement/pivot inputs and restores the default pivot for retained selection, or removes handles when Persistent is off. Escape during drag restores that gesture baseline and releases capture before broader selection handling. Numeric active-handle gestures and explicit distance/angle snapping are available; snapping defaults off. Task/method/mode/document exit removes capture, callbacks and handles. The earlier packaged Plus suite passes five native regression cases; the DPR 3.0 focused rerun also passes five, including real mouse drag/release, Escape and pivot-edit events. Its fixture pans only the camera and ray-picks visible unobscured native handles, without writing component placements or pivot state. Separate recovery item 5 adds native plane/ring event checks, default parent-aligned pivot recreation after Apply, OK non-repetition and sibling/descendant Undo/Redo/FCStd/cadprt round trips after actual gestures. The strengthened five-case suite passes final native packaged acceptance at system DPR 1.5 and DPR 3.0, including real axis, plane, ring and movable-pivot events, retained release preview, gesture Escape, camera navigation, Apply/OK reset, sibling/descendant Undo/Redo and FCStd/cadprt round trips. Final DOCX and saved desktop shortcut launch gates pass; physical owner feedback remains separate.</w:t>
+      </w:r>
+    </w:p>
+    <w:p>
+      <w:pPr>
+        <w:keepLines w:val="1"/>
+        <w:rPr/>
+      </w:pPr>
+      <w:r>
+        <w:t>Move Components: October 6 native acceptance repairs retain exact parent-owned sibling placements and the approved six workflows. Native mapped sketch tokens resolve to their owning occurrence before Connected/Tangent expansion. Bare component frames resolve through the displayed native Origin and scaled links fail rigid-frame validation. Interactive numeric controls validate only the active arrow/plane/ring inputs; pivot pick/reset changes cancel superseded guards. Native dialog auto-close on owning-document deletion cleans observers, preview and handles without late document lookup. Focused installed native evidence passes Selection 18/18, Interactive 5/5, palette 14/14 and integration 5/5 with real viewport and handle events, no overlays or skips. The grouped native build and final packaged acceptance pass: 89 full checks, 55 checks at DPR 3.0 and 26 smoke checks launched through the saved desktop shortcut. The native capture repair produces the reviewed opaque framebuffer. WORK_STATE records exact snapshots and payload identities; physical owner feedback remains separate.</w:t>
+      </w:r>
+    </w:p>
+    <w:p>
+      <w:pPr>
+        <w:keepLines w:val="1"/>
+        <w:rPr/>
+      </w:pPr>
+      <w:r>
+        <w:t>Move Components: native visual acceptance requires a fully rendered live Qt framebuffer, including handles and overlays. The inherited deferred-redraw limiter left capture framebuffers unpainted; native paintGL now renders these synchronously while ordinary viewport requests keep their frame-rate limit. Automatic-redraw state is restored on exit. The seven native integration checks pass, including live opaque-face pixels, actual Design Assembly tab/button events, the Part Tree Move action, six compact tasks, outside-parent picks, external-parent enforcement and document lifecycle cleanup. The repaired screenshot is visually verified. Full 89-check packaged, 55-check DPR 3.0 and 26-check saved desktop shortcut launch acceptance pass; WORK_STATE records exact logs and runtime identities. No placement, geometry, ownership, selection default or physical acceptance contract changes.
 </w:t>
       </w:r>
     </w:p>
@@ -46428,8 +46473,7 @@
         <w:rPr/>
       </w:pPr>
       <w:r>
-        <w:t>Move Components: Align Axes snapshots Source and Target straight/reference axes, analytic circular axes or cylindrical-face axes through exact displayed occurrences. Default Make Coincident uses minimal-angle rotation and maps the Source anchor to its closest point on the Target axis; Make Parallel rotates about and retains the Source anchor. Reverse Target Direction explicitly negates Target. Opposite directions use Source cross the least-aligned parent X/Y/Z basis, with X winning ties, for a stable 180-degree rotation. Show resolved Source/Target direction arrows and transformed Source; all siblings receive one rigid parent-frame delta. Apply clears picks and restores Coincident/Reverse-off defaults. No joints, associations or arbitrary axial slide. The earlier packaged Plus run passes five native regression cases. The separate item 3 review strengthens those cases with parallel/coincident no-op, deterministic antiparallel roll, repeated baseline previews and FCStd/cadprt placement round trips; these new assertions have passed syntax checks only and must execute in final recovery item 7. Native/runtime acceptance of the changed tests and final build delivery remain deferred to that prompt. Rotate, Point to Point and Align Axes now supersede the earlier Translate-only source-preparation status, without claiming native or owner acceptance.
-</w:t>
+        <w:t>Recovery item 6 integration reconciliation retains Selection, Layers, Contextual Constraint Palette and all six Move workflows. Deferred Escape clearing checks the originating event generation, active Design lifecycle and document again inside the final queued callback; native cancellation remains unconsumed and a later click must survive. Sketcher diagnostics clone geometry/constraints, while committed-invalid driving batches retain their converted state for Undo. Layer metadata and visibility gates preserve independent input sketches, identities and geometry. The existing native build and earlier packaged 88-check evidence remain historical to their source/test snapshots. Current quick checks pass eight Python syntax checks and four controlled deferred-callback orderings; these do not establish Qt/native runtime acceptance. Recovery item 7 executes the updated 89-check full suite, 55-check DPR 3.0 subset and 26-check saved desktop shortcut smoke, without overlays or skips. Actual handle/collector events, Undo/Redo, both saved formats, lifecycle cleanup, final DOCX review and launch verification pass. Item 6 remains a source milestone; item 7 delivers the grouped incremental test payload. Deferred feature families remain deferred.</w:t>
       </w:r>
     </w:p>
     <w:p>
@@ -46438,56 +46482,7 @@
         <w:rPr/>
       </w:pPr>
       <w:r>
-        <w:t>Move Components: Align Coordinate Systems maps a complete Source rigid frame to a complete Target frame, including origin and roll, with one Target times inverse Source delta shared by siblings. Pick existing native component origins/datums, explicitly choose Parent, or expand Origin/Z/X definitions. Normalize Z, project X perpendicular to Z and derive right-handed Y. Reject zero/parallel directions and scaled, sheared, reflected or nonfinite frames. Show Source/Target triads and origins, without exposing matrices. Picks snapshot displayed occurrences against unchanged geometry; Apply clears definitions and references, and Cancel removes only pending preview. The earlier packaged Plus run passes five native regression cases, including full roll alignment, displayed occurrence frames, scale/reflection rejection and native Undo/Redo/save/reopen. Separate recovery item 4 strengthens those cases with repeated baseline previews, both displayed parent orientations, OK-after-Apply non-repetition, sibling/descendant round trips and preview/Cancel preservation. These new assertions pass syntax checks only; their native/runtime execution and final grouped build/packaged delivery remain deferred to recovery item 7.
-</w:t>
-      </w:r>
-    </w:p>
-    <w:p>
-      <w:pPr>
-        <w:keepLines w:val="1"/>
-        <w:rPr/>
-      </w:pPr>
-      <w:r>
-        <w:t>Move Components: Interactive uses the existing native translation arrows, plane handles and rotation rings, aligned initially to the active parent. Default pivot is the selected group parent-frame bounds center, with mean selected origins as the nongraphic fallback. Separate Move Components from Edit Pivot; relocating/orienting the command-local pivot never changes geometry or adds Undo. Point, origin, circle-center and edge-midpoint picking, explicit axis/frame orientation and Reset Pivot are available. Gestures compose against unchanged placements and mouse release retains preview. Apply atomically commits siblings, clears movement/pivot inputs and restores the default pivot for retained selection, or removes handles when Persistent is off. Escape during drag restores that gesture baseline and releases capture before broader selection handling. Numeric active-handle gestures and explicit distance/angle snapping are available; snapping defaults off. Task/method/mode/document exit removes capture, callbacks and handles. The earlier packaged Plus suite passes five native regression cases; the DPR 3.0 focused rerun also passes five, including real mouse drag/release, Escape and pivot-edit events. Its fixture pans only the camera and ray-picks visible unobscured native handles, without writing component placements or pivot state. Separate recovery item 5 adds native plane/ring event checks, default parent-aligned pivot recreation after Apply, OK non-repetition and sibling/descendant Undo/Redo/FCStd/cadprt round trips after actual gestures. New assertions pass syntax checks only; final native/runtime execution, grouped build/packaged acceptance and shortcut delivery remain deferred to recovery item 7.
-</w:t>
-      </w:r>
-    </w:p>
-    <w:p>
-      <w:pPr>
-        <w:keepLines w:val="1"/>
-        <w:rPr/>
-      </w:pPr>
-      <w:r>
-        <w:t>Move Components: October 6 native acceptance repairs retain exact parent-owned sibling placements and the approved six workflows. Native mapped sketch tokens resolve to their owning occurrence before Connected/Tangent expansion. Bare component frames resolve through the displayed native Origin and scaled links fail rigid-frame validation. Interactive numeric controls validate only the active arrow/plane/ring inputs; pivot pick/reset changes cancel superseded guards. Native dialog auto-close on owning-document deletion cleans observers, preview and handles without late document lookup. Focused installed native evidence passes Selection 18/18, Interactive 5/5, palette 14/14 and integration 5/5 with real viewport and handle events, no overlays or skips. The grouped native build succeeded; full rerun, graphics capture diagnosis, packaged/high-DPI checks and actual desktop shortcut launch remain delivery gates in WORK_STATE. Physical owner acceptance remains separate.
-</w:t>
-      </w:r>
-    </w:p>
-    <w:p>
-      <w:pPr>
-        <w:keepLines w:val="1"/>
-        <w:rPr/>
-      </w:pPr>
-      <w:r>
-        <w:t>Move Components: native visual acceptance requires a fully rendered live Qt framebuffer, including handles and overlays. The inherited deferred-redraw limiter left capture framebuffers unpainted; native paintGL now renders these synchronously while ordinary viewport requests keep their frame-rate limit. Automatic-redraw state is restored on exit. The seven native integration checks pass, including live opaque-face pixels, actual Design Assembly tab/button events, the Part Tree Move action, six compact tasks, outside-parent picks, external-parent enforcement and document lifecycle cleanup. The repaired screenshot is visually verified. Full grouped native and packaged/high-DPI reruns and saved desktop shortcut launch remain pending; WORK_STATE records exact logs and runtime identities. No placement, geometry, ownership, selection default or physical acceptance contract changes.
-</w:t>
-      </w:r>
-    </w:p>
-    <w:p>
-      <w:pPr>
-        <w:keepLines w:val="1"/>
-        <w:rPr/>
-      </w:pPr>
-      <w:r>
-        <w:t>Recovery item 6 integration reconciliation retains Selection, Layers, Contextual Constraint Palette and all six Move workflows. Deferred Escape clearing checks the originating event generation, active Design lifecycle and document again inside the final queued callback; native cancellation remains unconsumed and a later click must survive. Sketcher diagnostics clone geometry/constraints, while committed-invalid driving batches retain their converted state for Undo. Layer metadata and visibility gates preserve independent input sketches, identities and geometry. The existing native build and earlier packaged 88-check evidence remain historical to their source/test snapshots. Current quick checks pass eight Python syntax checks and four controlled deferred-callback orderings; these do not establish Qt/native runtime acceptance. Recovery item 7 must run the updated 89-check full suite and 55-check high-DPI subset, real handle/collector events, Undo/Redo/save/reopen, final DOCX review and verified desktop shortcut launch. No new build or owner delivery is claimed by item 6; the deferred feature families remain deferred.</w:t>
-      </w:r>
-    </w:p>
-    <w:p>
-      <w:pPr>
-        <w:keepLines w:val="1"/>
-        <w:rPr/>
-      </w:pPr>
-      <w:r>
-        <w:t>Recovery item 7 native fixture reconciliation: the Selection click fixture uses geometry away from the overlapping sketch H-axis, refreshes actual hover and separates independent single-click cases. Native handle fixtures use the actual renderer viewport and a zero-tolerance interior patch of each handle, preserve the real cursor/motion stream and separate single drags. They do not substitute placement or pivot writes for interaction. Selection passes 19 checks; Interactive passes five, including axis/plane/ring and Edit Pivot events, Escape, retained release preview, camera navigation, Apply/OK reset, Undo/Redo and FCStd/cadprt sibling/descendant round trips. Unsuccessful finish/cancellation hypotheses and diagnostic application instrumentation were removed; the retained application behavior is unchanged by these fixture repairs. Full combined 89-check, 55-check high-DPI and saved desktop shortcut delivery gates remain pending this final item.</w:t>
+        <w:t>Recovery item 7 native fixture reconciliation: the Selection click fixture uses geometry away from the overlapping sketch H-axis, refreshes actual hover and separates independent single-click cases. Native handle fixtures use the actual renderer viewport and a zero-tolerance interior patch of each handle, preserve the real cursor/motion stream and separate single drags. They do not substitute placement or pivot writes for interaction. Selection passes 19 checks; Interactive passes five, including axis/plane/ring and Edit Pivot events, Escape, retained release preview, camera navigation, Apply/OK reset, Undo/Redo and FCStd/cadprt sibling/descendant round trips. Unsuccessful finish/cancellation hypotheses and diagnostic application instrumentation were removed; the retained application behavior is unchanged by these fixture repairs. Final combined 89-check, 55-check DPR 3.0 and 26-check saved desktop shortcut delivery gates pass. High-DPI event fixtures settle layout, dismiss an intercepting native notification through actual clicks, verify an unobscured viewport, assert unchanged sketch geometry and expose the native Z ring with a camera-only top view. Late Escape clearing is guarded at every checkpoint and later deliberate clicks survive. Native binaries are reused from the verified grouped build; refreshed packaged Python/resources are identified separately from the embedded compiled revision. This is a local test-build delivery; physical owner feedback remains separate.</w:t>
       </w:r>
     </w:p>
     <w:sectPr>

</xml_diff>

<commit_message>
docs: archive original design workload prompts and queue receipts
</commit_message>
<xml_diff>
--- a/ai-instructions/ui/FreeCAD Plus UI & UX.docx
+++ b/ai-instructions/ui/FreeCAD Plus UI & UX.docx
@@ -46483,6 +46483,15 @@
       </w:pPr>
       <w:r>
         <w:t>Recovery item 7 native fixture reconciliation: the Selection click fixture uses geometry away from the overlapping sketch H-axis, refreshes actual hover and separates independent single-click cases. Native handle fixtures use the actual renderer viewport and a zero-tolerance interior patch of each handle, preserve the real cursor/motion stream and separate single drags. They do not substitute placement or pivot writes for interaction. Selection passes 19 checks; Interactive passes five, including axis/plane/ring and Edit Pivot events, Escape, retained release preview, camera navigation, Apply/OK reset, Undo/Redo and FCStd/cadprt sibling/descendant round trips. Unsuccessful finish/cancellation hypotheses and diagnostic application instrumentation were removed; the retained application behavior is unchanged by these fixture repairs. Final combined 89-check, 55-check DPR 3.0 and 26-check saved desktop shortcut delivery gates pass. High-DPI event fixtures settle layout, dismiss an intercepting native notification through actual clicks, verify an unobscured viewport, assert unchanged sketch geometry and expose the native Z ring with a camera-only top view. Late Escape clearing is guarded at every checkpoint and later deliberate clicks survive. Native binaries are reused from the verified grouped build; refreshed packaged Python/resources are identified separately from the embedded compiled revision. This is a local test-build delivery; physical owner feedback remains separate.</w:t>
+      </w:r>
+    </w:p>
+    <w:p>
+      <w:pPr>
+        <w:keepLines w:val="1"/>
+        <w:rPr/>
+      </w:pPr>
+      <w:r>
+        <w:t>October 6 archival publication: the original October 3 ten-prompt workload backups and queue receipts are retained as a historical archive. Recorded prompt hashes match the saved files. These receipts do not establish execution or submission of the recovered seven prompts in this conversation. The delivered native test payload retains its validated b75ba0252f source snapshot. This archive changes no UI behavior, geometry, defaults or build. WORK_STATE retains current acceptance evidence; archive copies must not be executed or enqueued again.</w:t>
       </w:r>
     </w:p>
     <w:sectPr>

</xml_diff>

<commit_message>
fix: prepare startup workspace once and preserve customized panel layouts
</commit_message>
<xml_diff>
--- a/ai-instructions/ui/FreeCAD Plus UI & UX.docx
+++ b/ai-instructions/ui/FreeCAD Plus UI & UX.docx
@@ -42400,7 +42400,7 @@
         <w:rPr>
           <w:rtl w:val="0"/>
         </w:rPr>
-        <w:t xml:space="preserve">On startup, Components is visible at the top left and occupies about two-thirds of the left panel height. Attributes is below it and occupies about one-third.</w:t>
+        <w:t xml:space="preserve">On first startup, Components is visible at the top left and occupies about two-thirds of the left panel height. Attributes is below it and occupies about one-third. Tasks is docked on the right and shows New File and Open with no document. Subsequent startups restore the user-customized positions, floating state and sizing of panels and toolbars instead of resetting this initial layout.</w:t>
       </w:r>
     </w:p>
     <w:p>
@@ -45223,7 +45223,7 @@
         <w:rPr>
           <w:rtl w:val="0"/>
         </w:rPr>
-        <w:t xml:space="preserve">Show recent files in the viewing window as upstream FreeCAD does, without New File option cards or example files.</w:t>
+        <w:t xml:space="preserve">Show native recent-file cards in the viewing window at startup, without New File option cards or example files. An empty list shows No recent files. New File and Open remain visible in Tasks. Prepare the selected theme, toolbar style and restored workspace before exposing the main window; do not cycle through workbenches after it appears. Home loads only its required native command modules. Explicit theme and Plus/Classic choices persist.</w:t>
       </w:r>
     </w:p>
     <w:p>
@@ -45599,7 +45599,7 @@
         <w:rPr>
           <w:rtl w:val="0"/>
         </w:rPr>
-        <w:t xml:space="preserve">Application: FreeCAD Light theme; medium 24 px toolbar icons; Combined Tree View and Property View; 4 recent files. Tiled background off; cursor blinking, startup splash and overlay panels on. Retain Plus UI and Blender navigation defaults.</w:t>
+        <w:t xml:space="preserve">Application: FreeCAD Light theme; medium 24 px toolbar icons; Combined Tree View and Property View; 4 recent files. Tiled background off; cursor blinking and startup splash on. Panels start docked, with Tasks on the right. Migrate the old implicit Tasks overlay once; retain other overlay memberships and subsequent user customization. Retain Plus UI and Blender navigation defaults.</w:t>
       </w:r>
     </w:p>
     <w:p>

</xml_diff>

<commit_message>
Revise Modeling ribbon and preserve complete group captions
</commit_message>
<xml_diff>
--- a/ai-instructions/ui/FreeCAD Plus UI & UX.docx
+++ b/ai-instructions/ui/FreeCAD Plus UI & UX.docx
@@ -14979,7 +14979,7 @@
         <w:rPr>
           <w:rtl w:val="0"/>
         </w:rPr>
-        <w:t>Design Mode | Modeling tab | Pipe</w:t>
+        <w:t>Native Pipe command retained; no button in the revised Modeling tab.</w:t>
       </w:r>
     </w:p>
     <w:p>
@@ -15044,7 +15044,7 @@
         <w:rPr>
           <w:rtl w:val="0"/>
         </w:rPr>
-        <w:t>Design Mode | Modeling tab | Primitive</w:t>
+        <w:t>Native Primitive command retained; use the large Primitives dropdown in Modeling.</w:t>
       </w:r>
     </w:p>
     <w:p>
@@ -15092,7 +15092,7 @@
         <w:rPr>
           <w:rtl w:val="0"/>
         </w:rPr>
-        <w:t>Design Mode | Modeling tab | Primitive &gt; Box</w:t>
+        <w:t>Native primitive command | Box</w:t>
       </w:r>
     </w:p>
     <w:p>
@@ -15140,7 +15140,7 @@
         <w:rPr>
           <w:rtl w:val="0"/>
         </w:rPr>
-        <w:t>Design Mode | Modeling tab | Primitive &gt; Cylinder</w:t>
+        <w:t>Native primitive command | Cylinder</w:t>
       </w:r>
     </w:p>
     <w:p>
@@ -15188,7 +15188,7 @@
         <w:rPr>
           <w:rtl w:val="0"/>
         </w:rPr>
-        <w:t>Design Mode | Modeling tab | Primitive &gt; Sphere</w:t>
+        <w:t>Native primitive command | Sphere</w:t>
       </w:r>
     </w:p>
     <w:p>
@@ -15236,7 +15236,7 @@
         <w:rPr>
           <w:rtl w:val="0"/>
         </w:rPr>
-        <w:t>Design Mode | Modeling tab | Primitive &gt; Cone</w:t>
+        <w:t>Native primitive command | Cone</w:t>
       </w:r>
     </w:p>
     <w:p>
@@ -15284,7 +15284,7 @@
         <w:rPr>
           <w:rtl w:val="0"/>
         </w:rPr>
-        <w:t>Design Mode | Modeling tab | Primitive &gt; Ellipsoid</w:t>
+        <w:t>Native primitive command | Ellipsoid</w:t>
       </w:r>
     </w:p>
     <w:p>
@@ -15332,7 +15332,7 @@
         <w:rPr>
           <w:rtl w:val="0"/>
         </w:rPr>
-        <w:t>Design Mode | Modeling tab | Primitive &gt; Torus</w:t>
+        <w:t>Native primitive command | Torus</w:t>
       </w:r>
     </w:p>
     <w:p>
@@ -15380,7 +15380,7 @@
         <w:rPr>
           <w:rtl w:val="0"/>
         </w:rPr>
-        <w:t>Design Mode | Modeling tab | Primitive &gt; Prism</w:t>
+        <w:t>Native primitive command | Prism</w:t>
       </w:r>
     </w:p>
     <w:p>
@@ -15428,7 +15428,7 @@
         <w:rPr>
           <w:rtl w:val="0"/>
         </w:rPr>
-        <w:t>Design Mode | Modeling tab | Primitive &gt; Wedge</w:t>
+        <w:t>Native primitive command | Wedge</w:t>
       </w:r>
     </w:p>
     <w:p>
@@ -15620,7 +15620,7 @@
         <w:rPr>
           <w:rtl w:val="0"/>
         </w:rPr>
-        <w:t>Design Mode | Modeling tab | Pipe</w:t>
+        <w:t>Native Pipe command retained; no button in the revised Modeling tab.</w:t>
       </w:r>
     </w:p>
     <w:p>
@@ -15685,7 +15685,7 @@
         <w:rPr>
           <w:rtl w:val="0"/>
         </w:rPr>
-        <w:t>Design Mode | Modeling tab | Primitive</w:t>
+        <w:t>Native Primitive command retained; use the large Primitives dropdown in Modeling.</w:t>
       </w:r>
     </w:p>
     <w:p>
@@ -15733,7 +15733,7 @@
         <w:rPr>
           <w:rtl w:val="0"/>
         </w:rPr>
-        <w:t>Design Mode | Modeling tab | Primitive &gt; Box</w:t>
+        <w:t>Native primitive command | Box</w:t>
       </w:r>
     </w:p>
     <w:p>
@@ -15781,7 +15781,7 @@
         <w:rPr>
           <w:rtl w:val="0"/>
         </w:rPr>
-        <w:t>Design Mode | Modeling tab | Primitive &gt; Cylinder</w:t>
+        <w:t>Native primitive command | Cylinder</w:t>
       </w:r>
     </w:p>
     <w:p>
@@ -15829,7 +15829,7 @@
         <w:rPr>
           <w:rtl w:val="0"/>
         </w:rPr>
-        <w:t>Design Mode | Modeling tab | Primitive &gt; Sphere</w:t>
+        <w:t>Native primitive command | Sphere</w:t>
       </w:r>
     </w:p>
     <w:p>
@@ -15877,7 +15877,7 @@
         <w:rPr>
           <w:rtl w:val="0"/>
         </w:rPr>
-        <w:t>Design Mode | Modeling tab | Primitive &gt; Cone</w:t>
+        <w:t>Native primitive command | Cone</w:t>
       </w:r>
     </w:p>
     <w:p>
@@ -15925,7 +15925,7 @@
         <w:rPr>
           <w:rtl w:val="0"/>
         </w:rPr>
-        <w:t>Design Mode | Modeling tab | Primitive &gt; Ellipsoid</w:t>
+        <w:t>Native primitive command | Ellipsoid</w:t>
       </w:r>
     </w:p>
     <w:p>
@@ -15973,7 +15973,7 @@
         <w:rPr>
           <w:rtl w:val="0"/>
         </w:rPr>
-        <w:t>Design Mode | Modeling tab | Primitive &gt; Torus</w:t>
+        <w:t>Native primitive command | Torus</w:t>
       </w:r>
     </w:p>
     <w:p>
@@ -16021,7 +16021,7 @@
         <w:rPr>
           <w:rtl w:val="0"/>
         </w:rPr>
-        <w:t>Design Mode | Modeling tab | Primitive &gt; Prism</w:t>
+        <w:t>Native primitive command | Prism</w:t>
       </w:r>
     </w:p>
     <w:p>
@@ -16069,7 +16069,7 @@
         <w:rPr>
           <w:rtl w:val="0"/>
         </w:rPr>
-        <w:t>Design Mode | Modeling tab | Primitive &gt; Wedge</w:t>
+        <w:t>Native primitive command | Wedge</w:t>
       </w:r>
     </w:p>
     <w:p>
@@ -16182,7 +16182,7 @@
         <w:rPr>
           <w:rtl w:val="0"/>
         </w:rPr>
-        <w:t>Design Mode | Modeling tab | Fillet</w:t>
+        <w:t>Design Mode | Modeling tab | Dress-Up | Fillet and Chamfer &gt; Fillet (Default)</w:t>
       </w:r>
     </w:p>
     <w:p>
@@ -16230,7 +16230,7 @@
         <w:rPr>
           <w:rtl w:val="0"/>
         </w:rPr>
-        <w:t>Design Mode | Modeling tab | Chamfer</w:t>
+        <w:t>Design Mode | Modeling tab | Dress-Up | Fillet and Chamfer &gt; Chamfer</w:t>
       </w:r>
     </w:p>
     <w:p>
@@ -16326,7 +16326,7 @@
         <w:rPr>
           <w:rtl w:val="0"/>
         </w:rPr>
-        <w:t>Design Mode | Modeling tab | Delete Face/Defeaturing</w:t>
+        <w:t>Design Mode | Modeling tab | Other | Delete Face/Defeaturing</w:t>
       </w:r>
     </w:p>
     <w:p>
@@ -37012,7 +37012,7 @@
         <w:rPr>
           <w:rtl w:val="0"/>
         </w:rPr>
-        <w:t xml:space="preserve">Use a consistent grid and a fixed maximum caption width for full-size and medium buttons. Keep tooltips available for small icons.</w:t>
+        <w:t xml:space="preserve">Use a consistent grid with gray vertical line dividers between adjacent groups on every tab. Show complete large-button and group captions on up to two lines as needed; grow width/height rather than abbreviating or cutting off text. Medium and small buttons show icons only, with native hover tooltips and accessible names retained.</w:t>
       </w:r>
     </w:p>
     <w:p>
@@ -37084,7 +37084,7 @@
         <w:spacing w:after="0" w:before="0"/>
       </w:pPr>
       <w:r>
-        <w:t>Current Plus configuration: tabs and groups are listed left to right; button clusters are listed by column, top to bottom. Large buttons occupy a full column, medium clusters use two rows, and small clusters use three rows. File, Edit and Clipboard remain in the separate common toolbar. Native actions, enablement, shortcuts, Classic preferences and modeling behavior are retained. Tab in Primitives is disabled because it is not implemented.</w:t>
+        <w:t>Current Plus configuration: tabs and groups are listed left to right; button clusters are listed by column, top to bottom. Large buttons occupy a full column, medium clusters use two rows, and small clusters use three rows. File, Edit and Clipboard remain in the separate common toolbar. Native actions, enablement, shortcuts, Classic preferences and modeling behavior are retained. Tab in Primitives is disabled because it is not implemented. Medium and small buttons show icons only. Gray vertical dividers separate adjacent groups. Large-button and group captions retain their complete text on up to two lines; sizing grows as needed. Modeling follows the revised six-group outline below; Pipe remains a native command outside this tab.</w:t>
       </w:r>
     </w:p>
     <w:p>
@@ -37451,11 +37451,164 @@
           <w:numId w:val="1"/>
         </w:numPr>
         <w:ind w:left="1440" w:hanging="270"/>
+        <w:keepNext w:val="1"/>
         <w:keepLines w:val="1"/>
         <w:spacing w:after="0" w:before="0"/>
       </w:pPr>
       <w:r>
-        <w:t>Edit Sketch (Large Button)</w:t>
+        <w:t>Small Button Cluster</w:t>
+      </w:r>
+    </w:p>
+    <w:p>
+      <w:pPr>
+        <w:rPr/>
+        <w:numPr>
+          <w:ilvl w:val="3"/>
+          <w:numId w:val="1"/>
+        </w:numPr>
+        <w:ind w:left="1800" w:hanging="270"/>
+        <w:keepLines w:val="1"/>
+        <w:spacing w:after="0" w:before="0"/>
+      </w:pPr>
+      <w:r>
+        <w:t>Edit Sketch</w:t>
+      </w:r>
+    </w:p>
+    <w:p>
+      <w:pPr>
+        <w:rPr/>
+        <w:numPr>
+          <w:ilvl w:val="3"/>
+          <w:numId w:val="1"/>
+        </w:numPr>
+        <w:ind w:left="1800" w:hanging="270"/>
+        <w:keepLines w:val="1"/>
+        <w:spacing w:after="0" w:before="0"/>
+      </w:pPr>
+      <w:r>
+        <w:t>Attach Sketch</w:t>
+      </w:r>
+    </w:p>
+    <w:p>
+      <w:pPr>
+        <w:rPr/>
+        <w:numPr>
+          <w:ilvl w:val="3"/>
+          <w:numId w:val="1"/>
+        </w:numPr>
+        <w:ind w:left="1800" w:hanging="270"/>
+        <w:keepNext w:val="1"/>
+        <w:keepLines w:val="1"/>
+        <w:spacing w:after="0" w:before="0"/>
+      </w:pPr>
+      <w:r>
+        <w:t>Coordinate System (Small Button Dropdown)</w:t>
+      </w:r>
+    </w:p>
+    <w:p>
+      <w:pPr>
+        <w:rPr/>
+        <w:numPr>
+          <w:ilvl w:val="4"/>
+          <w:numId w:val="1"/>
+        </w:numPr>
+        <w:ind w:left="2160" w:hanging="270"/>
+        <w:keepLines w:val="1"/>
+        <w:spacing w:after="0" w:before="0"/>
+      </w:pPr>
+      <w:r>
+        <w:t>Coordinate System (Default)</w:t>
+      </w:r>
+    </w:p>
+    <w:p>
+      <w:pPr>
+        <w:rPr/>
+        <w:numPr>
+          <w:ilvl w:val="4"/>
+          <w:numId w:val="1"/>
+        </w:numPr>
+        <w:ind w:left="2160" w:hanging="270"/>
+        <w:keepLines w:val="1"/>
+        <w:spacing w:after="0" w:before="0"/>
+      </w:pPr>
+      <w:r>
+        <w:t>Plane</w:t>
+      </w:r>
+    </w:p>
+    <w:p>
+      <w:pPr>
+        <w:rPr/>
+        <w:numPr>
+          <w:ilvl w:val="4"/>
+          <w:numId w:val="1"/>
+        </w:numPr>
+        <w:ind w:left="2160" w:hanging="270"/>
+        <w:keepLines w:val="1"/>
+        <w:spacing w:after="0" w:before="0"/>
+      </w:pPr>
+      <w:r>
+        <w:t>Axis</w:t>
+      </w:r>
+    </w:p>
+    <w:p>
+      <w:pPr>
+        <w:rPr/>
+        <w:numPr>
+          <w:ilvl w:val="4"/>
+          <w:numId w:val="1"/>
+        </w:numPr>
+        <w:ind w:left="2160" w:hanging="270"/>
+        <w:keepLines w:val="1"/>
+        <w:spacing w:after="0" w:before="0"/>
+      </w:pPr>
+      <w:r>
+        <w:t>Point</w:t>
+      </w:r>
+    </w:p>
+    <w:p>
+      <w:pPr>
+        <w:rPr/>
+        <w:numPr>
+          <w:ilvl w:val="1"/>
+          <w:numId w:val="1"/>
+        </w:numPr>
+        <w:ind w:left="1080" w:hanging="270"/>
+        <w:keepNext w:val="1"/>
+        <w:keepLines w:val="1"/>
+        <w:spacing w:after="0" w:before="0"/>
+      </w:pPr>
+      <w:r>
+        <w:t>Modeling group:</w:t>
+      </w:r>
+    </w:p>
+    <w:p>
+      <w:pPr>
+        <w:rPr/>
+        <w:numPr>
+          <w:ilvl w:val="2"/>
+          <w:numId w:val="1"/>
+        </w:numPr>
+        <w:ind w:left="1440" w:hanging="270"/>
+        <w:keepLines w:val="1"/>
+        <w:spacing w:after="0" w:before="0"/>
+      </w:pPr>
+      <w:r>
+        <w:t>Extrude (Large Button)</w:t>
+      </w:r>
+    </w:p>
+    <w:p>
+      <w:pPr>
+        <w:rPr/>
+        <w:numPr>
+          <w:ilvl w:val="2"/>
+          <w:numId w:val="1"/>
+        </w:numPr>
+        <w:ind w:left="1440" w:hanging="270"/>
+        <w:keepLines w:val="1"/>
+        <w:spacing w:after="0" w:before="0"/>
+      </w:pPr>
+      <w:r>
+        <w:t>Revolve (Large Button)</w:t>
       </w:r>
     </w:p>
     <w:p>
@@ -37471,7 +37624,7 @@
         <w:spacing w:after="0" w:before="0"/>
       </w:pPr>
       <w:r>
-        <w:t>Small Button Cluster</w:t>
+        <w:t>Medium Button Cluster</w:t>
       </w:r>
     </w:p>
     <w:p>
@@ -37486,7 +37639,22 @@
         <w:spacing w:after="0" w:before="0"/>
       </w:pPr>
       <w:r>
-        <w:t>Attach Sketch</w:t>
+        <w:t>Loft</w:t>
+      </w:r>
+    </w:p>
+    <w:p>
+      <w:pPr>
+        <w:rPr/>
+        <w:numPr>
+          <w:ilvl w:val="3"/>
+          <w:numId w:val="1"/>
+        </w:numPr>
+        <w:ind w:left="1800" w:hanging="270"/>
+        <w:keepLines w:val="1"/>
+        <w:spacing w:after="0" w:before="0"/>
+      </w:pPr>
+      <w:r>
+        <w:t>Helix</w:t>
       </w:r>
     </w:p>
     <w:p>
@@ -37502,37 +37670,7 @@
         <w:spacing w:after="0" w:before="0"/>
       </w:pPr>
       <w:r>
-        <w:t>Modeling group:</w:t>
-      </w:r>
-    </w:p>
-    <w:p>
-      <w:pPr>
-        <w:rPr/>
-        <w:numPr>
-          <w:ilvl w:val="2"/>
-          <w:numId w:val="1"/>
-        </w:numPr>
-        <w:ind w:left="1440" w:hanging="270"/>
-        <w:keepLines w:val="1"/>
-        <w:spacing w:after="0" w:before="0"/>
-      </w:pPr>
-      <w:r>
-        <w:t>Extrude (Large Button)</w:t>
-      </w:r>
-    </w:p>
-    <w:p>
-      <w:pPr>
-        <w:rPr/>
-        <w:numPr>
-          <w:ilvl w:val="2"/>
-          <w:numId w:val="1"/>
-        </w:numPr>
-        <w:ind w:left="1440" w:hanging="270"/>
-        <w:keepLines w:val="1"/>
-        <w:spacing w:after="0" w:before="0"/>
-      </w:pPr>
-      <w:r>
-        <w:t>Revolve (Large Button)</w:t>
+        <w:t>Dress-Up group:</w:t>
       </w:r>
     </w:p>
     <w:p>
@@ -37548,7 +37686,7 @@
         <w:spacing w:after="0" w:before="0"/>
       </w:pPr>
       <w:r>
-        <w:t>Small Button Cluster</w:t>
+        <w:t>Fillet and Chamfer (Large Button Dropdown)</w:t>
       </w:r>
     </w:p>
     <w:p>
@@ -37563,7 +37701,7 @@
         <w:spacing w:after="0" w:before="0"/>
       </w:pPr>
       <w:r>
-        <w:t>Add Reference Object</w:t>
+        <w:t>Fillet (Default)</w:t>
       </w:r>
     </w:p>
     <w:p>
@@ -37578,22 +37716,7 @@
         <w:spacing w:after="0" w:before="0"/>
       </w:pPr>
       <w:r>
-        <w:t>Loft</w:t>
-      </w:r>
-    </w:p>
-    <w:p>
-      <w:pPr>
-        <w:rPr/>
-        <w:numPr>
-          <w:ilvl w:val="3"/>
-          <w:numId w:val="1"/>
-        </w:numPr>
-        <w:ind w:left="1800" w:hanging="270"/>
-        <w:keepLines w:val="1"/>
-        <w:spacing w:after="0" w:before="0"/>
-      </w:pPr>
-      <w:r>
-        <w:t>Pipe</w:t>
+        <w:t>Chamfer</w:t>
       </w:r>
     </w:p>
     <w:p>
@@ -37609,7 +37732,7 @@
         <w:spacing w:after="0" w:before="0"/>
       </w:pPr>
       <w:r>
-        <w:t>Small Button Cluster</w:t>
+        <w:t>Medium Button Cluster</w:t>
       </w:r>
     </w:p>
     <w:p>
@@ -37624,7 +37747,7 @@
         <w:spacing w:after="0" w:before="0"/>
       </w:pPr>
       <w:r>
-        <w:t>Helix</w:t>
+        <w:t>Draft</w:t>
       </w:r>
     </w:p>
     <w:p>
@@ -37639,7 +37762,7 @@
         <w:spacing w:after="0" w:before="0"/>
       </w:pPr>
       <w:r>
-        <w:t>Primitive</w:t>
+        <w:t>Shell/Thickness</w:t>
       </w:r>
     </w:p>
     <w:p>
@@ -37655,22 +37778,7 @@
         <w:spacing w:after="0" w:before="0"/>
       </w:pPr>
       <w:r>
-        <w:t>Dress-Up group:</w:t>
-      </w:r>
-    </w:p>
-    <w:p>
-      <w:pPr>
-        <w:rPr/>
-        <w:numPr>
-          <w:ilvl w:val="2"/>
-          <w:numId w:val="1"/>
-        </w:numPr>
-        <w:ind w:left="1440" w:hanging="270"/>
-        <w:keepLines w:val="1"/>
-        <w:spacing w:after="0" w:before="0"/>
-      </w:pPr>
-      <w:r>
-        <w:t>Fillet (Large Button)</w:t>
+        <w:t>Transformation group:</w:t>
       </w:r>
     </w:p>
     <w:p>
@@ -37686,7 +37794,7 @@
         <w:spacing w:after="0" w:before="0"/>
       </w:pPr>
       <w:r>
-        <w:t>Small Button Cluster</w:t>
+        <w:t>Medium Button Cluster</w:t>
       </w:r>
     </w:p>
     <w:p>
@@ -37701,7 +37809,7 @@
         <w:spacing w:after="0" w:before="0"/>
       </w:pPr>
       <w:r>
-        <w:t>Chamfer</w:t>
+        <w:t>Mirror Feature</w:t>
       </w:r>
     </w:p>
     <w:p>
@@ -37716,22 +37824,7 @@
         <w:spacing w:after="0" w:before="0"/>
       </w:pPr>
       <w:r>
-        <w:t>Draft</w:t>
-      </w:r>
-    </w:p>
-    <w:p>
-      <w:pPr>
-        <w:rPr/>
-        <w:numPr>
-          <w:ilvl w:val="3"/>
-          <w:numId w:val="1"/>
-        </w:numPr>
-        <w:ind w:left="1800" w:hanging="270"/>
-        <w:keepLines w:val="1"/>
-        <w:spacing w:after="0" w:before="0"/>
-      </w:pPr>
-      <w:r>
-        <w:t>Shell/Thickness</w:t>
+        <w:t>Linear Pattern</w:t>
       </w:r>
     </w:p>
     <w:p>
@@ -37747,7 +37840,7 @@
         <w:spacing w:after="0" w:before="0"/>
       </w:pPr>
       <w:r>
-        <w:t>Small Button Cluster</w:t>
+        <w:t>Medium Button Cluster</w:t>
       </w:r>
     </w:p>
     <w:p>
@@ -37762,7 +37855,22 @@
         <w:spacing w:after="0" w:before="0"/>
       </w:pPr>
       <w:r>
-        <w:t>Delete Face/Defeaturing</w:t>
+        <w:t>Circular Pattern</w:t>
+      </w:r>
+    </w:p>
+    <w:p>
+      <w:pPr>
+        <w:rPr/>
+        <w:numPr>
+          <w:ilvl w:val="3"/>
+          <w:numId w:val="1"/>
+        </w:numPr>
+        <w:ind w:left="1800" w:hanging="270"/>
+        <w:keepLines w:val="1"/>
+        <w:spacing w:after="0" w:before="0"/>
+      </w:pPr>
+      <w:r>
+        <w:t>Multi Transform</w:t>
       </w:r>
     </w:p>
     <w:p>
@@ -37778,7 +37886,7 @@
         <w:spacing w:after="0" w:before="0"/>
       </w:pPr>
       <w:r>
-        <w:t>Transformation group:</w:t>
+        <w:t>Primitives group:</w:t>
       </w:r>
     </w:p>
     <w:p>
@@ -37794,7 +37902,7 @@
         <w:spacing w:after="0" w:before="0"/>
       </w:pPr>
       <w:r>
-        <w:t>Small Button Cluster</w:t>
+        <w:t>Primitives (Large Button Dropdown)</w:t>
       </w:r>
     </w:p>
     <w:p>
@@ -37809,7 +37917,7 @@
         <w:spacing w:after="0" w:before="0"/>
       </w:pPr>
       <w:r>
-        <w:t>Mirror Feature</w:t>
+        <w:t>Box (Default)</w:t>
       </w:r>
     </w:p>
     <w:p>
@@ -37824,7 +37932,7 @@
         <w:spacing w:after="0" w:before="0"/>
       </w:pPr>
       <w:r>
-        <w:t>Linear Pattern</w:t>
+        <w:t>Cylinder</w:t>
       </w:r>
     </w:p>
     <w:p>
@@ -37839,7 +37947,113 @@
         <w:spacing w:after="0" w:before="0"/>
       </w:pPr>
       <w:r>
-        <w:t>Circular Pattern</w:t>
+        <w:t>Sphere</w:t>
+      </w:r>
+    </w:p>
+    <w:p>
+      <w:pPr>
+        <w:rPr/>
+        <w:numPr>
+          <w:ilvl w:val="3"/>
+          <w:numId w:val="1"/>
+        </w:numPr>
+        <w:ind w:left="1800" w:hanging="270"/>
+        <w:keepLines w:val="1"/>
+        <w:spacing w:after="0" w:before="0"/>
+      </w:pPr>
+      <w:r>
+        <w:t>Cone</w:t>
+      </w:r>
+    </w:p>
+    <w:p>
+      <w:pPr>
+        <w:rPr/>
+        <w:numPr>
+          <w:ilvl w:val="3"/>
+          <w:numId w:val="1"/>
+        </w:numPr>
+        <w:ind w:left="1800" w:hanging="270"/>
+        <w:keepLines w:val="1"/>
+        <w:spacing w:after="0" w:before="0"/>
+      </w:pPr>
+      <w:r>
+        <w:t>Ellipsoid</w:t>
+      </w:r>
+    </w:p>
+    <w:p>
+      <w:pPr>
+        <w:rPr/>
+        <w:numPr>
+          <w:ilvl w:val="3"/>
+          <w:numId w:val="1"/>
+        </w:numPr>
+        <w:ind w:left="1800" w:hanging="270"/>
+        <w:keepLines w:val="1"/>
+        <w:spacing w:after="0" w:before="0"/>
+      </w:pPr>
+      <w:r>
+        <w:t>Torus</w:t>
+      </w:r>
+    </w:p>
+    <w:p>
+      <w:pPr>
+        <w:rPr/>
+        <w:numPr>
+          <w:ilvl w:val="3"/>
+          <w:numId w:val="1"/>
+        </w:numPr>
+        <w:ind w:left="1800" w:hanging="270"/>
+        <w:keepLines w:val="1"/>
+        <w:spacing w:after="0" w:before="0"/>
+      </w:pPr>
+      <w:r>
+        <w:t>Prism</w:t>
+      </w:r>
+    </w:p>
+    <w:p>
+      <w:pPr>
+        <w:rPr/>
+        <w:numPr>
+          <w:ilvl w:val="3"/>
+          <w:numId w:val="1"/>
+        </w:numPr>
+        <w:ind w:left="1800" w:hanging="270"/>
+        <w:keepLines w:val="1"/>
+        <w:spacing w:after="0" w:before="0"/>
+      </w:pPr>
+      <w:r>
+        <w:t>Wedge</w:t>
+      </w:r>
+    </w:p>
+    <w:p>
+      <w:pPr>
+        <w:rPr/>
+        <w:numPr>
+          <w:ilvl w:val="3"/>
+          <w:numId w:val="1"/>
+        </w:numPr>
+        <w:ind w:left="1800" w:hanging="270"/>
+        <w:keepLines w:val="1"/>
+        <w:spacing w:after="0" w:before="0"/>
+      </w:pPr>
+      <w:r>
+        <w:t>Tab (Disabled; not implemented)</w:t>
+      </w:r>
+    </w:p>
+    <w:p>
+      <w:pPr>
+        <w:rPr/>
+        <w:numPr>
+          <w:ilvl w:val="1"/>
+          <w:numId w:val="1"/>
+        </w:numPr>
+        <w:ind w:left="1080" w:hanging="270"/>
+        <w:keepNext w:val="1"/>
+        <w:keepLines w:val="1"/>
+        <w:spacing w:after="0" w:before="0"/>
+      </w:pPr>
+      <w:r>
+        <w:t>Other group:</w:t>
       </w:r>
     </w:p>
     <w:p>
@@ -37855,7 +38069,7 @@
         <w:spacing w:after="0" w:before="0"/>
       </w:pPr>
       <w:r>
-        <w:t>Small Button Cluster</w:t>
+        <w:t>Medium Button Cluster</w:t>
       </w:r>
     </w:p>
     <w:p>
@@ -37870,190 +38084,22 @@
         <w:spacing w:after="0" w:before="0"/>
       </w:pPr>
       <w:r>
-        <w:t>Multi Transform</w:t>
-      </w:r>
-    </w:p>
-    <w:p>
-      <w:pPr>
-        <w:rPr/>
-        <w:numPr>
-          <w:ilvl w:val="1"/>
+        <w:t>Delete Face/Defeaturing</w:t>
+      </w:r>
+    </w:p>
+    <w:p>
+      <w:pPr>
+        <w:rPr/>
+        <w:numPr>
+          <w:ilvl w:val="3"/>
           <w:numId w:val="1"/>
         </w:numPr>
-        <w:ind w:left="1080" w:hanging="270"/>
-        <w:keepNext w:val="1"/>
+        <w:ind w:left="1800" w:hanging="270"/>
         <w:keepLines w:val="1"/>
         <w:spacing w:after="0" w:before="0"/>
       </w:pPr>
       <w:r>
-        <w:t>Primitives group:</w:t>
-      </w:r>
-    </w:p>
-    <w:p>
-      <w:pPr>
-        <w:rPr/>
-        <w:numPr>
-          <w:ilvl w:val="2"/>
-          <w:numId w:val="1"/>
-        </w:numPr>
-        <w:ind w:left="1440" w:hanging="270"/>
-        <w:keepNext w:val="1"/>
-        <w:keepLines w:val="1"/>
-        <w:spacing w:after="0" w:before="0"/>
-      </w:pPr>
-      <w:r>
-        <w:t>Small Button Cluster</w:t>
-      </w:r>
-    </w:p>
-    <w:p>
-      <w:pPr>
-        <w:rPr/>
-        <w:numPr>
-          <w:ilvl w:val="3"/>
-          <w:numId w:val="1"/>
-        </w:numPr>
-        <w:ind w:left="1800" w:hanging="270"/>
-        <w:keepNext w:val="1"/>
-        <w:keepLines w:val="1"/>
-        <w:spacing w:after="0" w:before="0"/>
-      </w:pPr>
-      <w:r>
-        <w:t>Primitives (Small Button Dropdown)</w:t>
-      </w:r>
-    </w:p>
-    <w:p>
-      <w:pPr>
-        <w:rPr/>
-        <w:numPr>
-          <w:ilvl w:val="4"/>
-          <w:numId w:val="1"/>
-        </w:numPr>
-        <w:ind w:left="2160" w:hanging="270"/>
-        <w:keepLines w:val="1"/>
-        <w:spacing w:after="0" w:before="0"/>
-      </w:pPr>
-      <w:r>
-        <w:t>Box (Default primitive)</w:t>
-      </w:r>
-    </w:p>
-    <w:p>
-      <w:pPr>
-        <w:rPr/>
-        <w:numPr>
-          <w:ilvl w:val="4"/>
-          <w:numId w:val="1"/>
-        </w:numPr>
-        <w:ind w:left="2160" w:hanging="270"/>
-        <w:keepLines w:val="1"/>
-        <w:spacing w:after="0" w:before="0"/>
-      </w:pPr>
-      <w:r>
-        <w:t>Cylinder</w:t>
-      </w:r>
-    </w:p>
-    <w:p>
-      <w:pPr>
-        <w:rPr/>
-        <w:numPr>
-          <w:ilvl w:val="4"/>
-          <w:numId w:val="1"/>
-        </w:numPr>
-        <w:ind w:left="2160" w:hanging="270"/>
-        <w:keepLines w:val="1"/>
-        <w:spacing w:after="0" w:before="0"/>
-      </w:pPr>
-      <w:r>
-        <w:t>Sphere</w:t>
-      </w:r>
-    </w:p>
-    <w:p>
-      <w:pPr>
-        <w:rPr/>
-        <w:numPr>
-          <w:ilvl w:val="4"/>
-          <w:numId w:val="1"/>
-        </w:numPr>
-        <w:ind w:left="2160" w:hanging="270"/>
-        <w:keepLines w:val="1"/>
-        <w:spacing w:after="0" w:before="0"/>
-      </w:pPr>
-      <w:r>
-        <w:t>Cone</w:t>
-      </w:r>
-    </w:p>
-    <w:p>
-      <w:pPr>
-        <w:rPr/>
-        <w:numPr>
-          <w:ilvl w:val="4"/>
-          <w:numId w:val="1"/>
-        </w:numPr>
-        <w:ind w:left="2160" w:hanging="270"/>
-        <w:keepLines w:val="1"/>
-        <w:spacing w:after="0" w:before="0"/>
-      </w:pPr>
-      <w:r>
-        <w:t>Ellipsoid</w:t>
-      </w:r>
-    </w:p>
-    <w:p>
-      <w:pPr>
-        <w:rPr/>
-        <w:numPr>
-          <w:ilvl w:val="4"/>
-          <w:numId w:val="1"/>
-        </w:numPr>
-        <w:ind w:left="2160" w:hanging="270"/>
-        <w:keepLines w:val="1"/>
-        <w:spacing w:after="0" w:before="0"/>
-      </w:pPr>
-      <w:r>
-        <w:t>Torus</w:t>
-      </w:r>
-    </w:p>
-    <w:p>
-      <w:pPr>
-        <w:rPr/>
-        <w:numPr>
-          <w:ilvl w:val="4"/>
-          <w:numId w:val="1"/>
-        </w:numPr>
-        <w:ind w:left="2160" w:hanging="270"/>
-        <w:keepLines w:val="1"/>
-        <w:spacing w:after="0" w:before="0"/>
-      </w:pPr>
-      <w:r>
-        <w:t>Prism</w:t>
-      </w:r>
-    </w:p>
-    <w:p>
-      <w:pPr>
-        <w:rPr/>
-        <w:numPr>
-          <w:ilvl w:val="4"/>
-          <w:numId w:val="1"/>
-        </w:numPr>
-        <w:ind w:left="2160" w:hanging="270"/>
-        <w:keepLines w:val="1"/>
-        <w:spacing w:after="0" w:before="0"/>
-      </w:pPr>
-      <w:r>
-        <w:t>Wedge</w:t>
-      </w:r>
-    </w:p>
-    <w:p>
-      <w:pPr>
-        <w:rPr/>
-        <w:numPr>
-          <w:ilvl w:val="4"/>
-          <w:numId w:val="1"/>
-        </w:numPr>
-        <w:ind w:left="2160" w:hanging="270"/>
-        <w:keepLines w:val="1"/>
-        <w:spacing w:after="0" w:before="0"/>
-      </w:pPr>
-      <w:r>
-        <w:t>Tab (Disabled; not implemented)</w:t>
+        <w:t>Add Reference Object</w:t>
       </w:r>
     </w:p>
     <w:p>

</xml_diff>

<commit_message>
Fix plain sketch selection and quiet hypothetical solver failures
</commit_message>
<xml_diff>
--- a/ai-instructions/ui/FreeCAD Plus UI & UX.docx
+++ b/ai-instructions/ui/FreeCAD Plus UI & UX.docx
@@ -47244,6 +47244,14 @@
       </w:pPr>
       <w:r>
         <w:t>October 6 archival publication: the original October 3 ten-prompt workload backups and queue receipts are retained as a historical archive. Recorded prompt hashes match the saved files. These receipts do not establish execution or submission of the recovered seven prompts in this conversation. The delivered native test payload retains its validated b75ba0252f source snapshot. This archive changes no UI behavior, geometry, defaults or build. WORK_STATE retains current acceptance evidence; archive copies must not be executed or enqueued again.</w:t>
+      </w:r>
+    </w:p>
+    <w:p>
+      <w:pPr>
+        <w:keepLines w:val="1"/>
+      </w:pPr>
+      <w:r>
+        <w:t>October 6 sketch-edit selection correction: in Plus Design, a plain point/edge/constraint click replaces the selected item; a repeated plain click retains that item. Ctrl or Shift permits native multi-selection. A plain empty-space click clears selection, while Ctrl/Shift empty clicks retain it. Persistent Selection controls retention after operations and must not turn plain clicks into multi-selection. Dragging, box selection, context-menu picks and Classic native behavior retain their own semantics. Palette feasibility checks use cloned solver data and must not report errors or warnings for unapplied hypothetical constraints. Quiet handling belongs only to that probe; actual modeling/constraint operations retain native diagnostics and Undo behavior. Both defects reproduce on the preceding delivered build: two plain point clicks accumulate selection, and the hypothetical coincidence of a line's endpoints repeatedly reports failed solvers and geometry errors. Source corrections and native regressions are prepared; rebuilt native/packaged/shortcut validation is pending and recorded separately in WORK_STATE.</w:t>
       </w:r>
     </w:p>
     <w:sectPr>

</xml_diff>

<commit_message>
Enlarge medium ribbon icons and button height
</commit_message>
<xml_diff>
--- a/ai-instructions/ui/FreeCAD Plus UI & UX.docx
+++ b/ai-instructions/ui/FreeCAD Plus UI & UX.docx
@@ -36964,7 +36964,7 @@
         <w:rPr>
           <w:rtl w:val="0"/>
         </w:rPr>
-        <w:t xml:space="preserve">Medium: half-size icons for commonly used actions needing a more compact presentation.</w:t>
+        <w:t xml:space="preserve">Medium: 32 logical pixel ribbon icons in 42-pixel-high buttons, arranged in two rows with native tooltips and accessible names.</w:t>
       </w:r>
     </w:p>
     <w:p>
@@ -47252,6 +47252,11 @@
       </w:pPr>
       <w:r>
         <w:t>October 6 sketch-edit selection correction: in Plus Design, a plain point/edge/constraint click replaces the selected item; a repeated plain click retains that item. Ctrl or Shift permits native multi-selection. A plain empty-space click clears selection, while Ctrl/Shift empty clicks retain it. Persistent Selection controls retention after operations and must not turn plain clicks into multi-selection. Dragging, box selection, context-menu picks and Classic native behavior retain their own semantics. Palette feasibility checks use cloned solver data and must not report errors or warnings for unapplied hypothetical constraints. Quiet handling belongs only to that probe; actual modeling/constraint operations retain native diagnostics and Undo behavior. Both defects reproduce on the preceding delivered build: two plain point clicks accumulate selection, and the hypothetical coincidence of a line's endpoints repeatedly reports failed solvers and geometry errors. Rebuilt native acceptance: the grouped Release/x64 ALL_BUILD passes after incremental continuation of the first wrapper deadline; 66 rebuilt native binaries are staged and hash-verified. All 18 packaged native palette checks pass, plus three focused checks at increased Qt scale and three checks launched through the saved desktop shortcut. Actual point clicks, Ctrl/Shift and empty-space behavior, quiet hypothetical probes, retained live-operation diagnostics, native point dragging, Undo/Redo and FCStd save/reopen pass without application source overlays. The existing desktop shortcut target and working directory are reopened and verified. A separate Design-selection audit passes 18 of 19 checks; its unobscured-viewport hit-test returns no widget despite a visible/exposed window and remains unqualified. This does not establish broad workbench or physical owner acceptance. WORK_STATE records exact evidence, provenance and the remaining validation step.</w:t>
+      </w:r>
+    </w:p>
+    <w:p>
+      <w:r>
+        <w:t>October 6 medium ribbon icon enlargement: medium icons increase from 20 to 32 logical pixels and buttons from 38 to 42 pixels high, retaining two rows in the shared minimum 86-pixel grid. Medium/small buttons stay icon-only with native artwork, tooltips, action state and accessibility; large captions and gray group dividers are retained. Five installed native checks, two DPR 3.0 checks and two actual saved-desktop-shortcut checks pass without source overlays. Native paint captures confirm larger glyph area without clipping, all seven Design tabs are checked, and actual Box-button/Cancel preserves object identities. Native binaries and the preceding sketch-selection/quiet-probe fixes are reused unchanged. The owner DOCX render/inspection and final publication are recorded in WORK_STATE.</w:t>
       </w:r>
     </w:p>
     <w:sectPr>

</xml_diff>

<commit_message>
Inventory legacy component structure and plan native or dumb geometry recovery
</commit_message>
<xml_diff>
--- a/ai-instructions/ui/FreeCAD Plus UI & UX.docx
+++ b/ai-instructions/ui/FreeCAD Plus UI & UX.docx
@@ -47257,6 +47257,11 @@
     <w:p>
       <w:r>
         <w:t>October 6 medium ribbon icon enlargement: medium icons increase from 20 to 32 logical pixels and buttons from 38 to 42 pixels high, retaining two rows in the shared minimum 86-pixel grid. Medium/small buttons stay icon-only with native artwork, tooltips, action state and accessibility; large captions and gray group dividers are retained. Five installed native checks, two DPR 3.0 checks and two actual saved-desktop-shortcut checks pass without source overlays. Native paint captures confirm larger glyph area without clipping, all seven Design tabs are checked, and actual Box-button/Cancel preserves object identities. Native binaries and the preceding sketch-selection/quiet-probe fixes are reused unchanged. The owner DOCX render/inspection and final publication are recorded in WORK_STATE.</w:t>
+      </w:r>
+    </w:p>
+    <w:p>
+      <w:r>
+        <w:t>Legacy conversion planning inventories definitions, Body Tips, sketches, links, placements, properties and dependencies without modifying or recomputing the source. Preserve shared definitions and native editability. All feature tasks recover in this order: mapped feature, retained native feature, then explicitly reported dumb body, sheet or curve from validated evaluated geometry. Dumb recovery loses parametrics; stale caches remain unverified and unavailable outputs are reported. Task one provides planning only. Structure conversion and fallback creation follow later; WORK_STATE records acceptance and packaging.</w:t>
       </w:r>
     </w:p>
     <w:sectPr>

</xml_diff>

<commit_message>
Convert legacy model definitions and component instances with explicit geometry recovery
</commit_message>
<xml_diff>
--- a/ai-instructions/ui/FreeCAD Plus UI & UX.docx
+++ b/ai-instructions/ui/FreeCAD Plus UI & UX.docx
@@ -47260,8 +47260,11 @@
       </w:r>
     </w:p>
     <w:p>
-      <w:r>
-        <w:t>Legacy conversion planning inventories definitions, Body Tips, sketches, links, placements, properties and dependencies without modifying or recomputing the source. Preserve shared definitions and native editability. All feature tasks recover in this order: mapped feature, retained native feature, then explicitly reported dumb body, sheet or curve from validated evaluated geometry. Dumb recovery loses parametrics; stale caches remain unverified and unavailable outputs are reported. Task one provides planning only. Structure conversion and fallback creation follow later; WORK_STATE records acceptance and packaging.</w:t>
+      <w:pPr>
+        <w:keepLines/>
+      </w:pPr>
+      <w:r>
+        <w:t>When a legacy file opens, Models lists its part definitions and Part Tree shows linked instances beneath the permanent master. Repeated instances reference the same model. Review legacy conversion explains incomplete mappings, missing instances and any geometry-only recovery. Label recovered outputs as recovered geometry and explain that their parametric history has not been converted. Missing instances remain visible for repair. Save converted external parts as new .cadprt files before the parent, leaving legacy originals untouched.</w:t>
       </w:r>
     </w:p>
     <w:sectPr>

</xml_diff>

<commit_message>
Convert qualified native extrusion chains with explicit targets and results
</commit_message>
<xml_diff>
--- a/ai-instructions/ui/FreeCAD Plus UI & UX.docx
+++ b/ai-instructions/ui/FreeCAD Plus UI & UX.docx
@@ -47267,13 +47267,21 @@
         <w:t>When a legacy file opens, Models lists its part definitions and Part Tree shows linked instances beneath the permanent master. Repeated instances reference the same model. Review legacy conversion explains incomplete mappings, missing instances and any geometry-only recovery. Label recovered outputs as recovered geometry and explain that their parametric history has not been converted. Missing instances remain visible for repair. Save converted external parts as new .cadprt files before the parent, leaving legacy originals untouched.</w:t>
       </w:r>
       <w:r>
-        <w:t xml:space="preserve"> For supported simple Sketch and Pad histories, History lists the sketch, Pad operation and original Body result in that order, preserving their labels. Double-click the sketch to edit its constraints or Pad to open the Extrude task. Repeated instances update from the shared model. Review legacy conversion identifies histories that remain native and editable. Retained expressions use the property editor; unsupported operation or target changes explain the remaining conversion step.</w:t>
+        <w:t xml:space="preserve"> For supported simple Sketch and Pad histories, History lists the sketch, Pad operation and original Body result in that order, preserving their labels. Double-click the sketch to edit its constraints or Pad to open the Extrude task. Repeated instances update from the shared model. Review legacy conversion identifies histories that remain native and editable. Retained expressions use the property editor; operation and target changes reject downstream self-references and preserve the original feature identity.</w:t>
       </w:r>
       <w:r>
         <w:t xml:space="preserve"> Legacy datum planes, axes, points and coordinate systems retain their labels and native attachment settings. Body-owned datums appear as hidden links in component History. Double-click opens the original attachment editor; Cancel preserves supports and offsets. Retained planes are available to New Sketch and follow their native offsets and frame changes. Missing or invalid datum sources show Needs repair. Origins and their planes keep their existing names and permanent controls.</w:t>
       </w:r>
       <w:r>
         <w:t xml:space="preserve"> Retained Body-owned sketches appear as hidden links before their Body in History. Double-click edits the original sketch and its existing constraints; all consumers and repeated instances use that same sketch. Existing attachments, external references and expression-driven dimensions remain editable in their native controls. Missing or invalid sketch sources show Needs repair; repair the original input before using it.</w:t>
+      </w:r>
+    </w:p>
+    <w:p>
+      <w:pPr>
+        <w:keepLines/>
+      </w:pPr>
+      <w:r>
+        <w:t>Supported legacy Pad and Pocket chains appear in History as independent sketches and Extrude operations with explicit target bodies, ending in the original Body result. Double-click a converted Pocket opens the shared Extrude task with Subtract, its existing target and the correct direction selected. Accept updates the operation; Cancel leaves its saved parameters and target unchanged. Existing expression-driven parameters remain available in the property editor. Converted Pad/Pocket modes and targets can be edited while keeping the original feature. Standalone native Part Extrusion retains New Body; create a separate operation to change its operation kind. Retained native Pad/Pocket histories appear as hidden History links; double-click opens the original native editor with its attachments and extent references intact. Missing or invalid retained operation sources show Needs repair. Supported independent Part Extrusions also open in the shared task; custom direction, taper and sheet or curve outputs retain their native controls.</w:t>
       </w:r>
     </w:p>
     <w:sectPr>

</xml_diff>

<commit_message>
Preserve native revolution histories in legacy component conversion
</commit_message>
<xml_diff>
--- a/ai-instructions/ui/FreeCAD Plus UI & UX.docx
+++ b/ai-instructions/ui/FreeCAD Plus UI & UX.docx
@@ -47282,6 +47282,14 @@
       </w:pPr>
       <w:r>
         <w:t>Supported legacy Pad and Pocket chains appear in History as independent sketches and Extrude operations with explicit target bodies, ending in the original Body result. Double-click a converted Pocket opens the shared Extrude task with Subtract, its existing target and the correct direction selected. Accept updates the operation; Cancel leaves its saved parameters and target unchanged. Existing expression-driven parameters remain available in the property editor. Converted Pad/Pocket modes and targets can be edited while keeping the original feature. Standalone native Part Extrusion retains New Body; create a separate operation to change its operation kind. Retained native Pad/Pocket histories appear as hidden History links; double-click opens the original native editor with its attachments and extent references intact. Missing or invalid retained operation sources show Needs repair. Supported independent Part Extrusions also open in the shared task; custom direction, taper and sheet or curve outputs retain their native controls.</w:t>
+      </w:r>
+    </w:p>
+    <w:p>
+      <w:pPr>
+        <w:keepLines/>
+      </w:pPr>
+      <w:r>
+        <w:t>Supported legacy Revolution and Groove histories show their original sketches, Revolve operations, target bodies and final Body in History. Double-click opens the shared Revolve task with saved axes, angles, direction and signed start offset. Accept updates the operation; Cancel preserves saved settings. Preview follows rotated sketches and construction axes. Converted features retain their native Revolution or Groove type; create a separate operation to switch additive/subtractive type. Formulas remain editable in properties. Attached or reference-dependent histories and standalone Part Revolution retain their native editors and signed-axis controls. Missing or invalid retained sources show Needs repair. Review legacy conversion distinguishes mapped operations from retained native histories. Undo/Redo restores conversion and edits without stale component views.</w:t>
       </w:r>
     </w:p>
     <w:sectPr>

</xml_diff>

<commit_message>
Preserve ordered native lofts in legacy component conversion
</commit_message>
<xml_diff>
--- a/ai-instructions/ui/FreeCAD Plus UI & UX.docx
+++ b/ai-instructions/ui/FreeCAD Plus UI & UX.docx
@@ -47290,6 +47290,14 @@
       </w:pPr>
       <w:r>
         <w:t>Supported legacy Revolution and Groove histories show their original sketches, Revolve operations, target bodies and final Body in History. Double-click opens the shared Revolve task with saved axes, angles, direction and signed start offset. Accept updates the operation; Cancel preserves saved settings. Preview follows rotated sketches and construction axes. Converted features retain their native Revolution or Groove type; create a separate operation to switch additive/subtractive type. Formulas remain editable in properties. Attached or reference-dependent histories and standalone Part Revolution retain their native editors and signed-axis controls. Missing or invalid retained sources show Needs repair. Review legacy conversion distinguishes mapped operations from retained native histories. Undo/Redo restores conversion and edits without stale component views.</w:t>
+      </w:r>
+    </w:p>
+    <w:p>
+      <w:pPr>
+        <w:keepLines/>
+      </w:pPr>
+      <w:r>
+        <w:t>Supported legacy Lofts show their original section sketches before Loft operations, explicit target bodies and the final Body in History. Double-click opens the shared Loft task with sections in their saved order and existing Smooth/Ruled, Closed, Refine and tolerance settings. Preview section reorder or replacement before Accept; Cancel preserves saved sections and targets. Converted Loft modes and targets can change while keeping the original Loft. Vertex end sections retain their picks. Formula-driven settings use properties. Attached histories, native Common operations and legacy sketch-edge references that mean the whole sketch retain the original native editor. Standalone Part Loft retains its native degree, linearization and solid/sheet controls. Missing or invalid retained sources show Needs repair. Undo/Redo restores conversion and edits; repeated instances update from the shared model.</w:t>
       </w:r>
     </w:p>
     <w:sectPr>

</xml_diff>

<commit_message>
Map legacy Pipe histories while preserving native references
</commit_message>
<xml_diff>
--- a/ai-instructions/ui/FreeCAD Plus UI & UX.docx
+++ b/ai-instructions/ui/FreeCAD Plus UI & UX.docx
@@ -47298,6 +47298,14 @@
       </w:pPr>
       <w:r>
         <w:t>Supported legacy Lofts show their original section sketches before Loft operations, explicit target bodies and the final Body in History. Double-click opens the shared Loft task with sections in their saved order and existing Smooth/Ruled, Closed, Refine and tolerance settings. Preview section reorder or replacement before Accept; Cancel preserves saved sections and targets. Converted Loft modes and targets can change while keeping the original Loft. Vertex end sections retain their picks. Formula-driven settings use properties. Attached histories, native Common operations and legacy sketch-edge references that mean the whole sketch retain the original native editor. Standalone Part Loft retains its native degree, linearization and solid/sheet controls. Missing or invalid retained sources show Needs repair. Undo/Redo restores conversion and edits; repeated instances update from the shared model.</w:t>
+      </w:r>
+    </w:p>
+    <w:p>
+      <w:pPr>
+        <w:keepLines/>
+      </w:pPr>
+      <w:r>
+        <w:t>Supported legacy Pipes show their original profile sections and path sketches before Pipe operations, explicit target bodies and the final Body in History. Double-click opens the shared Pipe task with saved section order, path and auxiliary edge picks, orientation, corner transition and Constant/Multisection settings. Preview changes before Accept; Cancel preserves saved references and targets. Converted Pipe modes and targets can change while keeping the original feature. Formula-driven settings use properties. Attached or unsupported histories, native Common operations and whole-sketch edge references retain the original native editor. Standalone Part Sweep retains its native solid/sheet, Frenet and linearization controls. Missing or invalid retained sources show Needs repair; unavailable selected path edges give a repair message. Review legacy conversion identifies stale outputs requiring recompute. Undo/Redo restores conversion and edits; repeated instances update from their shared model.</w:t>
       </w:r>
     </w:p>
     <w:sectPr>

</xml_diff>

<commit_message>
Migrate bounded legacy Helix and primitive histories
</commit_message>
<xml_diff>
--- a/ai-instructions/ui/FreeCAD Plus UI & UX.docx
+++ b/ai-instructions/ui/FreeCAD Plus UI & UX.docx
@@ -47306,6 +47306,22 @@
       </w:pPr>
       <w:r>
         <w:t>Supported legacy Pipes show their original profile sections and path sketches before Pipe operations, explicit target bodies and the final Body in History. Double-click opens the shared Pipe task with saved section order, path and auxiliary edge picks, orientation, corner transition and Constant/Multisection settings. Preview changes before Accept; Cancel preserves saved references and targets. Converted Pipe modes and targets can change while keeping the original feature. Formula-driven settings use properties. Attached or unsupported histories, native Common operations and whole-sketch edge references retain the original native editor. Standalone Part Sweep retains its native solid/sheet, Frenet and linearization controls. Missing or invalid retained sources show Needs repair; unavailable selected path edges give a repair message. Review legacy conversion identifies stale outputs requiring recompute. Undo/Redo restores conversion and edits; repeated instances update from their shared model.</w:t>
+      </w:r>
+    </w:p>
+    <w:p>
+      <w:pPr>
+        <w:keepLines/>
+      </w:pPr>
+      <w:r>
+        <w:t>Supported legacy Helix histories show original profiles before Helix operations, explicit targets and the final Body in History. Double-click opens the shared Helix task with saved parameter mode, pitch, height, turns, cone angle or growth, axis, handedness and direction. Preview changes before Accept; Cancel preserves saved settings and references. Converted modes and targets retain the original Helix feature. Formula-driven parameters remain editable in properties. Attached or unsupported axes and histories retain their native editors and available geometry. Standalone Part Helix retains its native curve controls. Review legacy conversion identifies unverified output requiring recompute; missing retained sources show Needs repair. Undo/Redo restores conversion and edits; repeated instances update from the shared model.</w:t>
+      </w:r>
+    </w:p>
+    <w:p>
+      <w:pPr>
+        <w:keepLines/>
+      </w:pPr>
+      <w:r>
+        <w:t>Supported legacy Box, Cylinder, Sphere, Cone, Ellipsoid, Torus, Prism and Wedge histories show Primitive operations with explicit targets and the final Body in History. Double-click opens the shared Primitive task with the saved shape, native dimensions and placement. Preview changes before Accept; Cancel preserves saved settings. Converted Add/Subtract/New Body modes and targets retain the original primitive; create a separate operation to change its shape type. Formula-driven dimensions use properties. Attached or unsupported histories retain the original native editor. Standalone Part primitives retain their native controls. Review legacy conversion identifies stale or unavailable output; missing retained sources show Needs repair. Undo/Redo restores conversion and edits; shared instances update together.</w:t>
       </w:r>
     </w:p>
     <w:sectPr>

</xml_diff>

<commit_message>
Expose native finishing operations in migrated component History
</commit_message>
<xml_diff>
--- a/ai-instructions/ui/FreeCAD Plus UI & UX.docx
+++ b/ai-instructions/ui/FreeCAD Plus UI & UX.docx
@@ -47322,6 +47322,22 @@
       </w:pPr>
       <w:r>
         <w:t>Supported legacy Box, Cylinder, Sphere, Cone, Ellipsoid, Torus, Prism and Wedge histories show Primitive operations with explicit targets and the final Body in History. Double-click opens the shared Primitive task with the saved shape, native dimensions and placement. Preview changes before Accept; Cancel preserves saved settings. Converted Add/Subtract/New Body modes and targets retain the original primitive; create a separate operation to change its shape type. Formula-driven dimensions use properties. Attached or unsupported histories retain the original native editor. Standalone Part primitives retain their native controls. Review legacy conversion identifies stale or unavailable output; missing retained sources show Needs repair. Undo/Redo restores conversion and edits; shared instances update together.</w:t>
+      </w:r>
+    </w:p>
+    <w:p>
+      <w:pPr>
+        <w:keepLines/>
+      </w:pPr>
+      <w:r>
+        <w:t>Legacy Fillet, Chamfer, Draft and Thickness operations appear in component History while retaining their native Body and selected faces or edges. Double-click opens the original native editor with saved settings. Standalone Part dress-ups retain their original controls and outputs. Missing or invalid retained sources show Needs repair; Review legacy conversion identifies unverified output requiring recompute.</w:t>
+      </w:r>
+    </w:p>
+    <w:p>
+      <w:pPr>
+        <w:keepLines/>
+      </w:pPr>
+      <w:r>
+        <w:t>Legacy patterns and transformations appear in History with referenced inputs before consumers, retaining authored order where compatible. Double-click opens the native editor with saved originals, direction or axis references and transformation settings. MultiTransform preserves its ordered transformations; combined Pattern retains both Linear and Circular settings and suppressed copies. Boolean History opens the original native editor with its saved operation, target and tool Bodies. Native owners and geometry remain retained; these operations are not presented as newly flattened shared operations. Undo/Redo restores conversion and edits; saved files preserve the original model shared by repeated instances.</w:t>
       </w:r>
     </w:p>
     <w:sectPr>

</xml_diff>

<commit_message>
Qualify grouped legacy migration and portable owner delivery
</commit_message>
<xml_diff>
--- a/ai-instructions/ui/FreeCAD Plus UI & UX.docx
+++ b/ai-instructions/ui/FreeCAD Plus UI & UX.docx
@@ -47338,6 +47338,14 @@
       </w:pPr>
       <w:r>
         <w:t>Legacy patterns and transformations appear in History with referenced inputs before consumers, retaining authored order where compatible. Double-click opens the native editor with saved originals, direction or axis references and transformation settings. MultiTransform preserves its ordered transformations; combined Pattern retains both Linear and Circular settings and suppressed copies. Boolean History opens the original native editor with its saved operation, target and tool Bodies. Native owners and geometry remain retained; these operations are not presented as newly flattened shared operations. Undo/Redo restores conversion and edits; saved files preserve the original model shared by repeated instances.</w:t>
+      </w:r>
+    </w:p>
+    <w:p>
+      <w:pPr>
+        <w:keepLines/>
+      </w:pPr>
+      <w:r>
+        <w:t>Open legacy FCStd files through File &gt; Open. Models contains definitions, Part Tree contains linked instances, and History shows inputs, operations and finished results. Mapped operations use the shared task; retained operations open their original native editor. Save converted content to a new cadprt file, saving external definitions before their parent. Legacy originals remain protected. Missing definitions remain visible; right-click and choose Locate Component File to repair them before saving. Review legacy conversion identifies retained native histories, unverified caches and explicit dumb geometry recovery. Geometry-only recovery preserves available output while reporting loss of parametric component editing. Repeated instances share model edits; instance placements remain independent.</w:t>
       </w:r>
     </w:p>
     <w:sectPr>

</xml_diff>

<commit_message>
Implement domestic and external component file hierarchy
</commit_message>
<xml_diff>
--- a/ai-instructions/ui/FreeCAD Plus UI & UX.docx
+++ b/ai-instructions/ui/FreeCAD Plus UI & UX.docx
@@ -108,7 +108,7 @@
         <w:rPr>
           <w:rtl w:val="0"/>
         </w:rPr>
-        <w:t xml:space="preserve">New Component creates a definition without requiring a placed instance. Add Component creates or selects a definition and places a linked instance under the active component.</w:t>
+        <w:t xml:space="preserve">New Component creates a domestic or external definition without a placed instance. Add Component creates or selects a definition and places one linked instance under the active component.</w:t>
       </w:r>
     </w:p>
     <w:p>
@@ -204,7 +204,7 @@
         <w:rPr>
           <w:rtl w:val="0"/>
         </w:rPr>
-        <w:t xml:space="preserve">Models is the first tab: a flat, non-expandable list of component definitions and the number of their instances.</w:t>
+        <w:t xml:space="preserve">Models is the first tab: domestic definitions first, then expandable imported-file groups containing all definitions and any nested imported files. Retain instance counts.</w:t>
       </w:r>
     </w:p>
     <w:p>
@@ -42825,7 +42825,7 @@
         <w:rPr>
           <w:rtl w:val="0"/>
         </w:rPr>
-        <w:t xml:space="preserve">Models: flat component definitions with instance counts.</w:t>
+        <w:t xml:space="preserve">Models: domestic definitions first, followed by nested imported-file groups and component instance counts.</w:t>
       </w:r>
     </w:p>
     <w:p>
@@ -42971,7 +42971,7 @@
         <w:rPr>
           <w:rtl w:val="0"/>
         </w:rPr>
-        <w:t xml:space="preserve">Models: first tab, flat component definitions with instance counts, including definitions with no placed instances.</w:t>
+        <w:t xml:space="preserve">Models: first tab, domestic definitions first, then expandable imported-file groups. Include unused definitions and nested imported files, with component instance counts.</w:t>
       </w:r>
     </w:p>
     <w:p>
@@ -43645,7 +43645,7 @@
         <w:rPr>
           <w:rtl w:val="0"/>
         </w:rPr>
-        <w:t xml:space="preserve">New Component creates a definition in Models; Add Component places one linked instance under the active component.</w:t>
+        <w:t xml:space="preserve">New Component offers domestic storage in the active component’s defining file, a new external file, or an existing external file. Choose a location for a new file or select the existing file, then enter a unique component name. Creation does not place an instance. Add Component places one linked instance under the active component.</w:t>
       </w:r>
     </w:p>
     <w:p>
@@ -43703,6 +43703,120 @@
           <w:rtl w:val="0"/>
         </w:rPr>
         <w:t xml:space="preserve">Deleting an instance from Part Tree leaves its definition available in Models.</w:t>
+      </w:r>
+    </w:p>
+    <w:p>
+      <w:pPr>
+        <w:numPr>
+          <w:ilvl w:val="0"/>
+          <w:numId w:val="4"/>
+        </w:numPr>
+        <w:tabs>
+          <w:tab w:val="left" w:leader="none" w:pos="810"/>
+        </w:tabs>
+        <w:ind w:left="720" w:hanging="360"/>
+        <w:rPr/>
+      </w:pPr>
+      <w:r>
+        <w:rPr>
+          <w:rtl w:val="0"/>
+        </w:rPr>
+        <w:t xml:space="preserve">Domestic components belong to the current file. External components belong to imported files. Display a domestic name as M3 screw and an external name as M3 screw (Hardware). The qualifier is the source filename; use its path when identical filenames would be ambiguous. Names must be unique within a file, but different files may contain components with the same name.</w:t>
+      </w:r>
+    </w:p>
+    <w:p>
+      <w:pPr>
+        <w:numPr>
+          <w:ilvl w:val="0"/>
+          <w:numId w:val="4"/>
+        </w:numPr>
+        <w:tabs>
+          <w:tab w:val="left" w:leader="none" w:pos="810"/>
+        </w:tabs>
+        <w:ind w:left="720" w:hanging="360"/>
+        <w:rPr/>
+      </w:pPr>
+      <w:r>
+        <w:rPr>
+          <w:rtl w:val="0"/>
+        </w:rPr>
+        <w:t xml:space="preserve">Import Component File adds a collapsible file group to Models without placing a component. Show all components in that file, including unused components, and nested file imports beneath its definitions. Removing the last placed instance retains the imported file in Models. A missing file remains visible with Locate Component File for recovery.</w:t>
+      </w:r>
+    </w:p>
+    <w:p>
+      <w:pPr>
+        <w:numPr>
+          <w:ilvl w:val="0"/>
+          <w:numId w:val="4"/>
+        </w:numPr>
+        <w:tabs>
+          <w:tab w:val="left" w:leader="none" w:pos="810"/>
+        </w:tabs>
+        <w:ind w:left="720" w:hanging="360"/>
+        <w:rPr/>
+      </w:pPr>
+      <w:r>
+        <w:rPr>
+          <w:rtl w:val="0"/>
+        </w:rPr>
+        <w:t xml:space="preserve">Activating an external component edits its defining file. New components and file imports use that defining file. A subcomponent must be domestic to that file or available through a file imported directly there. For example, activate M3 screw (Hardware), import Coatings into Hardware, then add a Coatings component beneath M3 screw. Block circular file imports and circular component nesting immediately.</w:t>
+      </w:r>
+    </w:p>
+    <w:p>
+      <w:pPr>
+        <w:numPr>
+          <w:ilvl w:val="0"/>
+          <w:numId w:val="4"/>
+        </w:numPr>
+        <w:tabs>
+          <w:tab w:val="left" w:leader="none" w:pos="810"/>
+        </w:tabs>
+        <w:ind w:left="720" w:hanging="360"/>
+        <w:rPr/>
+      </w:pPr>
+      <w:r>
+        <w:rPr>
+          <w:rtl w:val="0"/>
+        </w:rPr>
+        <w:t xml:space="preserve">Edits to an external component save to its defining file. Other assemblies using that file receive the saved change when they reopen. Display the external file qualifier in the editing indication so the destination of shared edits is clear.</w:t>
+      </w:r>
+    </w:p>
+    <w:p>
+      <w:pPr>
+        <w:numPr>
+          <w:ilvl w:val="0"/>
+          <w:numId w:val="4"/>
+        </w:numPr>
+        <w:tabs>
+          <w:tab w:val="left" w:leader="none" w:pos="810"/>
+        </w:tabs>
+        <w:ind w:left="720" w:hanging="360"/>
+        <w:rPr/>
+      </w:pPr>
+      <w:r>
+        <w:rPr>
+          <w:rtl w:val="0"/>
+        </w:rPr>
+        <w:t xml:space="preserve">Copy to Domestic Components creates a separate definition and copies its domestic subcomponent hierarchy. Existing external child definitions remain shared. Prompt with a checklist of placements in the domestic file to replace; leave all unchecked by default. Cancel keeps the new copy and leaves placements unchanged. Preserve placement positions when replacing. Explain any downstream reference or display override that must be repaired before replacement.</w:t>
+      </w:r>
+    </w:p>
+    <w:p>
+      <w:pPr>
+        <w:numPr>
+          <w:ilvl w:val="0"/>
+          <w:numId w:val="4"/>
+        </w:numPr>
+        <w:tabs>
+          <w:tab w:val="left" w:leader="none" w:pos="810"/>
+        </w:tabs>
+        <w:ind w:left="720" w:hanging="360"/>
+        <w:rPr/>
+      </w:pPr>
+      <w:r>
+        <w:rPr>
+          <w:rtl w:val="0"/>
+        </w:rPr>
+        <w:t xml:space="preserve">Copy to External File creates an independent file definition and retains the original definition and its placements. Do not offer an identity-preserving move between domestic and external storage. Editing a copied definition does not change the original definition.</w:t>
       </w:r>
     </w:p>
     <w:p>

</xml_diff>

<commit_message>
Keep placed model editing in the current component tab
</commit_message>
<xml_diff>
--- a/ai-instructions/ui/FreeCAD Plus UI & UX.docx
+++ b/ai-instructions/ui/FreeCAD Plus UI & UX.docx
@@ -42841,10 +42841,7 @@
         <w:rPr/>
       </w:pPr>
       <w:r>
-        <w:rPr>
-          <w:rtl w:val="0"/>
-        </w:rPr>
-        <w:t xml:space="preserve">Part Tree: expandable linked instances, with the top-level part first.</w:t>
+        <w:t>Part Tree: the file is the pinned top-level container, identified by its file name and FreeCAD icon. Linked component instances appear beneath it.</w:t>
       </w:r>
     </w:p>
     <w:p>
@@ -42984,10 +42981,7 @@
         <w:rPr/>
       </w:pPr>
       <w:r>
-        <w:rPr>
-          <w:rtl w:val="0"/>
-        </w:rPr>
-        <w:t xml:space="preserve">The first component created automatically with every new document is the master component (Part001 by default). It is permanent, cannot be deleted and always appears first in Models and Part Tree. Renaming preserves its master identity.</w:t>
+        <w:t>A new document creates a domestic Part001 definition, places its first occurrence beneath the file, and enters Edit for that component. Part001 is ordinary: it can be renamed, removed or deleted. An empty file is valid. Existing documents gain the file container without adding another Part001 or changing component identities, geometry, placements or references.</w:t>
       </w:r>
     </w:p>
     <w:p>
@@ -43000,10 +42994,31 @@
         <w:rPr/>
       </w:pPr>
       <w:r>
-        <w:rPr>
-          <w:rtl w:val="0"/>
-        </w:rPr>
-        <w:t xml:space="preserve">Double-clicking or opening another component changes the active editing component and History without changing the Part Tree root or its master-first order.</w:t>
+        <w:t>Edit is the user-facing term for making a component active. Double-click or Edit in Models or Part Tree changes the active component and displays its History within the current file tab. Single-click only selects. Open in new window is available in both context menus and opens a component in a new file tab.</w:t>
+      </w:r>
+    </w:p>
+    <w:p>
+      <w:pPr/>
+      <w:r>
+        <w:t>All occurrences of the active definition use bold name text and the configured active-item fill color in Models and Part Tree. The chosen occurrence retains a separate selection indicator. Models Edit reuses the last edited occurrence in the current tab, otherwise the first occurrence in Part Tree.</w:t>
+      </w:r>
+    </w:p>
+    <w:p>
+      <w:pPr/>
+      <w:r>
+        <w:t>Geometry outside the chosen active occurrence and all its descendants is at least 75% transparent, preserving any greater existing transparency. Other occurrences of the same definition are also faded. Restore normal appearance when the edit context changes; authored visibility and transparency are preserved.</w:t>
+      </w:r>
+    </w:p>
+    <w:p>
+      <w:pPr/>
+      <w:r>
+        <w:t>Editing the file row shows only its fixed Origin and origin planes in History, with visibility controls. These establish global coordinates and support placement and assembly alignment. Geometry creation and editing require explicitly activating a component. Every component retains its own origin. When the file is active, all components use their normal transparency.</w:t>
+      </w:r>
+    </w:p>
+    <w:p>
+      <w:pPr/>
+      <w:r>
+        <w:t>Importing external files adds their models to Models only; an entire external file cannot be inserted as a Part Tree occurrence. Changes to the Add Component workflow are deferred.</w:t>
       </w:r>
     </w:p>
     <w:p>
@@ -43016,10 +43031,7 @@
         <w:rPr/>
       </w:pPr>
       <w:r>
-        <w:rPr>
-          <w:rtl w:val="0"/>
-        </w:rPr>
-        <w:t xml:space="preserve">List unused components as separate top-level assemblies below the master assembly in Part Tree, with their own nested child instances. They remain outside the master assembly structure and add no master instances or BOM counts. Show unused descendants under their unused parent rather than duplicating them as roots.</w:t>
+        <w:t>Editing an unused model temporarily displays it as the last Part Tree item, labelled Component name (unused model), retaining external-file qualification. Apply active fill and bold text. The temporary item supports editing but cannot be reordered or treated as a permanent assembly occurrence.</w:t>
       </w:r>
     </w:p>
     <w:p>
@@ -43032,10 +43044,7 @@
         <w:rPr/>
       </w:pPr>
       <w:r>
-        <w:rPr>
-          <w:rtl w:val="0"/>
-        </w:rPr>
-        <w:t xml:space="preserve">Deleting the last instance retains its model and exposes its unused assembly in Part Tree. Placing it in the master assembly restores its linked branch. Preserve master identity and unused trees through Undo/Redo and save/reopen.</w:t>
+        <w:t>While editing an unused model, gray all existing Part Tree entries and force their geometry hidden. Those entries remain selectable and available for Edit; visibility controls cannot override this hiding. Editing another component or the file removes the temporary item and restores prior visibility. Saving retains component edits but excludes the temporary entry and temporary hiding state.</w:t>
       </w:r>
     </w:p>
     <w:p>
@@ -43051,10 +43060,7 @@
         <w:rPr/>
       </w:pPr>
       <w:r>
-        <w:rPr>
-          <w:rtl w:val="0"/>
-        </w:rPr>
-        <w:t xml:space="preserve">Part Tree: linked component instances with Cut/Paste and drag/drop rearrangement; keep the top-level part first.</w:t>
+        <w:t>Part Tree: linked component instances support Cut/Paste and drag/drop rearrangement beneath the pinned file container. File-level assembly relationships and placement controls are managed here without file-owned modeling geometry.</w:t>
       </w:r>
     </w:p>
     <w:p>

</xml_diff>

<commit_message>
Edit unused component models in a temporary current-tab view
</commit_message>
<xml_diff>
--- a/ai-instructions/ui/FreeCAD Plus UI & UX.docx
+++ b/ai-instructions/ui/FreeCAD Plus UI & UX.docx
@@ -43031,7 +43031,7 @@
         <w:rPr/>
       </w:pPr>
       <w:r>
-        <w:t>Editing an unused model temporarily displays it as the last Part Tree item, labelled Component name (unused model), retaining external-file qualification. Apply active fill and bold text. The temporary item supports editing but cannot be reordered or treated as a permanent assembly occurrence.</w:t>
+        <w:t>Editing an unused model temporarily displays it as the last Part Tree item, labelled Component name (unused model), retaining external-file qualification. Apply active fill and bold text. The temporary item supports editing but cannot be reordered or treated as a permanent assembly occurrence. Unused models otherwise remain in Models only; they do not appear as additional permanent Part Tree roots. Child components remain available for editing within the temporary view.</w:t>
       </w:r>
     </w:p>
     <w:p>
@@ -43044,7 +43044,7 @@
         <w:rPr/>
       </w:pPr>
       <w:r>
-        <w:t>While editing an unused model, gray all existing Part Tree entries and force their geometry hidden. Those entries remain selectable and available for Edit; visibility controls cannot override this hiding. Editing another component or the file removes the temporary item and restores prior visibility. Saving retains component edits but excludes the temporary entry and temporary hiding state.</w:t>
+        <w:t>While editing an unused model, gray all existing Part Tree entries and force their geometry hidden. Those entries remain selectable and available for Edit; visibility controls cannot override this hiding. Editing another component or the file removes the temporary item and restores prior visibility. Saving retains component edits but excludes the temporary entry and temporary hiding state. The temporary view does not change the assembly visibility settings saved with the file.</w:t>
       </w:r>
     </w:p>
     <w:p>

</xml_diff>

<commit_message>
Render active component context with preserved appearance and picking
</commit_message>
<xml_diff>
--- a/ai-instructions/ui/FreeCAD Plus UI & UX.docx
+++ b/ai-instructions/ui/FreeCAD Plus UI & UX.docx
@@ -43006,7 +43006,7 @@
     <w:p>
       <w:pPr/>
       <w:r>
-        <w:t>Geometry outside the chosen active occurrence and all its descendants is at least 75% transparent, preserving any greater existing transparency. Other occurrences of the same definition are also faded. Restore normal appearance when the edit context changes; authored visibility and transparency are preserved.</w:t>
+        <w:t>Geometry outside the chosen active occurrence and all its descendants is at least 75% transparent, preserving any greater existing transparency. Other occurrences of the same definition are also faded. Restore normal appearance when the edit context changes; authored visibility and transparency are preserved. Preserve component and individual face colors. Apply the transparency floor separately to each material, retaining faces already more transparent than 75%. This display belongs to the current file tab and does not change saved appearance settings.</w:t>
       </w:r>
     </w:p>
     <w:p>
@@ -43180,7 +43180,7 @@
     <w:p>
       <w:pPr>
         <w:pStyle w:val="Heading1"/>
-        <w:keepNext w:val="0"/>
+        <w:keepNext/>
         <w:keepLines w:val="0"/>
         <w:numPr>
           <w:ilvl w:val="0"/>

</xml_diff>

<commit_message>
Create active Part001 beneath a pinned file workspace
</commit_message>
<xml_diff>
--- a/ai-instructions/ui/FreeCAD Plus UI & UX.docx
+++ b/ai-instructions/ui/FreeCAD Plus UI & UX.docx
@@ -268,7 +268,7 @@
         <w:rPr>
           <w:rtl w:val="0"/>
         </w:rPr>
-        <w:t xml:space="preserve">Keep the top-level part, Part001 by default, first. Show the assembly hierarchy beneath it.</w:t>
+        <w:t>Keep the file first as the pinned top-level container, with the FreeCAD icon and file name. Show component occurrences beneath it; Part001 is an ordinary component.</w:t>
       </w:r>
     </w:p>
     <w:p>
@@ -42841,7 +42841,7 @@
         <w:rPr/>
       </w:pPr>
       <w:r>
-        <w:t>Part Tree: the file is the pinned top-level container, identified by its file name and FreeCAD icon. Linked component instances appear beneath it.</w:t>
+        <w:t>Part Tree: the file is the pinned top-level container, identified by its file name and FreeCAD icon. Linked component instances appear beneath it. The file container is not a component model in Models. Renaming the file row changes the file display name without renaming any component.</w:t>
       </w:r>
     </w:p>
     <w:p>

</xml_diff>

<commit_message>
Wrap external component destinations in file containers
</commit_message>
<xml_diff>
--- a/ai-instructions/ui/FreeCAD Plus UI & UX.docx
+++ b/ai-instructions/ui/FreeCAD Plus UI & UX.docx
@@ -43651,7 +43651,7 @@
         <w:rPr>
           <w:rtl w:val="0"/>
         </w:rPr>
-        <w:t xml:space="preserve">New Component offers domestic storage in the active component’s defining file, a new external file, or an existing external file. Choose a location for a new file or select the existing file, then enter a unique component name. Creation does not place an instance. Add Component places one linked instance under the active component.</w:t>
+        <w:t>New Component offers domestic storage in the active component’s defining file, a new external file, or an existing external file. Choose a location for a new file or select the existing file, then enter a unique component name. Creation does not place an instance in the current assembly. A new external file contains the named component beneath its pinned file row, without an extra Part001. Add Component places one linked instance under the active component.</w:t>
       </w:r>
     </w:p>
     <w:p>
@@ -43822,7 +43822,7 @@
         <w:rPr>
           <w:rtl w:val="0"/>
         </w:rPr>
-        <w:t xml:space="preserve">Copy to External File creates an independent file definition and retains the original definition and its placements. Do not offer an identity-preserving move between domestic and external storage. Editing a copied definition does not change the original definition.</w:t>
+        <w:t>Copy to External File creates an independent file definition and retains the original definition and its placements. Do not offer an identity-preserving move between domestic and external storage. Editing a copied definition does not change the original definition. The destination file places the copied component beneath its pinned file row, without creating an extra Part001.</w:t>
       </w:r>
     </w:p>
     <w:p>
@@ -44329,7 +44329,7 @@
     <w:p>
       <w:pPr>
         <w:pStyle w:val="Heading4"/>
-        <w:keepNext w:val="0"/>
+        <w:keepNext/>
         <w:keepLines w:val="0"/>
         <w:pageBreakBefore w:val="0"/>
         <w:widowControl w:val="1"/>

</xml_diff>

<commit_message>
Migrate opened component files to pinned file containers
</commit_message>
<xml_diff>
--- a/ai-instructions/ui/FreeCAD Plus UI & UX.docx
+++ b/ai-instructions/ui/FreeCAD Plus UI & UX.docx
@@ -42983,6 +42983,9 @@
       <w:r>
         <w:t>A new document creates a domestic Part001 definition, places its first occurrence beneath the file, and enters Edit for that component. Part001 is ordinary: it can be renamed, removed or deleted. An empty file is valid. Existing documents gain the file container without adding another Part001 or changing component identities, geometry, placements or references.</w:t>
       </w:r>
+      <w:r>
+        <w:t xml:space="preserve"> Opening an older .cadprt file adds this container in memory after checking the saved file. The original on disk stays unchanged until Save. The added file row stays pinned through Undo; reopening an upgraded file does not add another container.</w:t>
+      </w:r>
     </w:p>
     <w:p>
       <w:pPr>
@@ -43016,6 +43019,9 @@
       <w:pPr/>
       <w:r>
         <w:t>Editing the file row shows only its fixed Origin and origin planes in History, with visibility controls. These establish global coordinates and support placement and assembly alignment. Geometry creation and editing require explicitly activating a component. Every component retains its own origin. When the file is active, all components use their normal transparency.</w:t>
+      </w:r>
+      <w:r>
+        <w:t xml:space="preserve"> File Edit refreshes references within its domestic component assembly without creating file-owned geometry or History entries.</w:t>
       </w:r>
     </w:p>
     <w:p>

</xml_diff>

<commit_message>
Integrate legacy conversion with transactional file containers
</commit_message>
<xml_diff>
--- a/ai-instructions/ui/FreeCAD Plus UI & UX.docx
+++ b/ai-instructions/ui/FreeCAD Plus UI & UX.docx
@@ -47409,7 +47409,7 @@
         <w:keepLines/>
       </w:pPr>
       <w:r>
-        <w:t>When a legacy file opens, Models lists its part definitions and Part Tree shows linked instances beneath the permanent master. Repeated instances reference the same model. Review legacy conversion explains incomplete mappings, missing instances and any geometry-only recovery. Label recovered outputs as recovered geometry and explain that their parametric history has not been converted. Missing instances remain visible for repair. Save converted external parts as new .cadprt files before the parent, leaving legacy originals untouched.</w:t>
+        <w:t>When a legacy file opens, Models lists its part definitions and Part Tree shows linked instances beneath the pinned file row. Repeated instances reference the same model. Review legacy conversion explains incomplete mappings, missing instances and any geometry-only recovery. Label recovered outputs as recovered geometry and explain that their parametric history has not been converted. Missing instances remain visible for repair. Save converted external parts as new .cadprt files before the parent, leaving legacy originals untouched.</w:t>
       </w:r>
       <w:r>
         <w:t xml:space="preserve"> For supported simple Sketch and Pad histories, History lists the sketch, Pad operation and original Body result in that order, preserving their labels. Double-click the sketch to edit its constraints or Pad to open the Extrude task. Repeated instances update from the shared model. Review legacy conversion identifies histories that remain native and editable. Retained expressions use the property editor; operation and target changes reject downstream self-references and preserve the original feature identity.</w:t>
@@ -47491,6 +47491,9 @@
       </w:pPr>
       <w:r>
         <w:t>Open legacy FCStd files through File &gt; Open. Models contains definitions, Part Tree contains linked instances, and History shows inputs, operations and finished results. Mapped operations use the shared task; retained operations open their original native editor. Save converted content to a new cadprt file, saving external definitions before their parent. Legacy originals remain protected. Missing definitions remain visible; right-click and choose Locate Component File to repair them before saving. Review legacy conversion identifies retained native histories, unverified caches and explicit dumb geometry recovery. Geometry-only recovery preserves available output while reporting loss of parametric component editing. Repeated instances share model edits; instance placements remain independent.</w:t>
+      </w:r>
+      <w:r>
+        <w:t xml:space="preserve"> Conversion and geometry-only recovery both add the pinned file row, with its global Origin, above the converted domestic component. Recovered outputs belong to that component; the file has no modeling geometry. The file row is excluded from Models. One Undo reverses the entire conversion, including the file container, and Redo restores it. No additional Part001 is created.</w:t>
       </w:r>
     </w:p>
     <w:p>

</xml_diff>

<commit_message>
Add file-level fixed relationship creation and review controls
</commit_message>
<xml_diff>
--- a/ai-instructions/ui/FreeCAD Plus UI & UX.docx
+++ b/ai-instructions/ui/FreeCAD Plus UI & UX.docx
@@ -43085,6 +43085,22 @@
       </w:r>
       <w:r>
         <w:t xml:space="preserve"> With the file in Edit, right-click one top-level occurrence to Ground component at its current position or Unground component. Grounding applies to that occurrence, including occurrences of external models, and does not change the shared definition. Expand grouped instances to choose one occurrence. Nested or multiple selections, component Edit, unused-model Edit and unfinished tasks cannot change file grounding. Selecting the file once does not enter Edit. Grounding and ungrounding support Undo/Redo and keep the current tab and origin-only Model History. Changing Edit context while a menu is open cancels that action.</w:t>
+      </w:r>
+    </w:p>
+    <w:p>
+      <w:pPr>
+        <w:numPr>
+          <w:ilvl w:val="0"/>
+          <w:numId w:val="6"/>
+        </w:numPr>
+        <w:tabs>
+          <w:tab w:val="left" w:leader="none" w:pos="810"/>
+        </w:tabs>
+        <w:ind w:left="720" w:hanging="360"/>
+        <w:rPr/>
+      </w:pPr>
+      <w:r>
+        <w:t>Fixed relationships: while the file is in Edit, select two individual top-level occurrences and choose Fix relative position. Their current positions and orientations are retained; at least one must already be grounded or connected to a ground. Right-click the file or an occurrence and choose Assembly relationships to review Ground and Fixed relationships. Entries identify components by qualified name and occurrence number. Selecting entries highlights their components without changing Edit context or Model History. Edit fixed offset changes the second component relative to the first using X, Y and Z in millimeters and yaw, pitch and roll in degrees. Cancel or accepting unchanged values makes no change. Remove selected removes relationships, keeping the components; removing a ground releases its placement lock. Applied changes support Undo/Redo. Changing Edit context or deleting a listed relationship prevents a stale dialog from applying changes. These controls keep the current file tab and origin-only file History.</w:t>
       </w:r>
     </w:p>
     <w:p>

</xml_diff>

<commit_message>
Integrate Part Type controls and saved editing display
</commit_message>
<xml_diff>
--- a/ai-instructions/ui/FreeCAD Plus UI & UX.docx
+++ b/ai-instructions/ui/FreeCAD Plus UI & UX.docx
@@ -43013,6 +43013,30 @@
       <w:pPr/>
       <w:r>
         <w:t>All occurrences of the active definition use bold name text and the configured active-item fill color in Models and Part Tree. The chosen occurrence retains a separate selection indicator. Models Edit reuses the last edited occurrence in the current tab, otherwise the first occurrence in Part Tree.</w:t>
+      </w:r>
+    </w:p>
+    <w:p>
+      <w:pPr/>
+      <w:r>
+        <w:t>Part Tree uses Part Type for Full Component, Bodies Only, Reference and Excluded. Visibility is a separate Shown or Hidden choice. Excluded geometry cannot be shown through visibility; change its Part Type first. The active component and its parent branch cannot be hidden. Editing an excluded component restores its own editing display without changing the exclusion saved by its parent.</w:t>
+      </w:r>
+    </w:p>
+    <w:p>
+      <w:pPr/>
+      <w:r>
+        <w:t>Part Type choices are saved on the active component for itself and its direct children, shared by every instance of that component and retained through save/reopen. The active component defaults to Full Component; its children default to Bodies Only. The active component may use Full Component or Bodies Only. Reset to Default restores the applicable default. Edit a deeper component's owner before changing that child's type. Switching the active component restores its saved choices.</w:t>
+      </w:r>
+    </w:p>
+    <w:p>
+      <w:pPr/>
+      <w:r>
+        <w:t>A direct Reference child shows its full component geometry while its owner is edited, respecting nested exclusions. When editing an ancestor, that Reference behaves as Excluded; returning to its owner restores Reference. To reference geometry from an excluded nested child, add that child separately as a direct Reference. Source Reference geometry contributes no final geometry and cannot be used directly for modeling: Add Reference Feature is required to create an owned, derived and linked reference body, sketch or other supported feature. Existing owned reference features remain part of the edited component.</w:t>
+      </w:r>
+    </w:p>
+    <w:p>
+      <w:pPr/>
+      <w:r>
+        <w:t>Existing nested display overrides remain effective until the affected child receives an explicit Part Type. New Part Type choices take precedence without changing another component's saved data. Parent and sibling geometry remains at least 75% transparent while the edited component and its descendants retain authored appearance.</w:t>
       </w:r>
     </w:p>
     <w:p>

</xml_diff>